<commit_message>
fix(layout): polish table widths, keep_with_next pagination, and eliminate 24th orphan page
</commit_message>
<xml_diff>
--- a/docs/report/M7_Thuyet_minh_Cong_trinh_ChuanHoa.docx
+++ b/docs/report/M7_Thuyet_minh_Cong_trinh_ChuanHoa.docx
@@ -4,36 +4,7 @@
   <w:body>
     <w:p>
       <w:pPr>
-        <w:jc w:val="center"/>
-        <w:rPr>
-          <w:rFonts w:ascii="Times New Roman" w:hAnsi="Times New Roman"/>
-          <w:b/>
-        </w:rPr>
-      </w:pPr>
-      <w:r>
-        <w:rPr>
-          <w:rFonts w:ascii="Times New Roman" w:hAnsi="Times New Roman"/>
-          <w:b/>
-        </w:rPr>
-        <w:t xml:space="preserve">                                                                                           </w:t>
-      </w:r>
-      <w:r>
-        <w:rPr>
-          <w:rFonts w:ascii="Times New Roman" w:hAnsi="Times New Roman"/>
-          <w:b/>
-        </w:rPr>
-        <w:t xml:space="preserve">                               </w:t>
-      </w:r>
-      <w:r>
-        <w:rPr>
-          <w:rFonts w:ascii="Times New Roman" w:hAnsi="Times New Roman"/>
-          <w:b/>
-        </w:rPr>
-        <w:t xml:space="preserve"> </w:t>
-      </w:r>
-    </w:p>
-    <w:p>
-      <w:pPr>
+        <w:keepNext/>
         <w:spacing w:before="120" w:after="120" w:line="288" w:lineRule="auto"/>
         <w:ind w:firstLine="0"/>
         <w:jc w:val="center"/>
@@ -64,6 +35,7 @@
     <w:p>
       <w:pPr>
         <w:pStyle w:val="ThngthngWeb"/>
+        <w:keepNext/>
         <w:spacing w:before="120" w:beforeAutospacing="0" w:after="120" w:afterAutospacing="0" w:line="288" w:lineRule="auto"/>
         <w:ind w:firstLine="0"/>
         <w:jc w:val="center"/>
@@ -158,89 +130,7 @@
     </w:p>
     <w:p>
       <w:pPr>
-        <w:jc w:val="center"/>
-        <w:rPr>
-          <w:rFonts w:ascii="Times New Roman" w:hAnsi="Times New Roman"/>
-          <w:b/>
-        </w:rPr>
-      </w:pPr>
-      <w:r>
-        <w:rPr>
-          <w:rFonts w:ascii="Times New Roman" w:hAnsi="Times New Roman"/>
-          <w:b/>
-          <w:noProof/>
-          <w:lang w:val="en-GB" w:eastAsia="en-GB"/>
-        </w:rPr>
-        <mc:AlternateContent>
-          <mc:Choice Requires="wps">
-            <w:drawing>
-              <wp:anchor distT="0" distB="0" distL="114300" distR="114300" simplePos="0" relativeHeight="251659776" behindDoc="0" locked="0" layoutInCell="1" allowOverlap="1" wp14:anchorId="3D62A2F3" wp14:editId="1AA254A4">
-                <wp:simplePos x="0" y="0"/>
-                <wp:positionH relativeFrom="column">
-                  <wp:posOffset>2276475</wp:posOffset>
-                </wp:positionH>
-                <wp:positionV relativeFrom="paragraph">
-                  <wp:posOffset>2870</wp:posOffset>
-                </wp:positionV>
-                <wp:extent cx="1397000" cy="6985"/>
-                <wp:effectExtent l="0" t="0" r="12700" b="31115"/>
-                <wp:wrapNone/>
-                <wp:docPr id="15" name="Straight Connector 15"/>
-                <wp:cNvGraphicFramePr/>
-                <a:graphic xmlns:a="http://schemas.openxmlformats.org/drawingml/2006/main">
-                  <a:graphicData uri="http://schemas.microsoft.com/office/word/2010/wordprocessingShape">
-                    <wps:wsp>
-                      <wps:cNvCnPr/>
-                      <wps:spPr>
-                        <a:xfrm flipV="1">
-                          <a:off x="0" y="0"/>
-                          <a:ext cx="1397000" cy="6985"/>
-                        </a:xfrm>
-                        <a:prstGeom prst="line">
-                          <a:avLst/>
-                        </a:prstGeom>
-                        <a:ln>
-                          <a:solidFill>
-                            <a:schemeClr val="tx1"/>
-                          </a:solidFill>
-                        </a:ln>
-                      </wps:spPr>
-                      <wps:style>
-                        <a:lnRef idx="1">
-                          <a:schemeClr val="accent1"/>
-                        </a:lnRef>
-                        <a:fillRef idx="0">
-                          <a:schemeClr val="accent1"/>
-                        </a:fillRef>
-                        <a:effectRef idx="0">
-                          <a:schemeClr val="accent1"/>
-                        </a:effectRef>
-                        <a:fontRef idx="minor">
-                          <a:schemeClr val="tx1"/>
-                        </a:fontRef>
-                      </wps:style>
-                      <wps:bodyPr/>
-                    </wps:wsp>
-                  </a:graphicData>
-                </a:graphic>
-                <wp14:sizeRelH relativeFrom="margin">
-                  <wp14:pctWidth>0</wp14:pctWidth>
-                </wp14:sizeRelH>
-              </wp:anchor>
-            </w:drawing>
-          </mc:Choice>
-          <mc:Fallback>
-            <w:pict>
-              <v:line id="Straight Connector 15" o:spid="_x0000_s1026" style="position:absolute;flip:y;z-index:251659776;visibility:visible;mso-wrap-style:square;mso-width-percent:0;mso-wrap-distance-left:9pt;mso-wrap-distance-top:0;mso-wrap-distance-right:9pt;mso-wrap-distance-bottom:0;mso-position-horizontal:absolute;mso-position-horizontal-relative:text;mso-position-vertical:absolute;mso-position-vertical-relative:text;mso-width-percent:0;mso-width-relative:margin" from="179.25pt,.25pt" to="289.25pt,.8pt" o:gfxdata="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" strokecolor="black [3213]" strokeweight=".5pt">
-                <v:stroke joinstyle="miter"/>
-              </v:line>
-            </w:pict>
-          </mc:Fallback>
-        </mc:AlternateContent>
-      </w:r>
-    </w:p>
-    <w:p>
-      <w:pPr>
+        <w:keepNext/>
         <w:spacing w:before="120" w:after="60" w:line="288" w:lineRule="auto"/>
         <w:ind w:firstLine="0"/>
         <w:jc w:val="left"/>
@@ -262,6 +152,7 @@
     </w:p>
     <w:p>
       <w:pPr>
+        <w:keepNext/>
         <w:spacing w:before="120" w:after="60" w:line="288" w:lineRule="auto"/>
         <w:ind w:firstLine="0"/>
         <w:jc w:val="left"/>
@@ -298,14 +189,18 @@
       </w:tblPr>
       <w:tblGrid>
         <w:gridCol w:w="567"/>
-        <w:gridCol w:w="1277"/>
-        <w:gridCol w:w="2268"/>
-        <w:gridCol w:w="1417"/>
-        <w:gridCol w:w="1418"/>
-        <w:gridCol w:w="2693"/>
-        <w:gridCol w:w="992"/>
+        <w:gridCol w:w="1984"/>
+        <w:gridCol w:w="2551"/>
+        <w:gridCol w:w="1134"/>
+        <w:gridCol w:w="1134"/>
+        <w:gridCol w:w="1134"/>
+        <w:gridCol w:w="680"/>
       </w:tblGrid>
       <w:tr>
+        <w:trPr>
+          <w:cantSplit/>
+          <w:tblHeader/>
+        </w:trPr>
         <w:tc>
           <w:tcPr>
             <w:tcW w:w="567" w:type="dxa"/>
@@ -345,7 +240,7 @@
         </w:tc>
         <w:tc>
           <w:tcPr>
-            <w:tcW w:w="1277" w:type="dxa"/>
+            <w:tcW w:w="1984" w:type="dxa"/>
             <w:vAlign w:val="center"/>
             <w:tcBorders>
               <w:top w:val="single" w:sz="4" w:space="0" w:color="000000"/>
@@ -382,7 +277,7 @@
         </w:tc>
         <w:tc>
           <w:tcPr>
-            <w:tcW w:w="2268" w:type="dxa"/>
+            <w:tcW w:w="2551" w:type="dxa"/>
             <w:vAlign w:val="center"/>
             <w:tcBorders>
               <w:top w:val="single" w:sz="4" w:space="0" w:color="000000"/>
@@ -442,7 +337,7 @@
         </w:tc>
         <w:tc>
           <w:tcPr>
-            <w:tcW w:w="1417" w:type="dxa"/>
+            <w:tcW w:w="1134" w:type="dxa"/>
             <w:vAlign w:val="center"/>
             <w:tcBorders>
               <w:top w:val="single" w:sz="4" w:space="0" w:color="000000"/>
@@ -481,7 +376,7 @@
         </w:tc>
         <w:tc>
           <w:tcPr>
-            <w:tcW w:w="1418" w:type="dxa"/>
+            <w:tcW w:w="1134" w:type="dxa"/>
             <w:vAlign w:val="center"/>
             <w:tcBorders>
               <w:top w:val="single" w:sz="4" w:space="0" w:color="000000"/>
@@ -570,7 +465,7 @@
         </w:tc>
         <w:tc>
           <w:tcPr>
-            <w:tcW w:w="2693" w:type="dxa"/>
+            <w:tcW w:w="1134" w:type="dxa"/>
             <w:vAlign w:val="center"/>
             <w:tcBorders>
               <w:top w:val="single" w:sz="4" w:space="0" w:color="000000"/>
@@ -607,7 +502,7 @@
         </w:tc>
         <w:tc>
           <w:tcPr>
-            <w:tcW w:w="992" w:type="dxa"/>
+            <w:tcW w:w="680" w:type="dxa"/>
             <w:vAlign w:val="center"/>
             <w:tcBorders>
               <w:top w:val="single" w:sz="4" w:space="0" w:color="000000"/>
@@ -644,6 +539,9 @@
         </w:tc>
       </w:tr>
       <w:tr>
+        <w:trPr>
+          <w:cantSplit/>
+        </w:trPr>
         <w:tc>
           <w:tcPr>
             <w:tcW w:w="567" w:type="dxa"/>
@@ -680,7 +578,7 @@
         </w:tc>
         <w:tc>
           <w:tcPr>
-            <w:tcW w:w="1277" w:type="dxa"/>
+            <w:tcW w:w="1984" w:type="dxa"/>
             <w:vMerge w:val="restart"/>
             <w:vAlign w:val="center"/>
             <w:tcBorders>
@@ -736,7 +634,7 @@
         </w:tc>
         <w:tc>
           <w:tcPr>
-            <w:tcW w:w="2268" w:type="dxa"/>
+            <w:tcW w:w="2551" w:type="dxa"/>
             <w:vAlign w:val="center"/>
             <w:tcBorders>
               <w:top w:val="single" w:sz="4" w:space="0" w:color="000000"/>
@@ -824,7 +722,7 @@
         </w:tc>
         <w:tc>
           <w:tcPr>
-            <w:tcW w:w="1417" w:type="dxa"/>
+            <w:tcW w:w="1134" w:type="dxa"/>
             <w:vAlign w:val="center"/>
             <w:tcBorders>
               <w:top w:val="single" w:sz="4" w:space="0" w:color="000000"/>
@@ -857,7 +755,7 @@
         </w:tc>
         <w:tc>
           <w:tcPr>
-            <w:tcW w:w="1418" w:type="dxa"/>
+            <w:tcW w:w="1134" w:type="dxa"/>
             <w:vAlign w:val="center"/>
             <w:tcBorders>
               <w:top w:val="single" w:sz="4" w:space="0" w:color="000000"/>
@@ -892,7 +790,7 @@
         </w:tc>
         <w:tc>
           <w:tcPr>
-            <w:tcW w:w="2693" w:type="dxa"/>
+            <w:tcW w:w="1134" w:type="dxa"/>
             <w:vAlign w:val="center"/>
             <w:tcBorders>
               <w:top w:val="single" w:sz="4" w:space="0" w:color="000000"/>
@@ -966,7 +864,7 @@
         </w:tc>
         <w:tc>
           <w:tcPr>
-            <w:tcW w:w="992" w:type="dxa"/>
+            <w:tcW w:w="680" w:type="dxa"/>
             <w:vAlign w:val="center"/>
             <w:tcBorders>
               <w:top w:val="single" w:sz="4" w:space="0" w:color="000000"/>
@@ -1001,6 +899,9 @@
         </w:tc>
       </w:tr>
       <w:tr>
+        <w:trPr>
+          <w:cantSplit/>
+        </w:trPr>
         <w:tc>
           <w:tcPr>
             <w:tcW w:w="567" w:type="dxa"/>
@@ -1041,7 +942,7 @@
         </w:tc>
         <w:tc>
           <w:tcPr>
-            <w:tcW w:w="2268" w:type="dxa"/>
+            <w:tcW w:w="2551" w:type="dxa"/>
             <w:vAlign w:val="center"/>
             <w:tcBorders>
               <w:top w:val="single" w:sz="4" w:space="0" w:color="000000"/>
@@ -1131,7 +1032,7 @@
         </w:tc>
         <w:tc>
           <w:tcPr>
-            <w:tcW w:w="1417" w:type="dxa"/>
+            <w:tcW w:w="1134" w:type="dxa"/>
             <w:vAlign w:val="center"/>
             <w:tcBorders>
               <w:top w:val="single" w:sz="4" w:space="0" w:color="000000"/>
@@ -1164,7 +1065,7 @@
         </w:tc>
         <w:tc>
           <w:tcPr>
-            <w:tcW w:w="1418" w:type="dxa"/>
+            <w:tcW w:w="1134" w:type="dxa"/>
             <w:vAlign w:val="center"/>
             <w:tcBorders>
               <w:top w:val="single" w:sz="4" w:space="0" w:color="000000"/>
@@ -1197,7 +1098,7 @@
         </w:tc>
         <w:tc>
           <w:tcPr>
-            <w:tcW w:w="2693" w:type="dxa"/>
+            <w:tcW w:w="1134" w:type="dxa"/>
             <w:vAlign w:val="center"/>
             <w:tcBorders>
               <w:top w:val="single" w:sz="4" w:space="0" w:color="000000"/>
@@ -1222,7 +1123,7 @@
         </w:tc>
         <w:tc>
           <w:tcPr>
-            <w:tcW w:w="992" w:type="dxa"/>
+            <w:tcW w:w="680" w:type="dxa"/>
             <w:vAlign w:val="center"/>
             <w:tcBorders>
               <w:top w:val="single" w:sz="4" w:space="0" w:color="000000"/>
@@ -1259,13 +1160,8 @@
     </w:tbl>
     <w:p>
       <w:pPr>
-        <w:pStyle w:val="Style2"/>
-        <w:divId w:val="1591818185"/>
-      </w:pPr>
-    </w:p>
-    <w:p>
-      <w:pPr>
         <w:pStyle w:val="p1"/>
+        <w:keepNext/>
         <w:spacing w:before="120" w:beforeAutospacing="0" w:after="60" w:afterAutospacing="0" w:line="288" w:lineRule="auto"/>
         <w:ind w:firstLine="0"/>
         <w:jc w:val="left"/>
@@ -1318,6 +1214,7 @@
     <w:p>
       <w:pPr>
         <w:pStyle w:val="Style2"/>
+        <w:keepNext/>
         <w:spacing w:before="120" w:after="60" w:line="288" w:lineRule="auto"/>
         <w:ind w:firstLine="0"/>
         <w:jc w:val="left"/>
@@ -1357,6 +1254,7 @@
     <w:p>
       <w:pPr>
         <w:pStyle w:val="p1"/>
+        <w:keepNext/>
         <w:spacing w:before="120" w:beforeAutospacing="0" w:after="60" w:afterAutospacing="0" w:line="288" w:lineRule="auto"/>
         <w:ind w:firstLine="0"/>
         <w:jc w:val="left"/>
@@ -1460,7 +1358,7 @@
     <w:p>
       <w:pPr>
         <w:pStyle w:val="p1"/>
-        <w:spacing w:before="0" w:after="60" w:line="288" w:lineRule="auto"/>
+        <w:spacing w:before="0" w:after="40" w:line="288" w:lineRule="auto"/>
         <w:ind w:firstLine="720"/>
         <w:jc w:val="both"/>
         <w:rPr>
@@ -1531,7 +1429,7 @@
     <w:p>
       <w:pPr>
         <w:pStyle w:val="p1"/>
-        <w:spacing w:before="0" w:after="60" w:line="288" w:lineRule="auto"/>
+        <w:spacing w:before="0" w:after="40" w:line="288" w:lineRule="auto"/>
         <w:ind w:firstLine="720"/>
         <w:jc w:val="both"/>
         <w:rPr>
@@ -1615,7 +1513,7 @@
     </w:p>
     <w:p>
       <w:pPr>
-        <w:spacing w:before="0" w:beforeAutospacing="1" w:after="60" w:afterAutospacing="1" w:line="288" w:lineRule="auto"/>
+        <w:spacing w:before="0" w:beforeAutospacing="1" w:after="40" w:afterAutospacing="1" w:line="288" w:lineRule="auto"/>
         <w:ind w:firstLine="720"/>
         <w:jc w:val="both"/>
         <w:rPr>
@@ -1660,7 +1558,7 @@
     <w:p>
       <w:pPr>
         <w:pStyle w:val="p1"/>
-        <w:spacing w:before="0" w:after="60" w:line="288" w:lineRule="auto"/>
+        <w:spacing w:before="0" w:after="40" w:line="288" w:lineRule="auto"/>
         <w:ind w:firstLine="720"/>
         <w:jc w:val="both"/>
         <w:rPr>
@@ -1715,7 +1613,7 @@
     </w:p>
     <w:p>
       <w:pPr>
-        <w:spacing w:before="0" w:beforeAutospacing="1" w:after="60" w:afterAutospacing="1" w:line="288" w:lineRule="auto"/>
+        <w:spacing w:before="0" w:beforeAutospacing="1" w:after="40" w:afterAutospacing="1" w:line="288" w:lineRule="auto"/>
         <w:ind w:firstLine="720"/>
         <w:jc w:val="both"/>
         <w:rPr>
@@ -1800,7 +1698,7 @@
     </w:p>
     <w:p>
       <w:pPr>
-        <w:spacing w:before="0" w:beforeAutospacing="1" w:after="60" w:afterAutospacing="1" w:line="288" w:lineRule="auto"/>
+        <w:spacing w:before="0" w:beforeAutospacing="1" w:after="40" w:afterAutospacing="1" w:line="288" w:lineRule="auto"/>
         <w:ind w:firstLine="720"/>
         <w:jc w:val="both"/>
         <w:rPr>
@@ -1886,7 +1784,7 @@
     </w:p>
     <w:p>
       <w:pPr>
-        <w:spacing w:before="0" w:beforeAutospacing="1" w:after="60" w:afterAutospacing="1" w:line="288" w:lineRule="auto"/>
+        <w:spacing w:before="0" w:beforeAutospacing="1" w:after="40" w:afterAutospacing="1" w:line="288" w:lineRule="auto"/>
         <w:ind w:firstLine="720"/>
         <w:jc w:val="both"/>
         <w:rPr>
@@ -1909,7 +1807,7 @@
     </w:p>
     <w:p>
       <w:pPr>
-        <w:spacing w:before="0" w:beforeAutospacing="1" w:after="60" w:afterAutospacing="1" w:line="288" w:lineRule="auto"/>
+        <w:spacing w:before="0" w:beforeAutospacing="1" w:after="40" w:afterAutospacing="1" w:line="288" w:lineRule="auto"/>
         <w:ind w:firstLine="720"/>
         <w:jc w:val="both"/>
         <w:rPr>
@@ -1958,7 +1856,7 @@
     </w:p>
     <w:p>
       <w:pPr>
-        <w:spacing w:before="0" w:beforeAutospacing="1" w:after="60" w:afterAutospacing="1" w:line="288" w:lineRule="auto"/>
+        <w:spacing w:before="0" w:beforeAutospacing="1" w:after="40" w:afterAutospacing="1" w:line="288" w:lineRule="auto"/>
         <w:ind w:firstLine="720"/>
         <w:jc w:val="both"/>
         <w:rPr>
@@ -1996,7 +1894,7 @@
     </w:p>
     <w:p>
       <w:pPr>
-        <w:spacing w:before="0" w:beforeAutospacing="1" w:after="60" w:afterAutospacing="1" w:line="288" w:lineRule="auto"/>
+        <w:spacing w:before="0" w:beforeAutospacing="1" w:after="40" w:afterAutospacing="1" w:line="288" w:lineRule="auto"/>
         <w:ind w:firstLine="720"/>
         <w:jc w:val="both"/>
         <w:rPr>
@@ -2034,7 +1932,7 @@
     </w:p>
     <w:p>
       <w:pPr>
-        <w:spacing w:before="0" w:beforeAutospacing="1" w:after="60" w:afterAutospacing="1" w:line="288" w:lineRule="auto"/>
+        <w:spacing w:before="0" w:beforeAutospacing="1" w:after="40" w:afterAutospacing="1" w:line="288" w:lineRule="auto"/>
         <w:ind w:firstLine="720"/>
         <w:jc w:val="both"/>
         <w:rPr>
@@ -2072,7 +1970,7 @@
     </w:p>
     <w:p>
       <w:pPr>
-        <w:spacing w:before="0" w:beforeAutospacing="1" w:after="60" w:afterAutospacing="1" w:line="288" w:lineRule="auto"/>
+        <w:spacing w:before="0" w:beforeAutospacing="1" w:after="40" w:afterAutospacing="1" w:line="288" w:lineRule="auto"/>
         <w:ind w:firstLine="720"/>
         <w:jc w:val="both"/>
         <w:rPr>
@@ -2110,7 +2008,7 @@
     </w:p>
     <w:p>
       <w:pPr>
-        <w:spacing w:before="0" w:beforeAutospacing="1" w:after="60" w:afterAutospacing="1" w:line="288" w:lineRule="auto"/>
+        <w:spacing w:before="0" w:beforeAutospacing="1" w:after="40" w:afterAutospacing="1" w:line="288" w:lineRule="auto"/>
         <w:ind w:firstLine="720"/>
         <w:jc w:val="both"/>
         <w:rPr>
@@ -2148,7 +2046,7 @@
     </w:p>
     <w:p>
       <w:pPr>
-        <w:spacing w:before="0" w:beforeAutospacing="1" w:after="60" w:afterAutospacing="1" w:line="288" w:lineRule="auto"/>
+        <w:spacing w:before="0" w:beforeAutospacing="1" w:after="40" w:afterAutospacing="1" w:line="288" w:lineRule="auto"/>
         <w:ind w:firstLine="720"/>
         <w:jc w:val="both"/>
         <w:rPr>
@@ -2186,6 +2084,7 @@
     </w:p>
     <w:p>
       <w:pPr>
+        <w:keepNext/>
         <w:spacing w:before="120" w:beforeAutospacing="1" w:after="60" w:afterAutospacing="1" w:line="288" w:lineRule="auto"/>
         <w:ind w:firstLine="0"/>
         <w:jc w:val="left"/>
@@ -2212,7 +2111,7 @@
     </w:p>
     <w:p>
       <w:pPr>
-        <w:spacing w:before="0" w:beforeAutospacing="1" w:after="60" w:afterAutospacing="1" w:line="288" w:lineRule="auto"/>
+        <w:spacing w:before="0" w:beforeAutospacing="1" w:after="40" w:afterAutospacing="1" w:line="288" w:lineRule="auto"/>
         <w:ind w:firstLine="720"/>
         <w:jc w:val="both"/>
         <w:rPr>
@@ -2238,7 +2137,7 @@
     </w:p>
     <w:p>
       <w:pPr>
-        <w:spacing w:before="0" w:beforeAutospacing="1" w:after="60" w:afterAutospacing="1" w:line="288" w:lineRule="auto"/>
+        <w:spacing w:before="0" w:beforeAutospacing="1" w:after="40" w:afterAutospacing="1" w:line="288" w:lineRule="auto"/>
         <w:ind w:firstLine="720"/>
         <w:jc w:val="both"/>
         <w:rPr>
@@ -2264,7 +2163,7 @@
     </w:p>
     <w:p>
       <w:pPr>
-        <w:spacing w:before="0" w:beforeAutospacing="1" w:after="60" w:afterAutospacing="1" w:line="288" w:lineRule="auto"/>
+        <w:spacing w:before="0" w:beforeAutospacing="1" w:after="40" w:afterAutospacing="1" w:line="288" w:lineRule="auto"/>
         <w:ind w:firstLine="720"/>
         <w:jc w:val="both"/>
         <w:rPr>
@@ -2290,6 +2189,7 @@
     </w:p>
     <w:p>
       <w:pPr>
+        <w:keepNext/>
         <w:spacing w:before="120" w:beforeAutospacing="1" w:after="60" w:afterAutospacing="1" w:line="288" w:lineRule="auto"/>
         <w:ind w:firstLine="0"/>
         <w:jc w:val="left"/>
@@ -2316,7 +2216,8 @@
     </w:p>
     <w:p>
       <w:pPr>
-        <w:spacing w:before="120" w:beforeAutospacing="1" w:after="40" w:afterAutospacing="1"/>
+        <w:keepNext/>
+        <w:spacing w:before="80" w:beforeAutospacing="1" w:after="40" w:afterAutospacing="1"/>
         <w:ind w:firstLine="0"/>
         <w:jc w:val="center"/>
         <w:rPr>
@@ -2331,7 +2232,7 @@
       <w:r>
         <w:drawing>
           <wp:inline xmlns:a="http://schemas.openxmlformats.org/drawingml/2006/main" xmlns:pic="http://schemas.openxmlformats.org/drawingml/2006/picture">
-            <wp:extent cx="3420000" cy="4560000"/>
+            <wp:extent cx="3240000" cy="4320000"/>
             <wp:docPr id="16" name="Picture 16"/>
             <wp:cNvGraphicFramePr>
               <a:graphicFrameLocks noChangeAspect="1"/>
@@ -2352,7 +2253,7 @@
                   <pic:spPr>
                     <a:xfrm>
                       <a:off x="0" y="0"/>
-                      <a:ext cx="3420000" cy="4560000"/>
+                      <a:ext cx="3240000" cy="4320000"/>
                     </a:xfrm>
                     <a:prstGeom prst="rect"/>
                   </pic:spPr>
@@ -2365,6 +2266,7 @@
     </w:p>
     <w:p>
       <w:pPr>
+        <w:keepNext/>
         <w:spacing w:before="40" w:after="120" w:line="276" w:lineRule="auto"/>
         <w:ind w:firstLine="0"/>
         <w:jc w:val="center"/>
@@ -2381,19 +2283,7 @@
     </w:p>
     <w:p>
       <w:pPr>
-        <w:spacing w:before="100" w:beforeAutospacing="1" w:after="100" w:afterAutospacing="1"/>
-        <w:rPr>
-          <w:rFonts w:asciiTheme="majorHAnsi" w:eastAsiaTheme="minorEastAsia" w:hAnsiTheme="majorHAnsi" w:cstheme="majorHAnsi"/>
-          <w:bCs w:val="0"/>
-          <w:sz w:val="26"/>
-          <w:szCs w:val="26"/>
-          <w:lang w:val="vi-VN" w:eastAsia="vi-VN"/>
-        </w:rPr>
-      </w:pPr>
-    </w:p>
-    <w:p>
-      <w:pPr>
-        <w:spacing w:before="0" w:beforeAutospacing="1" w:after="60" w:afterAutospacing="1" w:line="288" w:lineRule="auto"/>
+        <w:spacing w:before="0" w:beforeAutospacing="1" w:after="40" w:afterAutospacing="1" w:line="288" w:lineRule="auto"/>
         <w:ind w:firstLine="720"/>
         <w:jc w:val="both"/>
         <w:rPr>
@@ -2431,7 +2321,7 @@
     </w:p>
     <w:p>
       <w:pPr>
-        <w:spacing w:before="0" w:beforeAutospacing="1" w:after="60" w:afterAutospacing="1" w:line="288" w:lineRule="auto"/>
+        <w:spacing w:before="0" w:beforeAutospacing="1" w:after="40" w:afterAutospacing="1" w:line="288" w:lineRule="auto"/>
         <w:ind w:firstLine="720"/>
         <w:jc w:val="both"/>
         <w:rPr>
@@ -2484,6 +2374,7 @@
     </w:p>
     <w:p>
       <w:pPr>
+        <w:keepNext/>
         <w:spacing w:before="120" w:beforeAutospacing="1" w:after="60" w:afterAutospacing="1" w:line="288" w:lineRule="auto"/>
         <w:ind w:firstLine="0"/>
         <w:jc w:val="left"/>
@@ -2510,7 +2401,8 @@
     </w:p>
     <w:p>
       <w:pPr>
-        <w:spacing w:before="120" w:beforeAutospacing="1" w:after="40" w:afterAutospacing="1"/>
+        <w:keepNext/>
+        <w:spacing w:before="80" w:beforeAutospacing="1" w:after="40" w:afterAutospacing="1"/>
         <w:ind w:firstLine="0"/>
         <w:jc w:val="center"/>
         <w:rPr>
@@ -2525,7 +2417,7 @@
       <w:r>
         <w:drawing>
           <wp:inline xmlns:a="http://schemas.openxmlformats.org/drawingml/2006/main" xmlns:pic="http://schemas.openxmlformats.org/drawingml/2006/picture">
-            <wp:extent cx="2880000" cy="2880000"/>
+            <wp:extent cx="2448000" cy="2448000"/>
             <wp:docPr id="17" name="Picture 17"/>
             <wp:cNvGraphicFramePr>
               <a:graphicFrameLocks noChangeAspect="1"/>
@@ -2546,7 +2438,7 @@
                   <pic:spPr>
                     <a:xfrm>
                       <a:off x="0" y="0"/>
-                      <a:ext cx="2880000" cy="2880000"/>
+                      <a:ext cx="2448000" cy="2448000"/>
                     </a:xfrm>
                     <a:prstGeom prst="rect"/>
                   </pic:spPr>
@@ -2559,6 +2451,7 @@
     </w:p>
     <w:p>
       <w:pPr>
+        <w:keepNext/>
         <w:spacing w:before="40" w:after="120" w:line="276" w:lineRule="auto"/>
         <w:ind w:firstLine="0"/>
         <w:jc w:val="center"/>
@@ -2575,19 +2468,7 @@
     </w:p>
     <w:p>
       <w:pPr>
-        <w:spacing w:before="100" w:beforeAutospacing="1" w:after="100" w:afterAutospacing="1"/>
-        <w:rPr>
-          <w:rFonts w:asciiTheme="majorHAnsi" w:eastAsiaTheme="minorEastAsia" w:hAnsiTheme="majorHAnsi" w:cstheme="majorHAnsi"/>
-          <w:bCs w:val="0"/>
-          <w:sz w:val="26"/>
-          <w:szCs w:val="26"/>
-          <w:lang w:val="vi-VN" w:eastAsia="vi-VN"/>
-        </w:rPr>
-      </w:pPr>
-    </w:p>
-    <w:p>
-      <w:pPr>
-        <w:spacing w:before="0" w:beforeAutospacing="1" w:after="60" w:afterAutospacing="1" w:line="288" w:lineRule="auto"/>
+        <w:spacing w:before="0" w:beforeAutospacing="1" w:after="40" w:afterAutospacing="1" w:line="288" w:lineRule="auto"/>
         <w:ind w:firstLine="720"/>
         <w:jc w:val="both"/>
         <w:rPr>
@@ -2626,7 +2507,7 @@
     </w:p>
     <w:p>
       <w:pPr>
-        <w:spacing w:before="0" w:beforeAutospacing="1" w:after="60" w:afterAutospacing="1" w:line="288" w:lineRule="auto"/>
+        <w:spacing w:before="0" w:beforeAutospacing="1" w:after="40" w:afterAutospacing="1" w:line="288" w:lineRule="auto"/>
         <w:ind w:firstLine="720"/>
         <w:jc w:val="both"/>
         <w:rPr>
@@ -2652,6 +2533,7 @@
     </w:p>
     <w:p>
       <w:pPr>
+        <w:keepNext/>
         <w:spacing w:before="120" w:beforeAutospacing="1" w:after="60" w:afterAutospacing="1" w:line="288" w:lineRule="auto"/>
         <w:ind w:firstLine="0"/>
         <w:jc w:val="left"/>
@@ -2678,7 +2560,8 @@
     </w:p>
     <w:p>
       <w:pPr>
-        <w:spacing w:before="120" w:beforeAutospacing="1" w:after="40" w:afterAutospacing="1"/>
+        <w:keepNext/>
+        <w:spacing w:before="80" w:beforeAutospacing="1" w:after="40" w:afterAutospacing="1"/>
         <w:ind w:firstLine="0"/>
         <w:jc w:val="center"/>
         <w:rPr>
@@ -2693,7 +2576,7 @@
       <w:r>
         <w:drawing>
           <wp:inline xmlns:a="http://schemas.openxmlformats.org/drawingml/2006/main" xmlns:pic="http://schemas.openxmlformats.org/drawingml/2006/picture">
-            <wp:extent cx="2700000" cy="2700000"/>
+            <wp:extent cx="2340000" cy="2340000"/>
             <wp:docPr id="18" name="Picture 18"/>
             <wp:cNvGraphicFramePr>
               <a:graphicFrameLocks noChangeAspect="1"/>
@@ -2714,7 +2597,7 @@
                   <pic:spPr>
                     <a:xfrm>
                       <a:off x="0" y="0"/>
-                      <a:ext cx="2700000" cy="2700000"/>
+                      <a:ext cx="2340000" cy="2340000"/>
                     </a:xfrm>
                     <a:prstGeom prst="rect"/>
                   </pic:spPr>
@@ -2727,6 +2610,7 @@
     </w:p>
     <w:p>
       <w:pPr>
+        <w:keepNext/>
         <w:spacing w:before="40" w:after="120" w:line="276" w:lineRule="auto"/>
         <w:ind w:firstLine="0"/>
         <w:jc w:val="center"/>
@@ -2743,7 +2627,8 @@
     </w:p>
     <w:p>
       <w:pPr>
-        <w:spacing w:before="120" w:after="40"/>
+        <w:keepNext/>
+        <w:spacing w:before="80" w:after="40"/>
         <w:ind w:firstLine="0"/>
         <w:jc w:val="center"/>
       </w:pPr>
@@ -2751,7 +2636,7 @@
       <w:r>
         <w:drawing>
           <wp:inline xmlns:a="http://schemas.openxmlformats.org/drawingml/2006/main" xmlns:pic="http://schemas.openxmlformats.org/drawingml/2006/picture">
-            <wp:extent cx="3420000" cy="4560000"/>
+            <wp:extent cx="2951999" cy="3935999"/>
             <wp:docPr id="19" name="Picture 19"/>
             <wp:cNvGraphicFramePr>
               <a:graphicFrameLocks noChangeAspect="1"/>
@@ -2772,7 +2657,7 @@
                   <pic:spPr>
                     <a:xfrm>
                       <a:off x="0" y="0"/>
-                      <a:ext cx="3420000" cy="4560000"/>
+                      <a:ext cx="2951999" cy="3935999"/>
                     </a:xfrm>
                     <a:prstGeom prst="rect"/>
                   </pic:spPr>
@@ -2785,6 +2670,7 @@
     </w:p>
     <w:p>
       <w:pPr>
+        <w:keepNext/>
         <w:spacing w:before="40" w:after="120" w:line="276" w:lineRule="auto"/>
         <w:ind w:firstLine="0"/>
         <w:jc w:val="center"/>
@@ -2801,19 +2687,7 @@
     </w:p>
     <w:p>
       <w:pPr>
-        <w:spacing w:before="100" w:beforeAutospacing="1" w:after="100" w:afterAutospacing="1"/>
-        <w:rPr>
-          <w:rFonts w:asciiTheme="majorHAnsi" w:eastAsiaTheme="minorEastAsia" w:hAnsiTheme="majorHAnsi" w:cstheme="majorHAnsi"/>
-          <w:bCs w:val="0"/>
-          <w:sz w:val="26"/>
-          <w:szCs w:val="26"/>
-          <w:lang w:val="vi-VN" w:eastAsia="vi-VN"/>
-        </w:rPr>
-      </w:pPr>
-    </w:p>
-    <w:p>
-      <w:pPr>
-        <w:spacing w:before="0" w:beforeAutospacing="1" w:after="60" w:afterAutospacing="1" w:line="288" w:lineRule="auto"/>
+        <w:spacing w:before="0" w:beforeAutospacing="1" w:after="40" w:afterAutospacing="1" w:line="288" w:lineRule="auto"/>
         <w:ind w:firstLine="720"/>
         <w:jc w:val="both"/>
         <w:rPr>
@@ -2839,7 +2713,7 @@
     </w:p>
     <w:p>
       <w:pPr>
-        <w:spacing w:before="0" w:beforeAutospacing="1" w:after="60" w:afterAutospacing="1" w:line="288" w:lineRule="auto"/>
+        <w:spacing w:before="0" w:beforeAutospacing="1" w:after="40" w:afterAutospacing="1" w:line="288" w:lineRule="auto"/>
         <w:ind w:firstLine="720"/>
         <w:jc w:val="both"/>
         <w:rPr>
@@ -2865,7 +2739,7 @@
     </w:p>
     <w:p>
       <w:pPr>
-        <w:spacing w:before="0" w:beforeAutospacing="1" w:after="60" w:afterAutospacing="1" w:line="288" w:lineRule="auto"/>
+        <w:spacing w:before="0" w:beforeAutospacing="1" w:after="40" w:afterAutospacing="1" w:line="288" w:lineRule="auto"/>
         <w:ind w:firstLine="720"/>
         <w:jc w:val="both"/>
         <w:rPr>
@@ -2891,6 +2765,7 @@
     </w:p>
     <w:p>
       <w:pPr>
+        <w:keepNext/>
         <w:spacing w:before="120" w:beforeAutospacing="1" w:after="60" w:afterAutospacing="1" w:line="288" w:lineRule="auto"/>
         <w:ind w:firstLine="0"/>
         <w:jc w:val="left"/>
@@ -2917,7 +2792,8 @@
     </w:p>
     <w:p>
       <w:pPr>
-        <w:spacing w:before="120" w:beforeAutospacing="1" w:after="40" w:afterAutospacing="1"/>
+        <w:keepNext/>
+        <w:spacing w:before="80" w:beforeAutospacing="1" w:after="40" w:afterAutospacing="1"/>
         <w:ind w:firstLine="0"/>
         <w:jc w:val="center"/>
         <w:rPr>
@@ -2932,7 +2808,7 @@
       <w:r>
         <w:drawing>
           <wp:inline xmlns:a="http://schemas.openxmlformats.org/drawingml/2006/main" xmlns:pic="http://schemas.openxmlformats.org/drawingml/2006/picture">
-            <wp:extent cx="3420000" cy="4560000"/>
+            <wp:extent cx="3168000" cy="4224000"/>
             <wp:docPr id="20" name="Picture 20"/>
             <wp:cNvGraphicFramePr>
               <a:graphicFrameLocks noChangeAspect="1"/>
@@ -2953,7 +2829,7 @@
                   <pic:spPr>
                     <a:xfrm>
                       <a:off x="0" y="0"/>
-                      <a:ext cx="3420000" cy="4560000"/>
+                      <a:ext cx="3168000" cy="4224000"/>
                     </a:xfrm>
                     <a:prstGeom prst="rect"/>
                   </pic:spPr>
@@ -2966,6 +2842,7 @@
     </w:p>
     <w:p>
       <w:pPr>
+        <w:keepNext/>
         <w:spacing w:before="40" w:after="120" w:line="276" w:lineRule="auto"/>
         <w:ind w:firstLine="0"/>
         <w:jc w:val="center"/>
@@ -2982,7 +2859,7 @@
     </w:p>
     <w:p>
       <w:pPr>
-        <w:spacing w:before="0" w:beforeAutospacing="1" w:after="60" w:afterAutospacing="1" w:line="288" w:lineRule="auto"/>
+        <w:spacing w:before="0" w:beforeAutospacing="1" w:after="40" w:afterAutospacing="1" w:line="288" w:lineRule="auto"/>
         <w:ind w:firstLine="720"/>
         <w:jc w:val="both"/>
         <w:rPr>
@@ -3008,7 +2885,7 @@
     </w:p>
     <w:p>
       <w:pPr>
-        <w:spacing w:before="0" w:beforeAutospacing="1" w:after="60" w:afterAutospacing="1" w:line="288" w:lineRule="auto"/>
+        <w:spacing w:before="0" w:beforeAutospacing="1" w:after="40" w:afterAutospacing="1" w:line="288" w:lineRule="auto"/>
         <w:ind w:firstLine="720"/>
         <w:jc w:val="both"/>
         <w:rPr>
@@ -3034,7 +2911,7 @@
     </w:p>
     <w:p>
       <w:pPr>
-        <w:spacing w:before="0" w:beforeAutospacing="1" w:after="60" w:afterAutospacing="1" w:line="288" w:lineRule="auto"/>
+        <w:spacing w:before="0" w:beforeAutospacing="1" w:after="40" w:afterAutospacing="1" w:line="288" w:lineRule="auto"/>
         <w:ind w:firstLine="720"/>
         <w:jc w:val="both"/>
         <w:rPr>
@@ -3060,6 +2937,7 @@
     </w:p>
     <w:p>
       <w:pPr>
+        <w:keepNext/>
         <w:spacing w:before="120" w:beforeAutospacing="1" w:after="60" w:afterAutospacing="1" w:line="288" w:lineRule="auto"/>
         <w:ind w:firstLine="0"/>
         <w:jc w:val="left"/>
@@ -3086,7 +2964,8 @@
     </w:p>
     <w:p>
       <w:pPr>
-        <w:spacing w:before="120" w:beforeAutospacing="1" w:after="40" w:afterAutospacing="1"/>
+        <w:keepNext/>
+        <w:spacing w:before="80" w:beforeAutospacing="1" w:after="40" w:afterAutospacing="1"/>
         <w:ind w:firstLine="0"/>
         <w:jc w:val="center"/>
         <w:rPr>
@@ -3101,7 +2980,7 @@
       <w:r>
         <w:drawing>
           <wp:inline xmlns:a="http://schemas.openxmlformats.org/drawingml/2006/main" xmlns:pic="http://schemas.openxmlformats.org/drawingml/2006/picture">
-            <wp:extent cx="3420000" cy="4560000"/>
+            <wp:extent cx="3168000" cy="4224000"/>
             <wp:docPr id="21" name="Picture 21"/>
             <wp:cNvGraphicFramePr>
               <a:graphicFrameLocks noChangeAspect="1"/>
@@ -3122,7 +3001,7 @@
                   <pic:spPr>
                     <a:xfrm>
                       <a:off x="0" y="0"/>
-                      <a:ext cx="3420000" cy="4560000"/>
+                      <a:ext cx="3168000" cy="4224000"/>
                     </a:xfrm>
                     <a:prstGeom prst="rect"/>
                   </pic:spPr>
@@ -3135,6 +3014,7 @@
     </w:p>
     <w:p>
       <w:pPr>
+        <w:keepNext/>
         <w:spacing w:before="40" w:after="120" w:line="276" w:lineRule="auto"/>
         <w:ind w:firstLine="0"/>
         <w:jc w:val="center"/>
@@ -3151,7 +3031,7 @@
     </w:p>
     <w:p>
       <w:pPr>
-        <w:spacing w:before="0" w:beforeAutospacing="1" w:after="60" w:afterAutospacing="1" w:line="288" w:lineRule="auto"/>
+        <w:spacing w:before="0" w:beforeAutospacing="1" w:after="40" w:afterAutospacing="1" w:line="288" w:lineRule="auto"/>
         <w:ind w:firstLine="720"/>
         <w:jc w:val="both"/>
         <w:rPr>
@@ -3177,7 +3057,7 @@
     </w:p>
     <w:p>
       <w:pPr>
-        <w:spacing w:before="0" w:beforeAutospacing="1" w:after="60" w:afterAutospacing="1" w:line="288" w:lineRule="auto"/>
+        <w:spacing w:before="0" w:beforeAutospacing="1" w:after="40" w:afterAutospacing="1" w:line="288" w:lineRule="auto"/>
         <w:ind w:firstLine="720"/>
         <w:jc w:val="both"/>
         <w:rPr>
@@ -3204,6 +3084,7 @@
     </w:p>
     <w:p>
       <w:pPr>
+        <w:keepNext/>
         <w:spacing w:before="120" w:beforeAutospacing="1" w:after="60" w:afterAutospacing="1" w:line="288" w:lineRule="auto"/>
         <w:ind w:firstLine="0"/>
         <w:jc w:val="left"/>
@@ -3230,7 +3111,8 @@
     </w:p>
     <w:p>
       <w:pPr>
-        <w:spacing w:before="120" w:beforeAutospacing="1" w:after="40" w:afterAutospacing="1"/>
+        <w:keepNext/>
+        <w:spacing w:before="80" w:beforeAutospacing="1" w:after="40" w:afterAutospacing="1"/>
         <w:ind w:firstLine="0"/>
         <w:jc w:val="center"/>
         <w:rPr>
@@ -3245,7 +3127,7 @@
       <w:r>
         <w:drawing>
           <wp:inline xmlns:a="http://schemas.openxmlformats.org/drawingml/2006/main" xmlns:pic="http://schemas.openxmlformats.org/drawingml/2006/picture">
-            <wp:extent cx="3420000" cy="4560000"/>
+            <wp:extent cx="3060000" cy="4080000"/>
             <wp:docPr id="22" name="Picture 22"/>
             <wp:cNvGraphicFramePr>
               <a:graphicFrameLocks noChangeAspect="1"/>
@@ -3266,7 +3148,7 @@
                   <pic:spPr>
                     <a:xfrm>
                       <a:off x="0" y="0"/>
-                      <a:ext cx="3420000" cy="4560000"/>
+                      <a:ext cx="3060000" cy="4080000"/>
                     </a:xfrm>
                     <a:prstGeom prst="rect"/>
                   </pic:spPr>
@@ -3279,6 +3161,7 @@
     </w:p>
     <w:p>
       <w:pPr>
+        <w:keepNext/>
         <w:spacing w:before="40" w:after="120" w:line="276" w:lineRule="auto"/>
         <w:ind w:firstLine="0"/>
         <w:jc w:val="center"/>
@@ -3295,7 +3178,7 @@
     </w:p>
     <w:p>
       <w:pPr>
-        <w:spacing w:before="0" w:beforeAutospacing="1" w:after="60" w:afterAutospacing="1" w:line="288" w:lineRule="auto"/>
+        <w:spacing w:before="0" w:beforeAutospacing="1" w:after="40" w:afterAutospacing="1" w:line="288" w:lineRule="auto"/>
         <w:ind w:firstLine="720"/>
         <w:jc w:val="both"/>
         <w:rPr>
@@ -3321,7 +3204,7 @@
     </w:p>
     <w:p>
       <w:pPr>
-        <w:spacing w:before="0" w:beforeAutospacing="1" w:after="60" w:afterAutospacing="1" w:line="288" w:lineRule="auto"/>
+        <w:spacing w:before="0" w:beforeAutospacing="1" w:after="40" w:afterAutospacing="1" w:line="288" w:lineRule="auto"/>
         <w:ind w:firstLine="720"/>
         <w:jc w:val="both"/>
         <w:rPr>
@@ -3347,7 +3230,7 @@
     </w:p>
     <w:p>
       <w:pPr>
-        <w:spacing w:before="0" w:beforeAutospacing="1" w:after="60" w:afterAutospacing="1" w:line="288" w:lineRule="auto"/>
+        <w:spacing w:before="0" w:beforeAutospacing="1" w:after="40" w:afterAutospacing="1" w:line="288" w:lineRule="auto"/>
         <w:ind w:firstLine="720"/>
         <w:jc w:val="both"/>
         <w:rPr>
@@ -3385,6 +3268,7 @@
     </w:p>
     <w:p>
       <w:pPr>
+        <w:keepNext/>
         <w:spacing w:before="120" w:beforeAutospacing="1" w:after="60" w:afterAutospacing="1" w:line="288" w:lineRule="auto"/>
         <w:ind w:firstLine="0"/>
         <w:jc w:val="left"/>
@@ -3412,7 +3296,8 @@
     </w:p>
     <w:p>
       <w:pPr>
-        <w:spacing w:before="120" w:beforeAutospacing="1" w:after="40" w:afterAutospacing="1"/>
+        <w:keepNext/>
+        <w:spacing w:before="80" w:beforeAutospacing="1" w:after="40" w:afterAutospacing="1"/>
         <w:ind w:firstLine="0"/>
         <w:jc w:val="center"/>
         <w:outlineLvl w:val="2"/>
@@ -3428,7 +3313,7 @@
       <w:r>
         <w:drawing>
           <wp:inline xmlns:a="http://schemas.openxmlformats.org/drawingml/2006/main" xmlns:pic="http://schemas.openxmlformats.org/drawingml/2006/picture">
-            <wp:extent cx="3420000" cy="4560000"/>
+            <wp:extent cx="2736000" cy="3648000"/>
             <wp:docPr id="23" name="Picture 23"/>
             <wp:cNvGraphicFramePr>
               <a:graphicFrameLocks noChangeAspect="1"/>
@@ -3449,7 +3334,7 @@
                   <pic:spPr>
                     <a:xfrm>
                       <a:off x="0" y="0"/>
-                      <a:ext cx="3420000" cy="4560000"/>
+                      <a:ext cx="2736000" cy="3648000"/>
                     </a:xfrm>
                     <a:prstGeom prst="rect"/>
                   </pic:spPr>
@@ -3462,6 +3347,7 @@
     </w:p>
     <w:p>
       <w:pPr>
+        <w:keepNext/>
         <w:spacing w:before="40" w:after="120" w:line="276" w:lineRule="auto"/>
         <w:ind w:firstLine="0"/>
         <w:jc w:val="center"/>
@@ -3478,7 +3364,8 @@
     </w:p>
     <w:p>
       <w:pPr>
-        <w:spacing w:before="120" w:after="40"/>
+        <w:keepNext/>
+        <w:spacing w:before="80" w:after="40"/>
         <w:ind w:firstLine="0"/>
         <w:jc w:val="center"/>
       </w:pPr>
@@ -3486,7 +3373,7 @@
       <w:r>
         <w:drawing>
           <wp:inline xmlns:a="http://schemas.openxmlformats.org/drawingml/2006/main" xmlns:pic="http://schemas.openxmlformats.org/drawingml/2006/picture">
-            <wp:extent cx="3420000" cy="4560000"/>
+            <wp:extent cx="2736000" cy="3648000"/>
             <wp:docPr id="24" name="Picture 24"/>
             <wp:cNvGraphicFramePr>
               <a:graphicFrameLocks noChangeAspect="1"/>
@@ -3507,7 +3394,7 @@
                   <pic:spPr>
                     <a:xfrm>
                       <a:off x="0" y="0"/>
-                      <a:ext cx="3420000" cy="4560000"/>
+                      <a:ext cx="2736000" cy="3648000"/>
                     </a:xfrm>
                     <a:prstGeom prst="rect"/>
                   </pic:spPr>
@@ -3520,6 +3407,7 @@
     </w:p>
     <w:p>
       <w:pPr>
+        <w:keepNext/>
         <w:spacing w:before="40" w:after="120" w:line="276" w:lineRule="auto"/>
         <w:ind w:firstLine="0"/>
         <w:jc w:val="center"/>
@@ -3536,7 +3424,8 @@
     </w:p>
     <w:p>
       <w:pPr>
-        <w:spacing w:before="120" w:after="40"/>
+        <w:keepNext/>
+        <w:spacing w:before="80" w:after="40"/>
         <w:ind w:firstLine="0"/>
         <w:jc w:val="center"/>
       </w:pPr>
@@ -3544,7 +3433,7 @@
       <w:r>
         <w:drawing>
           <wp:inline xmlns:a="http://schemas.openxmlformats.org/drawingml/2006/main" xmlns:pic="http://schemas.openxmlformats.org/drawingml/2006/picture">
-            <wp:extent cx="4320000" cy="3240000"/>
+            <wp:extent cx="4140000" cy="3105000"/>
             <wp:docPr id="25" name="Picture 25"/>
             <wp:cNvGraphicFramePr>
               <a:graphicFrameLocks noChangeAspect="1"/>
@@ -3565,7 +3454,7 @@
                   <pic:spPr>
                     <a:xfrm>
                       <a:off x="0" y="0"/>
-                      <a:ext cx="4320000" cy="3240000"/>
+                      <a:ext cx="4140000" cy="3105000"/>
                     </a:xfrm>
                     <a:prstGeom prst="rect"/>
                   </pic:spPr>
@@ -3578,6 +3467,7 @@
     </w:p>
     <w:p>
       <w:pPr>
+        <w:keepNext/>
         <w:spacing w:before="40" w:after="120" w:line="276" w:lineRule="auto"/>
         <w:ind w:firstLine="0"/>
         <w:jc w:val="center"/>
@@ -3594,7 +3484,7 @@
     </w:p>
     <w:p>
       <w:pPr>
-        <w:spacing w:before="0" w:beforeAutospacing="1" w:after="60" w:afterAutospacing="1" w:line="288" w:lineRule="auto"/>
+        <w:spacing w:before="0" w:beforeAutospacing="1" w:after="40" w:afterAutospacing="1" w:line="288" w:lineRule="auto"/>
         <w:ind w:firstLine="720"/>
         <w:jc w:val="both"/>
         <w:rPr>
@@ -3687,6 +3577,7 @@
     </w:p>
     <w:p>
       <w:pPr>
+        <w:keepNext/>
         <w:spacing w:before="120" w:beforeAutospacing="1" w:after="60" w:afterAutospacing="1" w:line="288" w:lineRule="auto"/>
         <w:ind w:firstLine="0"/>
         <w:jc w:val="left"/>
@@ -3738,7 +3629,7 @@
     </w:p>
     <w:p>
       <w:pPr>
-        <w:spacing w:before="0" w:beforeAutospacing="1" w:after="60" w:afterAutospacing="1" w:line="288" w:lineRule="auto"/>
+        <w:spacing w:before="0" w:beforeAutospacing="1" w:after="40" w:afterAutospacing="1" w:line="288" w:lineRule="auto"/>
         <w:ind w:firstLine="720"/>
         <w:jc w:val="both"/>
         <w:rPr>
@@ -3768,7 +3659,7 @@
           <w:ilvl w:val="0"/>
           <w:numId w:val="6"/>
         </w:numPr>
-        <w:spacing w:before="0" w:beforeAutospacing="1" w:after="60" w:afterAutospacing="1" w:line="288" w:lineRule="auto"/>
+        <w:spacing w:before="0" w:beforeAutospacing="1" w:after="40" w:afterAutospacing="1" w:line="288" w:lineRule="auto"/>
         <w:ind w:firstLine="720"/>
         <w:jc w:val="both"/>
         <w:rPr>
@@ -3798,7 +3689,7 @@
           <w:ilvl w:val="0"/>
           <w:numId w:val="6"/>
         </w:numPr>
-        <w:spacing w:before="0" w:beforeAutospacing="1" w:after="60" w:afterAutospacing="1" w:line="288" w:lineRule="auto"/>
+        <w:spacing w:before="0" w:beforeAutospacing="1" w:after="40" w:afterAutospacing="1" w:line="288" w:lineRule="auto"/>
         <w:ind w:firstLine="720"/>
         <w:jc w:val="both"/>
         <w:rPr>
@@ -3828,7 +3719,7 @@
           <w:ilvl w:val="0"/>
           <w:numId w:val="6"/>
         </w:numPr>
-        <w:spacing w:before="0" w:beforeAutospacing="1" w:after="60" w:afterAutospacing="1" w:line="288" w:lineRule="auto"/>
+        <w:spacing w:before="0" w:beforeAutospacing="1" w:after="40" w:afterAutospacing="1" w:line="288" w:lineRule="auto"/>
         <w:ind w:firstLine="720"/>
         <w:jc w:val="both"/>
         <w:rPr>
@@ -3858,7 +3749,7 @@
           <w:ilvl w:val="0"/>
           <w:numId w:val="6"/>
         </w:numPr>
-        <w:spacing w:before="0" w:beforeAutospacing="1" w:after="60" w:afterAutospacing="1" w:line="288" w:lineRule="auto"/>
+        <w:spacing w:before="0" w:beforeAutospacing="1" w:after="40" w:afterAutospacing="1" w:line="288" w:lineRule="auto"/>
         <w:ind w:firstLine="720"/>
         <w:jc w:val="both"/>
         <w:rPr>
@@ -3888,7 +3779,7 @@
           <w:ilvl w:val="0"/>
           <w:numId w:val="6"/>
         </w:numPr>
-        <w:spacing w:before="0" w:beforeAutospacing="1" w:after="60" w:afterAutospacing="1" w:line="288" w:lineRule="auto"/>
+        <w:spacing w:before="0" w:beforeAutospacing="1" w:after="40" w:afterAutospacing="1" w:line="288" w:lineRule="auto"/>
         <w:ind w:firstLine="720"/>
         <w:jc w:val="both"/>
         <w:rPr>
@@ -3918,7 +3809,7 @@
           <w:ilvl w:val="0"/>
           <w:numId w:val="6"/>
         </w:numPr>
-        <w:spacing w:before="0" w:beforeAutospacing="1" w:after="60" w:afterAutospacing="1" w:line="288" w:lineRule="auto"/>
+        <w:spacing w:before="0" w:beforeAutospacing="1" w:after="40" w:afterAutospacing="1" w:line="288" w:lineRule="auto"/>
         <w:ind w:firstLine="720"/>
         <w:jc w:val="both"/>
         <w:rPr>
@@ -3944,7 +3835,7 @@
     </w:p>
     <w:p>
       <w:pPr>
-        <w:spacing w:before="0" w:beforeAutospacing="1" w:after="60" w:afterAutospacing="1" w:line="288" w:lineRule="auto"/>
+        <w:spacing w:before="0" w:beforeAutospacing="1" w:after="40" w:afterAutospacing="1" w:line="288" w:lineRule="auto"/>
         <w:ind w:firstLine="720"/>
         <w:jc w:val="both"/>
         <w:rPr>
@@ -3998,6 +3889,7 @@
     </w:p>
     <w:p>
       <w:pPr>
+        <w:keepNext/>
         <w:spacing w:before="120" w:beforeAutospacing="1" w:after="60" w:afterAutospacing="1" w:line="288" w:lineRule="auto"/>
         <w:ind w:firstLine="0"/>
         <w:jc w:val="left"/>
@@ -4043,7 +3935,7 @@
     </w:p>
     <w:p>
       <w:pPr>
-        <w:spacing w:before="0" w:beforeAutospacing="1" w:after="60" w:afterAutospacing="1" w:line="288" w:lineRule="auto"/>
+        <w:spacing w:before="0" w:beforeAutospacing="1" w:after="40" w:afterAutospacing="1" w:line="288" w:lineRule="auto"/>
         <w:ind w:firstLine="720"/>
         <w:jc w:val="both"/>
         <w:rPr>
@@ -4066,7 +3958,7 @@
     </w:p>
     <w:p>
       <w:pPr>
-        <w:spacing w:before="0" w:beforeAutospacing="1" w:after="60" w:afterAutospacing="1" w:line="288" w:lineRule="auto"/>
+        <w:spacing w:before="0" w:beforeAutospacing="1" w:after="40" w:afterAutospacing="1" w:line="288" w:lineRule="auto"/>
         <w:ind w:firstLine="720"/>
         <w:jc w:val="both"/>
         <w:rPr>
@@ -4089,7 +3981,7 @@
     </w:p>
     <w:p>
       <w:pPr>
-        <w:spacing w:before="0" w:beforeAutospacing="1" w:after="60" w:afterAutospacing="1" w:line="288" w:lineRule="auto"/>
+        <w:spacing w:before="0" w:beforeAutospacing="1" w:after="40" w:afterAutospacing="1" w:line="288" w:lineRule="auto"/>
         <w:ind w:firstLine="720"/>
         <w:jc w:val="both"/>
         <w:rPr>
@@ -4112,6 +4004,7 @@
     </w:p>
     <w:p>
       <w:pPr>
+        <w:keepNext/>
         <w:spacing w:before="120" w:beforeAutospacing="1" w:after="60" w:afterAutospacing="1" w:line="288" w:lineRule="auto"/>
         <w:ind w:firstLine="0"/>
         <w:jc w:val="left"/>
@@ -4157,7 +4050,7 @@
     </w:p>
     <w:p>
       <w:pPr>
-        <w:spacing w:before="0" w:beforeAutospacing="1" w:after="60" w:afterAutospacing="1" w:line="288" w:lineRule="auto"/>
+        <w:spacing w:before="0" w:beforeAutospacing="1" w:after="40" w:afterAutospacing="1" w:line="288" w:lineRule="auto"/>
         <w:ind w:firstLine="720"/>
         <w:jc w:val="both"/>
         <w:rPr>
@@ -4334,7 +4227,7 @@
     </w:p>
     <w:p>
       <w:pPr>
-        <w:spacing w:before="0" w:beforeAutospacing="1" w:after="60" w:afterAutospacing="1" w:line="288" w:lineRule="auto"/>
+        <w:spacing w:before="0" w:beforeAutospacing="1" w:after="40" w:afterAutospacing="1" w:line="288" w:lineRule="auto"/>
         <w:ind w:firstLine="720"/>
         <w:jc w:val="both"/>
         <w:rPr>
@@ -4357,7 +4250,7 @@
     </w:p>
     <w:p>
       <w:pPr>
-        <w:spacing w:before="0" w:beforeAutospacing="1" w:after="60" w:afterAutospacing="1" w:line="288" w:lineRule="auto"/>
+        <w:spacing w:before="0" w:beforeAutospacing="1" w:after="40" w:afterAutospacing="1" w:line="288" w:lineRule="auto"/>
         <w:ind w:firstLine="720"/>
         <w:jc w:val="both"/>
         <w:rPr>
@@ -4380,7 +4273,7 @@
     </w:p>
     <w:p>
       <w:pPr>
-        <w:spacing w:before="0" w:beforeAutospacing="1" w:after="60" w:afterAutospacing="1" w:line="288" w:lineRule="auto"/>
+        <w:spacing w:before="0" w:beforeAutospacing="1" w:after="40" w:afterAutospacing="1" w:line="288" w:lineRule="auto"/>
         <w:ind w:firstLine="720"/>
         <w:jc w:val="both"/>
         <w:rPr>
@@ -4407,7 +4300,7 @@
           <w:ilvl w:val="0"/>
           <w:numId w:val="8"/>
         </w:numPr>
-        <w:spacing w:before="0" w:beforeAutospacing="1" w:after="60" w:afterAutospacing="1" w:line="288" w:lineRule="auto"/>
+        <w:spacing w:before="0" w:beforeAutospacing="1" w:after="40" w:afterAutospacing="1" w:line="288" w:lineRule="auto"/>
         <w:ind w:firstLine="720"/>
         <w:jc w:val="both"/>
         <w:rPr>
@@ -4443,7 +4336,7 @@
           <w:ilvl w:val="0"/>
           <w:numId w:val="8"/>
         </w:numPr>
-        <w:spacing w:before="0" w:beforeAutospacing="1" w:after="60" w:afterAutospacing="1" w:line="288" w:lineRule="auto"/>
+        <w:spacing w:before="0" w:beforeAutospacing="1" w:after="40" w:afterAutospacing="1" w:line="288" w:lineRule="auto"/>
         <w:ind w:firstLine="720"/>
         <w:jc w:val="both"/>
         <w:rPr>
@@ -4470,7 +4363,7 @@
           <w:ilvl w:val="0"/>
           <w:numId w:val="8"/>
         </w:numPr>
-        <w:spacing w:before="0" w:beforeAutospacing="1" w:after="60" w:afterAutospacing="1" w:line="288" w:lineRule="auto"/>
+        <w:spacing w:before="0" w:beforeAutospacing="1" w:after="40" w:afterAutospacing="1" w:line="288" w:lineRule="auto"/>
         <w:ind w:firstLine="720"/>
         <w:jc w:val="both"/>
         <w:rPr>
@@ -4497,7 +4390,7 @@
           <w:ilvl w:val="0"/>
           <w:numId w:val="8"/>
         </w:numPr>
-        <w:spacing w:before="0" w:beforeAutospacing="1" w:after="60" w:afterAutospacing="1" w:line="288" w:lineRule="auto"/>
+        <w:spacing w:before="0" w:beforeAutospacing="1" w:after="40" w:afterAutospacing="1" w:line="288" w:lineRule="auto"/>
         <w:ind w:firstLine="720"/>
         <w:jc w:val="both"/>
         <w:rPr>
@@ -4524,7 +4417,7 @@
           <w:ilvl w:val="0"/>
           <w:numId w:val="8"/>
         </w:numPr>
-        <w:spacing w:before="0" w:beforeAutospacing="1" w:after="60" w:afterAutospacing="1" w:line="288" w:lineRule="auto"/>
+        <w:spacing w:before="0" w:beforeAutospacing="1" w:after="40" w:afterAutospacing="1" w:line="288" w:lineRule="auto"/>
         <w:ind w:firstLine="720"/>
         <w:jc w:val="both"/>
         <w:rPr>
@@ -4547,7 +4440,7 @@
     </w:p>
     <w:p>
       <w:pPr>
-        <w:spacing w:before="0" w:beforeAutospacing="1" w:after="60" w:afterAutospacing="1" w:line="288" w:lineRule="auto"/>
+        <w:spacing w:before="0" w:beforeAutospacing="1" w:after="40" w:afterAutospacing="1" w:line="288" w:lineRule="auto"/>
         <w:ind w:firstLine="720"/>
         <w:jc w:val="both"/>
         <w:rPr>
@@ -4571,6 +4464,7 @@
     </w:p>
     <w:p>
       <w:pPr>
+        <w:keepNext/>
         <w:spacing w:before="120" w:beforeAutospacing="1" w:after="60" w:afterAutospacing="1" w:line="288" w:lineRule="auto"/>
         <w:ind w:firstLine="0"/>
         <w:jc w:val="left"/>
@@ -4627,7 +4521,7 @@
     </w:p>
     <w:p>
       <w:pPr>
-        <w:spacing w:before="0" w:beforeAutospacing="1" w:after="60" w:afterAutospacing="1" w:line="288" w:lineRule="auto"/>
+        <w:spacing w:before="0" w:beforeAutospacing="1" w:after="40" w:afterAutospacing="1" w:line="288" w:lineRule="auto"/>
         <w:ind w:firstLine="720"/>
         <w:jc w:val="both"/>
         <w:rPr>
@@ -4650,7 +4544,7 @@
     </w:p>
     <w:p>
       <w:pPr>
-        <w:spacing w:before="0" w:beforeAutospacing="1" w:after="60" w:afterAutospacing="1" w:line="288" w:lineRule="auto"/>
+        <w:spacing w:before="0" w:beforeAutospacing="1" w:after="40" w:afterAutospacing="1" w:line="288" w:lineRule="auto"/>
         <w:ind w:firstLine="720"/>
         <w:jc w:val="both"/>
         <w:rPr>
@@ -4673,6 +4567,7 @@
     </w:p>
     <w:p>
       <w:pPr>
+        <w:keepNext/>
         <w:spacing w:before="120" w:beforeAutospacing="1" w:after="60" w:afterAutospacing="1" w:line="288" w:lineRule="auto"/>
         <w:ind w:firstLine="0"/>
         <w:jc w:val="left"/>
@@ -4707,7 +4602,7 @@
     </w:p>
     <w:p>
       <w:pPr>
-        <w:spacing w:before="0" w:beforeAutospacing="1" w:after="60" w:afterAutospacing="1" w:line="288" w:lineRule="auto"/>
+        <w:spacing w:before="0" w:beforeAutospacing="1" w:after="40" w:afterAutospacing="1" w:line="288" w:lineRule="auto"/>
         <w:ind w:firstLine="720"/>
         <w:jc w:val="both"/>
         <w:rPr>
@@ -4760,7 +4655,7 @@
     </w:p>
     <w:p>
       <w:pPr>
-        <w:spacing w:before="0" w:beforeAutospacing="1" w:after="60" w:afterAutospacing="1" w:line="288" w:lineRule="auto"/>
+        <w:spacing w:before="0" w:beforeAutospacing="1" w:after="40" w:afterAutospacing="1" w:line="288" w:lineRule="auto"/>
         <w:ind w:firstLine="720"/>
         <w:jc w:val="both"/>
         <w:rPr>
@@ -4803,7 +4698,7 @@
     </w:p>
     <w:p>
       <w:pPr>
-        <w:spacing w:before="0" w:beforeAutospacing="1" w:after="60" w:afterAutospacing="1" w:line="288" w:lineRule="auto"/>
+        <w:spacing w:before="0" w:beforeAutospacing="1" w:after="40" w:afterAutospacing="1" w:line="288" w:lineRule="auto"/>
         <w:ind w:firstLine="720"/>
         <w:jc w:val="both"/>
         <w:rPr>
@@ -4826,6 +4721,7 @@
     </w:p>
     <w:p>
       <w:pPr>
+        <w:keepNext/>
         <w:spacing w:before="120" w:beforeAutospacing="1" w:after="60" w:afterAutospacing="1" w:line="288" w:lineRule="auto"/>
         <w:ind w:firstLine="0"/>
         <w:jc w:val="left"/>
@@ -4871,7 +4767,7 @@
     </w:p>
     <w:p>
       <w:pPr>
-        <w:spacing w:before="0" w:beforeAutospacing="1" w:after="60" w:afterAutospacing="1" w:line="288" w:lineRule="auto"/>
+        <w:spacing w:before="0" w:beforeAutospacing="1" w:after="40" w:afterAutospacing="1" w:line="288" w:lineRule="auto"/>
         <w:ind w:firstLine="720"/>
         <w:jc w:val="both"/>
         <w:rPr>
@@ -4969,6 +4865,7 @@
     </w:p>
     <w:p>
       <w:pPr>
+        <w:keepNext/>
         <w:spacing w:before="120" w:beforeAutospacing="1" w:after="60" w:afterAutospacing="1" w:line="288" w:lineRule="auto"/>
         <w:ind w:firstLine="0"/>
         <w:jc w:val="left"/>
@@ -5003,7 +4900,7 @@
     </w:p>
     <w:p>
       <w:pPr>
-        <w:spacing w:before="0" w:beforeAutospacing="1" w:after="60" w:afterAutospacing="1" w:line="288" w:lineRule="auto"/>
+        <w:spacing w:before="0" w:beforeAutospacing="1" w:after="40" w:afterAutospacing="1" w:line="288" w:lineRule="auto"/>
         <w:ind w:firstLine="720"/>
         <w:jc w:val="both"/>
         <w:rPr>
@@ -5026,7 +4923,7 @@
     </w:p>
     <w:p>
       <w:pPr>
-        <w:spacing w:before="0" w:beforeAutospacing="1" w:after="60" w:afterAutospacing="1" w:line="288" w:lineRule="auto"/>
+        <w:spacing w:before="0" w:beforeAutospacing="1" w:after="40" w:afterAutospacing="1" w:line="288" w:lineRule="auto"/>
         <w:ind w:firstLine="720"/>
         <w:jc w:val="both"/>
         <w:rPr>
@@ -5050,7 +4947,7 @@
     </w:p>
     <w:p>
       <w:pPr>
-        <w:spacing w:before="0" w:beforeAutospacing="1" w:after="60" w:afterAutospacing="1" w:line="288" w:lineRule="auto"/>
+        <w:spacing w:before="0" w:beforeAutospacing="1" w:after="40" w:afterAutospacing="1" w:line="288" w:lineRule="auto"/>
         <w:ind w:firstLine="720"/>
         <w:jc w:val="both"/>
         <w:rPr>
@@ -5073,6 +4970,7 @@
     </w:p>
     <w:p>
       <w:pPr>
+        <w:keepNext/>
         <w:spacing w:before="120" w:beforeAutospacing="1" w:after="60" w:afterAutospacing="1" w:line="288" w:lineRule="auto"/>
         <w:ind w:firstLine="0"/>
         <w:jc w:val="left"/>
@@ -5100,7 +4998,7 @@
     </w:p>
     <w:p>
       <w:pPr>
-        <w:spacing w:before="0" w:beforeAutospacing="1" w:after="60" w:afterAutospacing="1" w:line="288" w:lineRule="auto"/>
+        <w:spacing w:before="0" w:beforeAutospacing="1" w:after="40" w:afterAutospacing="1" w:line="288" w:lineRule="auto"/>
         <w:ind w:firstLine="720"/>
         <w:jc w:val="both"/>
         <w:rPr>
@@ -5126,7 +5024,7 @@
     </w:p>
     <w:p>
       <w:pPr>
-        <w:spacing w:before="0" w:beforeAutospacing="1" w:after="60" w:afterAutospacing="1" w:line="288" w:lineRule="auto"/>
+        <w:spacing w:before="0" w:beforeAutospacing="1" w:after="40" w:afterAutospacing="1" w:line="288" w:lineRule="auto"/>
         <w:ind w:firstLine="720"/>
         <w:jc w:val="both"/>
         <w:rPr>
@@ -5152,7 +5050,7 @@
     </w:p>
     <w:p>
       <w:pPr>
-        <w:spacing w:before="0" w:beforeAutospacing="1" w:after="60" w:afterAutospacing="1" w:line="288" w:lineRule="auto"/>
+        <w:spacing w:before="0" w:beforeAutospacing="1" w:after="40" w:afterAutospacing="1" w:line="288" w:lineRule="auto"/>
         <w:ind w:firstLine="720"/>
         <w:jc w:val="both"/>
         <w:rPr>
@@ -5178,7 +5076,7 @@
     </w:p>
     <w:p>
       <w:pPr>
-        <w:spacing w:before="0" w:beforeAutospacing="1" w:after="60" w:afterAutospacing="1" w:line="288" w:lineRule="auto"/>
+        <w:spacing w:before="0" w:beforeAutospacing="1" w:after="40" w:afterAutospacing="1" w:line="288" w:lineRule="auto"/>
         <w:ind w:firstLine="720"/>
         <w:jc w:val="both"/>
         <w:rPr>
@@ -5204,7 +5102,7 @@
     </w:p>
     <w:p>
       <w:pPr>
-        <w:spacing w:before="0" w:beforeAutospacing="1" w:after="60" w:afterAutospacing="1" w:line="288" w:lineRule="auto"/>
+        <w:spacing w:before="0" w:beforeAutospacing="1" w:after="40" w:afterAutospacing="1" w:line="288" w:lineRule="auto"/>
         <w:ind w:firstLine="720"/>
         <w:jc w:val="both"/>
         <w:rPr>
@@ -5230,6 +5128,7 @@
     </w:p>
     <w:p>
       <w:pPr>
+        <w:keepNext/>
         <w:spacing w:before="120" w:after="60" w:line="288" w:lineRule="auto"/>
         <w:ind w:firstLine="0"/>
         <w:jc w:val="left"/>
@@ -5278,19 +5177,7 @@
     </w:p>
     <w:p>
       <w:pPr>
-        <w:spacing w:before="60" w:after="60"/>
-        <w:jc w:val="both"/>
-        <w:rPr>
-          <w:rFonts w:asciiTheme="majorHAnsi" w:hAnsiTheme="majorHAnsi" w:cstheme="majorHAnsi"/>
-          <w:bCs w:val="0"/>
-          <w:sz w:val="26"/>
-          <w:szCs w:val="26"/>
-          <w:lang w:val="vi-VN"/>
-        </w:rPr>
-      </w:pPr>
-    </w:p>
-    <w:p>
-      <w:pPr>
+        <w:keepNext/>
         <w:spacing w:before="120" w:beforeAutospacing="1" w:after="60" w:afterAutospacing="1" w:line="288" w:lineRule="auto"/>
         <w:ind w:firstLine="0"/>
         <w:jc w:val="left"/>
@@ -5342,7 +5229,7 @@
     </w:p>
     <w:p>
       <w:pPr>
-        <w:spacing w:before="0" w:beforeAutospacing="1" w:after="60" w:afterAutospacing="1" w:line="288" w:lineRule="auto"/>
+        <w:spacing w:before="0" w:beforeAutospacing="1" w:after="40" w:afterAutospacing="1" w:line="288" w:lineRule="auto"/>
         <w:ind w:firstLine="720"/>
         <w:jc w:val="both"/>
         <w:rPr>
@@ -5372,7 +5259,7 @@
           <w:ilvl w:val="0"/>
           <w:numId w:val="1"/>
         </w:numPr>
-        <w:spacing w:before="0" w:beforeAutospacing="1" w:after="60" w:afterAutospacing="1" w:line="288" w:lineRule="auto"/>
+        <w:spacing w:before="0" w:beforeAutospacing="1" w:after="40" w:afterAutospacing="1" w:line="288" w:lineRule="auto"/>
         <w:ind w:firstLine="720"/>
         <w:jc w:val="both"/>
         <w:rPr>
@@ -5402,7 +5289,7 @@
           <w:ilvl w:val="0"/>
           <w:numId w:val="1"/>
         </w:numPr>
-        <w:spacing w:before="0" w:beforeAutospacing="1" w:after="60" w:afterAutospacing="1" w:line="288" w:lineRule="auto"/>
+        <w:spacing w:before="0" w:beforeAutospacing="1" w:after="40" w:afterAutospacing="1" w:line="288" w:lineRule="auto"/>
         <w:ind w:firstLine="720"/>
         <w:jc w:val="both"/>
         <w:rPr>
@@ -5432,7 +5319,7 @@
           <w:ilvl w:val="0"/>
           <w:numId w:val="1"/>
         </w:numPr>
-        <w:spacing w:before="0" w:beforeAutospacing="1" w:after="60" w:afterAutospacing="1" w:line="288" w:lineRule="auto"/>
+        <w:spacing w:before="0" w:beforeAutospacing="1" w:after="40" w:afterAutospacing="1" w:line="288" w:lineRule="auto"/>
         <w:ind w:firstLine="720"/>
         <w:jc w:val="both"/>
         <w:rPr>
@@ -5462,7 +5349,7 @@
           <w:ilvl w:val="0"/>
           <w:numId w:val="1"/>
         </w:numPr>
-        <w:spacing w:before="0" w:beforeAutospacing="1" w:after="60" w:afterAutospacing="1" w:line="288" w:lineRule="auto"/>
+        <w:spacing w:before="0" w:beforeAutospacing="1" w:after="40" w:afterAutospacing="1" w:line="288" w:lineRule="auto"/>
         <w:ind w:firstLine="720"/>
         <w:jc w:val="both"/>
         <w:rPr>
@@ -5492,7 +5379,7 @@
           <w:ilvl w:val="0"/>
           <w:numId w:val="1"/>
         </w:numPr>
-        <w:spacing w:before="0" w:beforeAutospacing="1" w:after="60" w:afterAutospacing="1" w:line="288" w:lineRule="auto"/>
+        <w:spacing w:before="0" w:beforeAutospacing="1" w:after="40" w:afterAutospacing="1" w:line="288" w:lineRule="auto"/>
         <w:ind w:firstLine="720"/>
         <w:jc w:val="both"/>
         <w:rPr>
@@ -5523,7 +5410,7 @@
           <w:ilvl w:val="0"/>
           <w:numId w:val="1"/>
         </w:numPr>
-        <w:spacing w:before="0" w:beforeAutospacing="1" w:after="60" w:afterAutospacing="1" w:line="288" w:lineRule="auto"/>
+        <w:spacing w:before="0" w:beforeAutospacing="1" w:after="40" w:afterAutospacing="1" w:line="288" w:lineRule="auto"/>
         <w:ind w:firstLine="720"/>
         <w:jc w:val="both"/>
         <w:rPr>
@@ -5553,7 +5440,7 @@
           <w:ilvl w:val="0"/>
           <w:numId w:val="1"/>
         </w:numPr>
-        <w:spacing w:before="0" w:beforeAutospacing="1" w:after="60" w:afterAutospacing="1" w:line="288" w:lineRule="auto"/>
+        <w:spacing w:before="0" w:beforeAutospacing="1" w:after="40" w:afterAutospacing="1" w:line="288" w:lineRule="auto"/>
         <w:ind w:firstLine="720"/>
         <w:jc w:val="both"/>
         <w:rPr>
@@ -5583,7 +5470,7 @@
           <w:ilvl w:val="0"/>
           <w:numId w:val="1"/>
         </w:numPr>
-        <w:spacing w:before="0" w:beforeAutospacing="1" w:after="60" w:afterAutospacing="1" w:line="288" w:lineRule="auto"/>
+        <w:spacing w:before="0" w:beforeAutospacing="1" w:after="40" w:afterAutospacing="1" w:line="288" w:lineRule="auto"/>
         <w:ind w:firstLine="720"/>
         <w:jc w:val="both"/>
         <w:rPr>
@@ -5609,7 +5496,7 @@
     </w:p>
     <w:p>
       <w:pPr>
-        <w:spacing w:before="0" w:beforeAutospacing="1" w:after="60" w:afterAutospacing="1" w:line="288" w:lineRule="auto"/>
+        <w:spacing w:before="0" w:beforeAutospacing="1" w:after="40" w:afterAutospacing="1" w:line="288" w:lineRule="auto"/>
         <w:ind w:firstLine="720"/>
         <w:jc w:val="both"/>
         <w:rPr>
@@ -5635,6 +5522,7 @@
     </w:p>
     <w:p>
       <w:pPr>
+        <w:keepNext/>
         <w:spacing w:before="120" w:beforeAutospacing="1" w:after="60" w:afterAutospacing="1" w:line="288" w:lineRule="auto"/>
         <w:ind w:firstLine="0"/>
         <w:jc w:val="left"/>
@@ -5686,7 +5574,7 @@
     </w:p>
     <w:p>
       <w:pPr>
-        <w:spacing w:before="0" w:beforeAutospacing="1" w:after="60" w:afterAutospacing="1" w:line="288" w:lineRule="auto"/>
+        <w:spacing w:before="0" w:beforeAutospacing="1" w:after="40" w:afterAutospacing="1" w:line="288" w:lineRule="auto"/>
         <w:ind w:firstLine="720"/>
         <w:jc w:val="both"/>
         <w:rPr>
@@ -5709,7 +5597,7 @@
     </w:p>
     <w:p>
       <w:pPr>
-        <w:spacing w:before="0" w:beforeAutospacing="1" w:after="60" w:afterAutospacing="1" w:line="288" w:lineRule="auto"/>
+        <w:spacing w:before="0" w:beforeAutospacing="1" w:after="40" w:afterAutospacing="1" w:line="288" w:lineRule="auto"/>
         <w:ind w:firstLine="720"/>
         <w:jc w:val="both"/>
         <w:rPr>
@@ -5737,7 +5625,7 @@
           <w:ilvl w:val="0"/>
           <w:numId w:val="10"/>
         </w:numPr>
-        <w:spacing w:before="0" w:beforeAutospacing="1" w:after="60" w:afterAutospacing="1" w:line="288" w:lineRule="auto"/>
+        <w:spacing w:before="0" w:beforeAutospacing="1" w:after="40" w:afterAutospacing="1" w:line="288" w:lineRule="auto"/>
         <w:ind w:firstLine="720"/>
         <w:jc w:val="both"/>
         <w:rPr>
@@ -5795,7 +5683,7 @@
           <w:ilvl w:val="0"/>
           <w:numId w:val="10"/>
         </w:numPr>
-        <w:spacing w:before="0" w:beforeAutospacing="1" w:after="60" w:afterAutospacing="1" w:line="288" w:lineRule="auto"/>
+        <w:spacing w:before="0" w:beforeAutospacing="1" w:after="40" w:afterAutospacing="1" w:line="288" w:lineRule="auto"/>
         <w:ind w:firstLine="720"/>
         <w:jc w:val="both"/>
         <w:rPr>
@@ -5845,7 +5733,7 @@
           <w:ilvl w:val="0"/>
           <w:numId w:val="10"/>
         </w:numPr>
-        <w:spacing w:before="0" w:beforeAutospacing="1" w:after="60" w:afterAutospacing="1" w:line="288" w:lineRule="auto"/>
+        <w:spacing w:before="0" w:beforeAutospacing="1" w:after="40" w:afterAutospacing="1" w:line="288" w:lineRule="auto"/>
         <w:ind w:firstLine="720"/>
         <w:jc w:val="both"/>
         <w:rPr>
@@ -5873,7 +5761,7 @@
           <w:ilvl w:val="0"/>
           <w:numId w:val="10"/>
         </w:numPr>
-        <w:spacing w:before="0" w:beforeAutospacing="1" w:after="60" w:afterAutospacing="1" w:line="288" w:lineRule="auto"/>
+        <w:spacing w:before="0" w:beforeAutospacing="1" w:after="40" w:afterAutospacing="1" w:line="288" w:lineRule="auto"/>
         <w:ind w:firstLine="720"/>
         <w:jc w:val="both"/>
         <w:rPr>
@@ -5901,7 +5789,7 @@
           <w:ilvl w:val="0"/>
           <w:numId w:val="10"/>
         </w:numPr>
-        <w:spacing w:before="0" w:beforeAutospacing="1" w:after="60" w:afterAutospacing="1" w:line="288" w:lineRule="auto"/>
+        <w:spacing w:before="0" w:beforeAutospacing="1" w:after="40" w:afterAutospacing="1" w:line="288" w:lineRule="auto"/>
         <w:ind w:firstLine="720"/>
         <w:jc w:val="both"/>
         <w:rPr>
@@ -5924,7 +5812,7 @@
     </w:p>
     <w:p>
       <w:pPr>
-        <w:spacing w:before="0" w:beforeAutospacing="1" w:after="60" w:afterAutospacing="1" w:line="288" w:lineRule="auto"/>
+        <w:spacing w:before="0" w:beforeAutospacing="1" w:after="40" w:afterAutospacing="1" w:line="288" w:lineRule="auto"/>
         <w:ind w:firstLine="720"/>
         <w:jc w:val="both"/>
         <w:rPr>
@@ -5947,6 +5835,7 @@
     </w:p>
     <w:p>
       <w:pPr>
+        <w:keepNext/>
         <w:spacing w:before="120" w:beforeAutospacing="1" w:after="60" w:afterAutospacing="1" w:line="288" w:lineRule="auto"/>
         <w:ind w:firstLine="0"/>
         <w:jc w:val="left"/>
@@ -5982,7 +5871,7 @@
     </w:p>
     <w:p>
       <w:pPr>
-        <w:spacing w:before="0" w:beforeAutospacing="1" w:after="60" w:afterAutospacing="1" w:line="288" w:lineRule="auto"/>
+        <w:spacing w:before="0" w:beforeAutospacing="1" w:after="40" w:afterAutospacing="1" w:line="288" w:lineRule="auto"/>
         <w:ind w:firstLine="720"/>
         <w:jc w:val="both"/>
         <w:rPr>
@@ -6005,7 +5894,7 @@
     </w:p>
     <w:p>
       <w:pPr>
-        <w:spacing w:before="0" w:beforeAutospacing="1" w:after="60" w:afterAutospacing="1" w:line="288" w:lineRule="auto"/>
+        <w:spacing w:before="0" w:beforeAutospacing="1" w:after="40" w:afterAutospacing="1" w:line="288" w:lineRule="auto"/>
         <w:ind w:firstLine="720"/>
         <w:jc w:val="both"/>
         <w:rPr>
@@ -6116,6 +6005,7 @@
     </w:p>
     <w:p>
       <w:pPr>
+        <w:keepNext/>
         <w:spacing w:before="120" w:beforeAutospacing="1" w:after="60" w:afterAutospacing="1" w:line="288" w:lineRule="auto"/>
         <w:ind w:firstLine="0"/>
         <w:jc w:val="left"/>
@@ -6151,7 +6041,7 @@
     </w:p>
     <w:p>
       <w:pPr>
-        <w:spacing w:before="0" w:beforeAutospacing="1" w:after="60" w:afterAutospacing="1" w:line="288" w:lineRule="auto"/>
+        <w:spacing w:before="0" w:beforeAutospacing="1" w:after="40" w:afterAutospacing="1" w:line="288" w:lineRule="auto"/>
         <w:ind w:firstLine="720"/>
         <w:jc w:val="both"/>
         <w:rPr>
@@ -6174,7 +6064,7 @@
     </w:p>
     <w:p>
       <w:pPr>
-        <w:spacing w:before="0" w:beforeAutospacing="1" w:after="60" w:afterAutospacing="1" w:line="288" w:lineRule="auto"/>
+        <w:spacing w:before="0" w:beforeAutospacing="1" w:after="40" w:afterAutospacing="1" w:line="288" w:lineRule="auto"/>
         <w:ind w:firstLine="720"/>
         <w:jc w:val="both"/>
         <w:rPr>
@@ -6210,7 +6100,7 @@
     </w:p>
     <w:p>
       <w:pPr>
-        <w:spacing w:before="0" w:beforeAutospacing="1" w:after="60" w:afterAutospacing="1" w:line="288" w:lineRule="auto"/>
+        <w:spacing w:before="0" w:beforeAutospacing="1" w:after="40" w:afterAutospacing="1" w:line="288" w:lineRule="auto"/>
         <w:ind w:firstLine="720"/>
         <w:jc w:val="both"/>
         <w:rPr>
@@ -6245,7 +6135,7 @@
     </w:p>
     <w:p>
       <w:pPr>
-        <w:spacing w:before="0" w:beforeAutospacing="1" w:after="60" w:afterAutospacing="1" w:line="288" w:lineRule="auto"/>
+        <w:spacing w:before="0" w:beforeAutospacing="1" w:after="40" w:afterAutospacing="1" w:line="288" w:lineRule="auto"/>
         <w:ind w:firstLine="720"/>
         <w:jc w:val="both"/>
         <w:rPr>
@@ -6313,7 +6203,7 @@
     </w:p>
     <w:p>
       <w:pPr>
-        <w:spacing w:before="0" w:beforeAutospacing="1" w:after="60" w:afterAutospacing="1" w:line="288" w:lineRule="auto"/>
+        <w:spacing w:before="0" w:beforeAutospacing="1" w:after="40" w:afterAutospacing="1" w:line="288" w:lineRule="auto"/>
         <w:ind w:firstLine="720"/>
         <w:jc w:val="both"/>
         <w:rPr>
@@ -6352,7 +6242,7 @@
     </w:p>
     <w:p>
       <w:pPr>
-        <w:spacing w:before="0" w:beforeAutospacing="1" w:after="60" w:afterAutospacing="1" w:line="288" w:lineRule="auto"/>
+        <w:spacing w:before="0" w:beforeAutospacing="1" w:after="40" w:afterAutospacing="1" w:line="288" w:lineRule="auto"/>
         <w:ind w:firstLine="720"/>
         <w:jc w:val="both"/>
         <w:rPr>
@@ -6391,7 +6281,7 @@
     </w:p>
     <w:p>
       <w:pPr>
-        <w:spacing w:before="0" w:beforeAutospacing="1" w:after="60" w:afterAutospacing="1" w:line="288" w:lineRule="auto"/>
+        <w:spacing w:before="0" w:beforeAutospacing="1" w:after="40" w:afterAutospacing="1" w:line="288" w:lineRule="auto"/>
         <w:ind w:firstLine="720"/>
         <w:jc w:val="both"/>
         <w:rPr>
@@ -6430,7 +6320,7 @@
     </w:p>
     <w:p>
       <w:pPr>
-        <w:spacing w:before="0" w:beforeAutospacing="1" w:after="60" w:afterAutospacing="1" w:line="288" w:lineRule="auto"/>
+        <w:spacing w:before="0" w:beforeAutospacing="1" w:after="40" w:afterAutospacing="1" w:line="288" w:lineRule="auto"/>
         <w:ind w:firstLine="720"/>
         <w:jc w:val="both"/>
         <w:rPr>
@@ -6469,7 +6359,7 @@
     </w:p>
     <w:p>
       <w:pPr>
-        <w:spacing w:before="0" w:beforeAutospacing="1" w:after="60" w:afterAutospacing="1" w:line="288" w:lineRule="auto"/>
+        <w:spacing w:before="0" w:beforeAutospacing="1" w:after="40" w:afterAutospacing="1" w:line="288" w:lineRule="auto"/>
         <w:ind w:firstLine="720"/>
         <w:jc w:val="both"/>
         <w:rPr>
@@ -6531,6 +6421,7 @@
     </w:p>
     <w:p>
       <w:pPr>
+        <w:keepNext/>
         <w:spacing w:before="120" w:beforeAutospacing="1" w:after="60" w:afterAutospacing="1" w:line="288" w:lineRule="auto"/>
         <w:ind w:firstLine="0"/>
         <w:jc w:val="left"/>
@@ -6570,7 +6461,7 @@
     </w:p>
     <w:p>
       <w:pPr>
-        <w:spacing w:before="0" w:beforeAutospacing="1" w:after="60" w:afterAutospacing="1" w:line="288" w:lineRule="auto"/>
+        <w:spacing w:before="0" w:beforeAutospacing="1" w:after="40" w:afterAutospacing="1" w:line="288" w:lineRule="auto"/>
         <w:ind w:firstLine="720"/>
         <w:jc w:val="both"/>
         <w:rPr>
@@ -6593,7 +6484,7 @@
     </w:p>
     <w:p>
       <w:pPr>
-        <w:spacing w:before="0" w:beforeAutospacing="1" w:after="60" w:afterAutospacing="1" w:line="288" w:lineRule="auto"/>
+        <w:spacing w:before="0" w:beforeAutospacing="1" w:after="40" w:afterAutospacing="1" w:line="288" w:lineRule="auto"/>
         <w:ind w:firstLine="720"/>
         <w:jc w:val="both"/>
         <w:rPr>
@@ -6628,7 +6519,7 @@
     </w:p>
     <w:p>
       <w:pPr>
-        <w:spacing w:before="0" w:beforeAutospacing="1" w:after="60" w:afterAutospacing="1" w:line="288" w:lineRule="auto"/>
+        <w:spacing w:before="0" w:beforeAutospacing="1" w:after="40" w:afterAutospacing="1" w:line="288" w:lineRule="auto"/>
         <w:ind w:firstLine="720"/>
         <w:jc w:val="both"/>
         <w:rPr>
@@ -6651,6 +6542,7 @@
     </w:p>
     <w:p>
       <w:pPr>
+        <w:keepNext/>
         <w:spacing w:before="120" w:beforeAutospacing="1" w:after="60" w:afterAutospacing="1" w:line="288" w:lineRule="auto"/>
         <w:ind w:firstLine="0"/>
         <w:jc w:val="left"/>
@@ -6686,7 +6578,7 @@
     </w:p>
     <w:p>
       <w:pPr>
-        <w:spacing w:before="0" w:beforeAutospacing="1" w:after="60" w:afterAutospacing="1" w:line="288" w:lineRule="auto"/>
+        <w:spacing w:before="0" w:beforeAutospacing="1" w:after="40" w:afterAutospacing="1" w:line="288" w:lineRule="auto"/>
         <w:ind w:firstLine="720"/>
         <w:jc w:val="both"/>
         <w:rPr>
@@ -6863,6 +6755,7 @@
     </w:p>
     <w:p>
       <w:pPr>
+        <w:keepNext/>
         <w:spacing w:before="120" w:beforeAutospacing="1" w:after="60" w:afterAutospacing="1" w:line="288" w:lineRule="auto"/>
         <w:ind w:firstLine="0"/>
         <w:jc w:val="left"/>
@@ -6987,6 +6880,7 @@
           <w:bottom w:val="single" w:sz="6" w:space="0" w:color="000000"/>
           <w:right w:val="single" w:sz="6" w:space="0" w:color="000000"/>
         </w:tblBorders>
+        <w:tblLayout w:type="fixed"/>
         <w:tblCellMar>
           <w:top w:w="15" w:type="dxa"/>
           <w:left w:w="15" w:type="dxa"/>
@@ -6996,16 +6890,20 @@
         <w:tblLook w:val="04A0" w:firstRow="1" w:lastRow="0" w:firstColumn="1" w:lastColumn="0" w:noHBand="0" w:noVBand="1"/>
       </w:tblPr>
       <w:tblGrid>
-        <w:gridCol w:w="667"/>
-        <w:gridCol w:w="2634"/>
-        <w:gridCol w:w="1069"/>
-        <w:gridCol w:w="1110"/>
-        <w:gridCol w:w="1257"/>
+        <w:gridCol w:w="850"/>
+        <w:gridCol w:w="3118"/>
+        <w:gridCol w:w="1134"/>
+        <w:gridCol w:w="1814"/>
+        <w:gridCol w:w="1984"/>
       </w:tblGrid>
       <w:tr>
+        <w:trPr>
+          <w:cantSplit/>
+          <w:tblHeader/>
+        </w:trPr>
         <w:tc>
           <w:tcPr>
-            <w:tcW w:w="0" w:type="auto"/>
+            <w:tcW w:w="850" w:type="dxa"/>
             <w:tcMar>
               <w:top w:w="15" w:type="dxa"/>
               <w:left w:w="135" w:type="dxa"/>
@@ -7050,7 +6948,7 @@
         </w:tc>
         <w:tc>
           <w:tcPr>
-            <w:tcW w:w="0" w:type="auto"/>
+            <w:tcW w:w="3118" w:type="dxa"/>
             <w:tcMar>
               <w:top w:w="15" w:type="dxa"/>
               <w:left w:w="135" w:type="dxa"/>
@@ -7095,7 +6993,7 @@
         </w:tc>
         <w:tc>
           <w:tcPr>
-            <w:tcW w:w="0" w:type="auto"/>
+            <w:tcW w:w="1134" w:type="dxa"/>
             <w:tcMar>
               <w:top w:w="15" w:type="dxa"/>
               <w:left w:w="135" w:type="dxa"/>
@@ -7140,7 +7038,7 @@
         </w:tc>
         <w:tc>
           <w:tcPr>
-            <w:tcW w:w="0" w:type="auto"/>
+            <w:tcW w:w="1814" w:type="dxa"/>
             <w:tcMar>
               <w:top w:w="15" w:type="dxa"/>
               <w:left w:w="135" w:type="dxa"/>
@@ -7185,7 +7083,7 @@
         </w:tc>
         <w:tc>
           <w:tcPr>
-            <w:tcW w:w="0" w:type="auto"/>
+            <w:tcW w:w="1984" w:type="dxa"/>
             <w:tcMar>
               <w:top w:w="15" w:type="dxa"/>
               <w:left w:w="135" w:type="dxa"/>
@@ -7230,9 +7128,12 @@
         </w:tc>
       </w:tr>
       <w:tr>
+        <w:trPr>
+          <w:cantSplit/>
+        </w:trPr>
         <w:tc>
           <w:tcPr>
-            <w:tcW w:w="0" w:type="auto"/>
+            <w:tcW w:w="850" w:type="dxa"/>
             <w:tcMar>
               <w:top w:w="15" w:type="dxa"/>
               <w:left w:w="135" w:type="dxa"/>
@@ -7277,7 +7178,7 @@
         </w:tc>
         <w:tc>
           <w:tcPr>
-            <w:tcW w:w="0" w:type="auto"/>
+            <w:tcW w:w="3118" w:type="dxa"/>
             <w:tcMar>
               <w:top w:w="15" w:type="dxa"/>
               <w:left w:w="135" w:type="dxa"/>
@@ -7322,7 +7223,7 @@
         </w:tc>
         <w:tc>
           <w:tcPr>
-            <w:tcW w:w="0" w:type="auto"/>
+            <w:tcW w:w="1134" w:type="dxa"/>
             <w:tcMar>
               <w:top w:w="15" w:type="dxa"/>
               <w:left w:w="135" w:type="dxa"/>
@@ -7367,7 +7268,7 @@
         </w:tc>
         <w:tc>
           <w:tcPr>
-            <w:tcW w:w="0" w:type="auto"/>
+            <w:tcW w:w="1814" w:type="dxa"/>
             <w:tcMar>
               <w:top w:w="15" w:type="dxa"/>
               <w:left w:w="135" w:type="dxa"/>
@@ -7412,7 +7313,7 @@
         </w:tc>
         <w:tc>
           <w:tcPr>
-            <w:tcW w:w="0" w:type="auto"/>
+            <w:tcW w:w="1984" w:type="dxa"/>
             <w:tcMar>
               <w:top w:w="15" w:type="dxa"/>
               <w:left w:w="135" w:type="dxa"/>
@@ -7457,9 +7358,12 @@
         </w:tc>
       </w:tr>
       <w:tr>
+        <w:trPr>
+          <w:cantSplit/>
+        </w:trPr>
         <w:tc>
           <w:tcPr>
-            <w:tcW w:w="0" w:type="auto"/>
+            <w:tcW w:w="850" w:type="dxa"/>
             <w:tcMar>
               <w:top w:w="15" w:type="dxa"/>
               <w:left w:w="135" w:type="dxa"/>
@@ -7504,7 +7408,7 @@
         </w:tc>
         <w:tc>
           <w:tcPr>
-            <w:tcW w:w="0" w:type="auto"/>
+            <w:tcW w:w="3118" w:type="dxa"/>
             <w:tcMar>
               <w:top w:w="15" w:type="dxa"/>
               <w:left w:w="135" w:type="dxa"/>
@@ -7549,7 +7453,7 @@
         </w:tc>
         <w:tc>
           <w:tcPr>
-            <w:tcW w:w="0" w:type="auto"/>
+            <w:tcW w:w="1134" w:type="dxa"/>
             <w:tcMar>
               <w:top w:w="15" w:type="dxa"/>
               <w:left w:w="135" w:type="dxa"/>
@@ -7594,7 +7498,7 @@
         </w:tc>
         <w:tc>
           <w:tcPr>
-            <w:tcW w:w="0" w:type="auto"/>
+            <w:tcW w:w="1814" w:type="dxa"/>
             <w:tcMar>
               <w:top w:w="15" w:type="dxa"/>
               <w:left w:w="135" w:type="dxa"/>
@@ -7639,7 +7543,7 @@
         </w:tc>
         <w:tc>
           <w:tcPr>
-            <w:tcW w:w="0" w:type="auto"/>
+            <w:tcW w:w="1984" w:type="dxa"/>
             <w:tcMar>
               <w:top w:w="15" w:type="dxa"/>
               <w:left w:w="135" w:type="dxa"/>
@@ -7684,9 +7588,12 @@
         </w:tc>
       </w:tr>
       <w:tr>
+        <w:trPr>
+          <w:cantSplit/>
+        </w:trPr>
         <w:tc>
           <w:tcPr>
-            <w:tcW w:w="0" w:type="auto"/>
+            <w:tcW w:w="850" w:type="dxa"/>
             <w:tcMar>
               <w:top w:w="15" w:type="dxa"/>
               <w:left w:w="135" w:type="dxa"/>
@@ -7731,7 +7638,7 @@
         </w:tc>
         <w:tc>
           <w:tcPr>
-            <w:tcW w:w="0" w:type="auto"/>
+            <w:tcW w:w="3118" w:type="dxa"/>
             <w:tcMar>
               <w:top w:w="15" w:type="dxa"/>
               <w:left w:w="135" w:type="dxa"/>
@@ -7776,7 +7683,7 @@
         </w:tc>
         <w:tc>
           <w:tcPr>
-            <w:tcW w:w="0" w:type="auto"/>
+            <w:tcW w:w="1134" w:type="dxa"/>
             <w:tcMar>
               <w:top w:w="15" w:type="dxa"/>
               <w:left w:w="135" w:type="dxa"/>
@@ -7821,7 +7728,7 @@
         </w:tc>
         <w:tc>
           <w:tcPr>
-            <w:tcW w:w="0" w:type="auto"/>
+            <w:tcW w:w="1814" w:type="dxa"/>
             <w:tcMar>
               <w:top w:w="15" w:type="dxa"/>
               <w:left w:w="135" w:type="dxa"/>
@@ -7866,7 +7773,7 @@
         </w:tc>
         <w:tc>
           <w:tcPr>
-            <w:tcW w:w="0" w:type="auto"/>
+            <w:tcW w:w="1984" w:type="dxa"/>
             <w:tcMar>
               <w:top w:w="15" w:type="dxa"/>
               <w:left w:w="135" w:type="dxa"/>
@@ -7911,9 +7818,12 @@
         </w:tc>
       </w:tr>
       <w:tr>
+        <w:trPr>
+          <w:cantSplit/>
+        </w:trPr>
         <w:tc>
           <w:tcPr>
-            <w:tcW w:w="0" w:type="auto"/>
+            <w:tcW w:w="850" w:type="dxa"/>
             <w:tcMar>
               <w:top w:w="15" w:type="dxa"/>
               <w:left w:w="135" w:type="dxa"/>
@@ -7958,7 +7868,7 @@
         </w:tc>
         <w:tc>
           <w:tcPr>
-            <w:tcW w:w="0" w:type="auto"/>
+            <w:tcW w:w="3118" w:type="dxa"/>
             <w:tcMar>
               <w:top w:w="15" w:type="dxa"/>
               <w:left w:w="135" w:type="dxa"/>
@@ -8003,7 +7913,7 @@
         </w:tc>
         <w:tc>
           <w:tcPr>
-            <w:tcW w:w="0" w:type="auto"/>
+            <w:tcW w:w="1134" w:type="dxa"/>
             <w:tcMar>
               <w:top w:w="15" w:type="dxa"/>
               <w:left w:w="135" w:type="dxa"/>
@@ -8048,7 +7958,7 @@
         </w:tc>
         <w:tc>
           <w:tcPr>
-            <w:tcW w:w="0" w:type="auto"/>
+            <w:tcW w:w="1814" w:type="dxa"/>
             <w:tcMar>
               <w:top w:w="15" w:type="dxa"/>
               <w:left w:w="135" w:type="dxa"/>
@@ -8093,7 +8003,7 @@
         </w:tc>
         <w:tc>
           <w:tcPr>
-            <w:tcW w:w="0" w:type="auto"/>
+            <w:tcW w:w="1984" w:type="dxa"/>
             <w:tcMar>
               <w:top w:w="15" w:type="dxa"/>
               <w:left w:w="135" w:type="dxa"/>
@@ -8138,9 +8048,12 @@
         </w:tc>
       </w:tr>
       <w:tr>
+        <w:trPr>
+          <w:cantSplit/>
+        </w:trPr>
         <w:tc>
           <w:tcPr>
-            <w:tcW w:w="0" w:type="auto"/>
+            <w:tcW w:w="850" w:type="dxa"/>
             <w:tcMar>
               <w:top w:w="15" w:type="dxa"/>
               <w:left w:w="135" w:type="dxa"/>
@@ -8185,7 +8098,7 @@
         </w:tc>
         <w:tc>
           <w:tcPr>
-            <w:tcW w:w="0" w:type="auto"/>
+            <w:tcW w:w="3118" w:type="dxa"/>
             <w:tcMar>
               <w:top w:w="15" w:type="dxa"/>
               <w:left w:w="135" w:type="dxa"/>
@@ -8230,7 +8143,7 @@
         </w:tc>
         <w:tc>
           <w:tcPr>
-            <w:tcW w:w="0" w:type="auto"/>
+            <w:tcW w:w="1134" w:type="dxa"/>
             <w:tcMar>
               <w:top w:w="15" w:type="dxa"/>
               <w:left w:w="135" w:type="dxa"/>
@@ -8275,7 +8188,7 @@
         </w:tc>
         <w:tc>
           <w:tcPr>
-            <w:tcW w:w="0" w:type="auto"/>
+            <w:tcW w:w="1814" w:type="dxa"/>
             <w:tcMar>
               <w:top w:w="15" w:type="dxa"/>
               <w:left w:w="135" w:type="dxa"/>
@@ -8320,7 +8233,7 @@
         </w:tc>
         <w:tc>
           <w:tcPr>
-            <w:tcW w:w="0" w:type="auto"/>
+            <w:tcW w:w="1984" w:type="dxa"/>
             <w:tcMar>
               <w:top w:w="15" w:type="dxa"/>
               <w:left w:w="135" w:type="dxa"/>
@@ -8365,9 +8278,12 @@
         </w:tc>
       </w:tr>
       <w:tr>
+        <w:trPr>
+          <w:cantSplit/>
+        </w:trPr>
         <w:tc>
           <w:tcPr>
-            <w:tcW w:w="0" w:type="auto"/>
+            <w:tcW w:w="850" w:type="dxa"/>
             <w:tcMar>
               <w:top w:w="15" w:type="dxa"/>
               <w:left w:w="135" w:type="dxa"/>
@@ -8412,7 +8328,7 @@
         </w:tc>
         <w:tc>
           <w:tcPr>
-            <w:tcW w:w="0" w:type="auto"/>
+            <w:tcW w:w="3118" w:type="dxa"/>
             <w:tcMar>
               <w:top w:w="15" w:type="dxa"/>
               <w:left w:w="135" w:type="dxa"/>
@@ -8457,7 +8373,7 @@
         </w:tc>
         <w:tc>
           <w:tcPr>
-            <w:tcW w:w="0" w:type="auto"/>
+            <w:tcW w:w="1134" w:type="dxa"/>
             <w:tcMar>
               <w:top w:w="15" w:type="dxa"/>
               <w:left w:w="135" w:type="dxa"/>
@@ -8502,7 +8418,7 @@
         </w:tc>
         <w:tc>
           <w:tcPr>
-            <w:tcW w:w="0" w:type="auto"/>
+            <w:tcW w:w="1814" w:type="dxa"/>
             <w:tcMar>
               <w:top w:w="15" w:type="dxa"/>
               <w:left w:w="135" w:type="dxa"/>
@@ -8547,7 +8463,7 @@
         </w:tc>
         <w:tc>
           <w:tcPr>
-            <w:tcW w:w="0" w:type="auto"/>
+            <w:tcW w:w="1984" w:type="dxa"/>
             <w:tcMar>
               <w:top w:w="15" w:type="dxa"/>
               <w:left w:w="135" w:type="dxa"/>
@@ -8592,9 +8508,12 @@
         </w:tc>
       </w:tr>
       <w:tr>
+        <w:trPr>
+          <w:cantSplit/>
+        </w:trPr>
         <w:tc>
           <w:tcPr>
-            <w:tcW w:w="0" w:type="auto"/>
+            <w:tcW w:w="850" w:type="dxa"/>
             <w:tcMar>
               <w:top w:w="15" w:type="dxa"/>
               <w:left w:w="135" w:type="dxa"/>
@@ -8639,7 +8558,7 @@
         </w:tc>
         <w:tc>
           <w:tcPr>
-            <w:tcW w:w="0" w:type="auto"/>
+            <w:tcW w:w="3118" w:type="dxa"/>
             <w:tcMar>
               <w:top w:w="15" w:type="dxa"/>
               <w:left w:w="135" w:type="dxa"/>
@@ -8684,7 +8603,7 @@
         </w:tc>
         <w:tc>
           <w:tcPr>
-            <w:tcW w:w="0" w:type="auto"/>
+            <w:tcW w:w="1134" w:type="dxa"/>
             <w:tcMar>
               <w:top w:w="15" w:type="dxa"/>
               <w:left w:w="135" w:type="dxa"/>
@@ -8729,7 +8648,7 @@
         </w:tc>
         <w:tc>
           <w:tcPr>
-            <w:tcW w:w="0" w:type="auto"/>
+            <w:tcW w:w="1814" w:type="dxa"/>
             <w:tcMar>
               <w:top w:w="15" w:type="dxa"/>
               <w:left w:w="135" w:type="dxa"/>
@@ -8774,7 +8693,7 @@
         </w:tc>
         <w:tc>
           <w:tcPr>
-            <w:tcW w:w="0" w:type="auto"/>
+            <w:tcW w:w="1984" w:type="dxa"/>
             <w:tcMar>
               <w:top w:w="15" w:type="dxa"/>
               <w:left w:w="135" w:type="dxa"/>
@@ -8819,9 +8738,12 @@
         </w:tc>
       </w:tr>
       <w:tr>
+        <w:trPr>
+          <w:cantSplit/>
+        </w:trPr>
         <w:tc>
           <w:tcPr>
-            <w:tcW w:w="0" w:type="auto"/>
+            <w:tcW w:w="850" w:type="dxa"/>
             <w:tcMar>
               <w:top w:w="15" w:type="dxa"/>
               <w:left w:w="135" w:type="dxa"/>
@@ -8865,7 +8787,7 @@
         </w:tc>
         <w:tc>
           <w:tcPr>
-            <w:tcW w:w="0" w:type="auto"/>
+            <w:tcW w:w="3118" w:type="dxa"/>
             <w:tcMar>
               <w:top w:w="15" w:type="dxa"/>
               <w:left w:w="135" w:type="dxa"/>
@@ -8909,7 +8831,7 @@
         </w:tc>
         <w:tc>
           <w:tcPr>
-            <w:tcW w:w="0" w:type="auto"/>
+            <w:tcW w:w="1134" w:type="dxa"/>
             <w:tcMar>
               <w:top w:w="15" w:type="dxa"/>
               <w:left w:w="135" w:type="dxa"/>
@@ -8953,7 +8875,7 @@
         </w:tc>
         <w:tc>
           <w:tcPr>
-            <w:tcW w:w="0" w:type="auto"/>
+            <w:tcW w:w="1814" w:type="dxa"/>
             <w:tcMar>
               <w:top w:w="15" w:type="dxa"/>
               <w:left w:w="135" w:type="dxa"/>
@@ -8997,7 +8919,7 @@
         </w:tc>
         <w:tc>
           <w:tcPr>
-            <w:tcW w:w="0" w:type="auto"/>
+            <w:tcW w:w="1984" w:type="dxa"/>
             <w:tcMar>
               <w:top w:w="15" w:type="dxa"/>
               <w:left w:w="135" w:type="dxa"/>
@@ -9043,33 +8965,8 @@
     </w:tbl>
     <w:p>
       <w:pPr>
-        <w:spacing w:before="90" w:after="90" w:line="324" w:lineRule="atLeast"/>
-        <w:ind w:left="540"/>
-        <w:jc w:val="center"/>
-        <w:rPr>
-          <w:rFonts w:ascii="-webkit-standard" w:eastAsiaTheme="minorEastAsia" w:hAnsi="-webkit-standard"/>
-          <w:bCs w:val="0"/>
-          <w:color w:val="000000"/>
-          <w:sz w:val="27"/>
-          <w:szCs w:val="27"/>
-          <w:lang w:val="vi-VN" w:eastAsia="vi-VN"/>
-        </w:rPr>
-      </w:pPr>
-      <w:r>
-        <w:rPr>
-          <w:rFonts w:ascii="Times New Roman" w:eastAsiaTheme="minorEastAsia" w:hAnsi="Times New Roman"/>
-          <w:b/>
-          <w:color w:val="000000"/>
-          <w:sz w:val="14"/>
-          <w:szCs w:val="14"/>
-          <w:lang w:val="vi-VN" w:eastAsia="vi-VN"/>
-        </w:rPr>
-        <w:t> </w:t>
-      </w:r>
-    </w:p>
-    <w:p>
-      <w:pPr>
         <w:pStyle w:val="p1"/>
+        <w:keepNext/>
         <w:spacing w:before="120" w:beforeAutospacing="0" w:after="60" w:afterAutospacing="0" w:line="288" w:lineRule="auto"/>
         <w:ind w:firstLine="0"/>
         <w:jc w:val="left"/>
@@ -9112,6 +9009,7 @@
     </w:p>
     <w:p>
       <w:pPr>
+        <w:keepNext/>
         <w:spacing w:before="120" w:beforeAutospacing="1" w:after="60" w:afterAutospacing="1" w:line="288" w:lineRule="auto"/>
         <w:ind w:firstLine="0"/>
         <w:jc w:val="left"/>
@@ -9174,7 +9072,7 @@
     </w:p>
     <w:p>
       <w:pPr>
-        <w:spacing w:before="0" w:beforeAutospacing="1" w:after="60" w:afterAutospacing="1" w:line="288" w:lineRule="auto"/>
+        <w:spacing w:before="0" w:beforeAutospacing="1" w:after="40" w:afterAutospacing="1" w:line="288" w:lineRule="auto"/>
         <w:ind w:firstLine="720"/>
         <w:jc w:val="both"/>
         <w:rPr>
@@ -9285,7 +9183,7 @@
     </w:p>
     <w:p>
       <w:pPr>
-        <w:spacing w:before="0" w:beforeAutospacing="1" w:after="60" w:afterAutospacing="1" w:line="288" w:lineRule="auto"/>
+        <w:spacing w:before="0" w:beforeAutospacing="1" w:after="40" w:afterAutospacing="1" w:line="288" w:lineRule="auto"/>
         <w:ind w:firstLine="720"/>
         <w:jc w:val="both"/>
         <w:rPr>
@@ -9360,7 +9258,7 @@
     <w:p>
       <w:pPr>
         <w:pStyle w:val="p1"/>
-        <w:spacing w:before="0" w:after="60" w:line="288" w:lineRule="auto"/>
+        <w:spacing w:before="0" w:after="40" w:line="288" w:lineRule="auto"/>
         <w:ind w:firstLine="720"/>
         <w:jc w:val="both"/>
         <w:rPr>
@@ -9421,7 +9319,7 @@
     </w:p>
     <w:p>
       <w:pPr>
-        <w:spacing w:before="0" w:beforeAutospacing="1" w:after="60" w:afterAutospacing="1" w:line="288" w:lineRule="auto"/>
+        <w:spacing w:before="0" w:beforeAutospacing="1" w:after="40" w:afterAutospacing="1" w:line="288" w:lineRule="auto"/>
         <w:ind w:firstLine="720"/>
         <w:jc w:val="both"/>
         <w:rPr>
@@ -9471,6 +9369,7 @@
     </w:p>
     <w:p>
       <w:pPr>
+        <w:keepNext/>
         <w:spacing w:before="120" w:after="60" w:line="288" w:lineRule="auto"/>
         <w:ind w:firstLine="0"/>
         <w:jc w:val="left"/>
@@ -9561,7 +9460,7 @@
     </w:p>
     <w:p>
       <w:pPr>
-        <w:spacing w:before="0" w:beforeAutospacing="1" w:after="60" w:afterAutospacing="1" w:line="288" w:lineRule="auto"/>
+        <w:spacing w:before="0" w:beforeAutospacing="1" w:after="40" w:afterAutospacing="1" w:line="288" w:lineRule="auto"/>
         <w:ind w:firstLine="720"/>
         <w:jc w:val="both"/>
         <w:rPr>
@@ -9584,7 +9483,7 @@
     </w:p>
     <w:p>
       <w:pPr>
-        <w:spacing w:before="0" w:beforeAutospacing="1" w:after="60" w:afterAutospacing="1" w:line="288" w:lineRule="auto"/>
+        <w:spacing w:before="0" w:beforeAutospacing="1" w:after="40" w:afterAutospacing="1" w:line="288" w:lineRule="auto"/>
         <w:ind w:firstLine="720"/>
         <w:jc w:val="both"/>
         <w:rPr>
@@ -9658,7 +9557,7 @@
     <w:p>
       <w:pPr>
         <w:pStyle w:val="p1"/>
-        <w:spacing w:before="0" w:after="60" w:line="288" w:lineRule="auto"/>
+        <w:spacing w:before="0" w:after="40" w:line="288" w:lineRule="auto"/>
         <w:ind w:firstLine="720"/>
         <w:jc w:val="both"/>
         <w:rPr>
@@ -9804,7 +9703,7 @@
     </w:p>
     <w:p>
       <w:pPr>
-        <w:spacing w:before="0" w:beforeAutospacing="1" w:after="60" w:afterAutospacing="1" w:line="288" w:lineRule="auto"/>
+        <w:spacing w:before="0" w:beforeAutospacing="1" w:after="40" w:afterAutospacing="1" w:line="288" w:lineRule="auto"/>
         <w:ind w:firstLine="720"/>
         <w:jc w:val="both"/>
         <w:rPr>
@@ -9827,7 +9726,7 @@
     </w:p>
     <w:p>
       <w:pPr>
-        <w:spacing w:before="0" w:beforeAutospacing="1" w:after="60" w:afterAutospacing="1" w:line="288" w:lineRule="auto"/>
+        <w:spacing w:before="0" w:beforeAutospacing="1" w:after="40" w:afterAutospacing="1" w:line="288" w:lineRule="auto"/>
         <w:ind w:firstLine="720"/>
         <w:jc w:val="both"/>
         <w:rPr>
@@ -9850,7 +9749,7 @@
     </w:p>
     <w:p>
       <w:pPr>
-        <w:spacing w:before="0" w:beforeAutospacing="1" w:after="60" w:afterAutospacing="1" w:line="288" w:lineRule="auto"/>
+        <w:spacing w:before="0" w:beforeAutospacing="1" w:after="40" w:afterAutospacing="1" w:line="288" w:lineRule="auto"/>
         <w:ind w:firstLine="720"/>
         <w:jc w:val="both"/>
         <w:rPr>
@@ -9873,7 +9772,7 @@
     </w:p>
     <w:p>
       <w:pPr>
-        <w:spacing w:before="0" w:beforeAutospacing="1" w:after="60" w:afterAutospacing="1" w:line="288" w:lineRule="auto"/>
+        <w:spacing w:before="0" w:beforeAutospacing="1" w:after="40" w:afterAutospacing="1" w:line="288" w:lineRule="auto"/>
         <w:ind w:firstLine="720"/>
         <w:jc w:val="both"/>
         <w:rPr>
@@ -9896,7 +9795,7 @@
     </w:p>
     <w:p>
       <w:pPr>
-        <w:spacing w:before="0" w:beforeAutospacing="1" w:after="60" w:afterAutospacing="1" w:line="288" w:lineRule="auto"/>
+        <w:spacing w:before="0" w:beforeAutospacing="1" w:after="40" w:afterAutospacing="1" w:line="288" w:lineRule="auto"/>
         <w:ind w:firstLine="720"/>
         <w:jc w:val="both"/>
         <w:rPr>
@@ -9919,7 +9818,7 @@
     </w:p>
     <w:p>
       <w:pPr>
-        <w:spacing w:before="0" w:beforeAutospacing="1" w:after="60" w:afterAutospacing="1" w:line="288" w:lineRule="auto"/>
+        <w:spacing w:before="0" w:beforeAutospacing="1" w:after="40" w:afterAutospacing="1" w:line="288" w:lineRule="auto"/>
         <w:ind w:firstLine="720"/>
         <w:jc w:val="both"/>
         <w:rPr>
@@ -9971,7 +9870,7 @@
     </w:p>
     <w:p>
       <w:pPr>
-        <w:spacing w:before="0" w:beforeAutospacing="1" w:after="60" w:afterAutospacing="1" w:line="288" w:lineRule="auto"/>
+        <w:spacing w:before="0" w:beforeAutospacing="1" w:after="40" w:afterAutospacing="1" w:line="288" w:lineRule="auto"/>
         <w:ind w:firstLine="720"/>
         <w:jc w:val="both"/>
         <w:rPr>
@@ -10028,7 +9927,7 @@
     </w:p>
     <w:p>
       <w:pPr>
-        <w:spacing w:before="0" w:beforeAutospacing="1" w:after="60" w:afterAutospacing="1" w:line="288" w:lineRule="auto"/>
+        <w:spacing w:before="0" w:beforeAutospacing="1" w:after="40" w:afterAutospacing="1" w:line="288" w:lineRule="auto"/>
         <w:ind w:firstLine="720"/>
         <w:jc w:val="both"/>
         <w:rPr>
@@ -10061,7 +9960,7 @@
     </w:p>
     <w:p>
       <w:pPr>
-        <w:spacing w:before="0" w:beforeAutospacing="1" w:after="60" w:afterAutospacing="1" w:line="288" w:lineRule="auto"/>
+        <w:spacing w:before="0" w:beforeAutospacing="1" w:after="40" w:afterAutospacing="1" w:line="288" w:lineRule="auto"/>
         <w:ind w:firstLine="720"/>
         <w:jc w:val="both"/>
         <w:rPr>
@@ -10094,7 +9993,7 @@
     </w:p>
     <w:p>
       <w:pPr>
-        <w:spacing w:before="0" w:beforeAutospacing="1" w:after="60" w:afterAutospacing="1" w:line="288" w:lineRule="auto"/>
+        <w:spacing w:before="0" w:beforeAutospacing="1" w:after="40" w:afterAutospacing="1" w:line="288" w:lineRule="auto"/>
         <w:ind w:firstLine="720"/>
         <w:jc w:val="both"/>
         <w:rPr>
@@ -10117,6 +10016,7 @@
     </w:p>
     <w:p>
       <w:pPr>
+        <w:keepNext/>
         <w:spacing w:before="120" w:after="60" w:line="288" w:lineRule="auto"/>
         <w:ind w:firstLine="0"/>
         <w:jc w:val="left"/>
@@ -10168,6 +10068,7 @@
     </w:p>
     <w:p>
       <w:pPr>
+        <w:keepNext/>
         <w:spacing w:before="120" w:beforeAutospacing="1" w:after="60" w:afterAutospacing="1" w:line="288" w:lineRule="auto"/>
         <w:ind w:firstLine="0"/>
         <w:jc w:val="left"/>
@@ -10195,7 +10096,7 @@
     </w:p>
     <w:p>
       <w:pPr>
-        <w:spacing w:before="0" w:beforeAutospacing="1" w:after="60" w:afterAutospacing="1" w:line="288" w:lineRule="auto"/>
+        <w:spacing w:before="0" w:beforeAutospacing="1" w:after="40" w:afterAutospacing="1" w:line="288" w:lineRule="auto"/>
         <w:ind w:firstLine="720"/>
         <w:jc w:val="both"/>
         <w:rPr>
@@ -10269,7 +10170,7 @@
     </w:p>
     <w:p>
       <w:pPr>
-        <w:spacing w:before="0" w:beforeAutospacing="1" w:after="60" w:afterAutospacing="1" w:line="288" w:lineRule="auto"/>
+        <w:spacing w:before="0" w:beforeAutospacing="1" w:after="40" w:afterAutospacing="1" w:line="288" w:lineRule="auto"/>
         <w:ind w:firstLine="720"/>
         <w:jc w:val="both"/>
         <w:rPr>
@@ -10331,7 +10232,7 @@
     </w:p>
     <w:p>
       <w:pPr>
-        <w:spacing w:before="0" w:beforeAutospacing="1" w:after="60" w:afterAutospacing="1" w:line="288" w:lineRule="auto"/>
+        <w:spacing w:before="0" w:beforeAutospacing="1" w:after="40" w:afterAutospacing="1" w:line="288" w:lineRule="auto"/>
         <w:ind w:firstLine="720"/>
         <w:jc w:val="both"/>
         <w:rPr>
@@ -10357,6 +10258,7 @@
     </w:p>
     <w:p>
       <w:pPr>
+        <w:keepNext/>
         <w:spacing w:before="120" w:beforeAutospacing="1" w:after="60" w:afterAutospacing="1" w:line="288" w:lineRule="auto"/>
         <w:ind w:firstLine="0"/>
         <w:jc w:val="left"/>
@@ -10384,7 +10286,7 @@
     </w:p>
     <w:p>
       <w:pPr>
-        <w:spacing w:before="0" w:beforeAutospacing="1" w:after="60" w:afterAutospacing="1" w:line="288" w:lineRule="auto"/>
+        <w:spacing w:before="0" w:beforeAutospacing="1" w:after="40" w:afterAutospacing="1" w:line="288" w:lineRule="auto"/>
         <w:ind w:firstLine="720"/>
         <w:jc w:val="both"/>
         <w:rPr>
@@ -10423,7 +10325,7 @@
     </w:p>
     <w:p>
       <w:pPr>
-        <w:spacing w:before="0" w:beforeAutospacing="1" w:after="60" w:afterAutospacing="1" w:line="288" w:lineRule="auto"/>
+        <w:spacing w:before="0" w:beforeAutospacing="1" w:after="40" w:afterAutospacing="1" w:line="288" w:lineRule="auto"/>
         <w:ind w:firstLine="720"/>
         <w:jc w:val="both"/>
         <w:rPr>
@@ -10449,7 +10351,7 @@
     </w:p>
     <w:p>
       <w:pPr>
-        <w:spacing w:before="0" w:beforeAutospacing="1" w:after="60" w:afterAutospacing="1" w:line="288" w:lineRule="auto"/>
+        <w:spacing w:before="0" w:beforeAutospacing="1" w:after="40" w:afterAutospacing="1" w:line="288" w:lineRule="auto"/>
         <w:ind w:firstLine="720"/>
         <w:jc w:val="both"/>
         <w:rPr>
@@ -10494,7 +10396,7 @@
     </w:p>
     <w:p>
       <w:pPr>
-        <w:spacing w:before="0" w:beforeAutospacing="1" w:after="60" w:afterAutospacing="1" w:line="288" w:lineRule="auto"/>
+        <w:spacing w:before="0" w:beforeAutospacing="1" w:after="40" w:afterAutospacing="1" w:line="288" w:lineRule="auto"/>
         <w:ind w:firstLine="720"/>
         <w:jc w:val="both"/>
         <w:rPr>
@@ -10517,6 +10419,7 @@
     </w:p>
     <w:p>
       <w:pPr>
+        <w:keepNext/>
         <w:spacing w:before="120" w:after="60" w:line="288" w:lineRule="auto"/>
         <w:ind w:firstLine="0"/>
         <w:jc w:val="left"/>
@@ -10552,7 +10455,7 @@
     </w:p>
     <w:p>
       <w:pPr>
-        <w:spacing w:before="0" w:beforeAutospacing="1" w:after="60" w:afterAutospacing="1" w:line="288" w:lineRule="auto"/>
+        <w:spacing w:before="0" w:beforeAutospacing="1" w:after="40" w:afterAutospacing="1" w:line="288" w:lineRule="auto"/>
         <w:ind w:firstLine="720"/>
         <w:jc w:val="both"/>
         <w:rPr>
@@ -10619,7 +10522,7 @@
     </w:p>
     <w:p>
       <w:pPr>
-        <w:spacing w:before="0" w:beforeAutospacing="1" w:after="60" w:afterAutospacing="1" w:line="288" w:lineRule="auto"/>
+        <w:spacing w:before="0" w:beforeAutospacing="1" w:after="40" w:afterAutospacing="1" w:line="288" w:lineRule="auto"/>
         <w:ind w:firstLine="720"/>
         <w:jc w:val="both"/>
         <w:rPr>
@@ -10642,7 +10545,7 @@
     </w:p>
     <w:p>
       <w:pPr>
-        <w:spacing w:before="0" w:beforeAutospacing="1" w:after="60" w:afterAutospacing="1" w:line="288" w:lineRule="auto"/>
+        <w:spacing w:before="0" w:beforeAutospacing="1" w:after="40" w:afterAutospacing="1" w:line="288" w:lineRule="auto"/>
         <w:ind w:firstLine="720"/>
         <w:jc w:val="both"/>
         <w:rPr>
@@ -10686,7 +10589,7 @@
     </w:p>
     <w:p>
       <w:pPr>
-        <w:spacing w:before="0" w:beforeAutospacing="1" w:after="60" w:afterAutospacing="1" w:line="288" w:lineRule="auto"/>
+        <w:spacing w:before="0" w:beforeAutospacing="1" w:after="40" w:afterAutospacing="1" w:line="288" w:lineRule="auto"/>
         <w:ind w:firstLine="720"/>
         <w:jc w:val="both"/>
         <w:rPr>
@@ -10706,17 +10609,6 @@
         </w:rPr>
         <w:t>Kết quả áp dụng bước đầu cho thấy sáng kiến góp phần nâng cao khả năng kiểm soát bệnh phẩm, rút ngắn thời gian tìm kiếm, truy xuất thông tin và hỗ trợ kiểm soát chất lượng xét nghiệm giải phẫu bệnh.</w:t>
       </w:r>
-    </w:p>
-    <w:p>
-      <w:pPr>
-        <w:spacing w:before="60"/>
-        <w:ind w:firstLine="720"/>
-        <w:rPr>
-          <w:rFonts w:asciiTheme="majorHAnsi" w:hAnsiTheme="majorHAnsi" w:cstheme="majorHAnsi"/>
-          <w:bCs w:val="0"/>
-          <w:lang w:val="vi-VN"/>
-        </w:rPr>
-      </w:pPr>
     </w:p>
     <w:p>
       <w:pPr>
@@ -11030,24 +10922,6 @@
         </w:tc>
       </w:tr>
     </w:tbl>
-    <w:p>
-      <w:pPr>
-        <w:jc w:val="both"/>
-        <w:rPr>
-          <w:rFonts w:ascii="Times New Roman" w:hAnsi="Times New Roman"/>
-          <w:i/>
-        </w:rPr>
-      </w:pPr>
-    </w:p>
-    <w:p>
-      <w:pPr>
-        <w:jc w:val="right"/>
-        <w:rPr>
-          <w:rFonts w:ascii="Times New Roman" w:hAnsi="Times New Roman"/>
-          <w:b/>
-        </w:rPr>
-      </w:pPr>
-    </w:p>
     <w:sectPr>
       <w:headerReference w:type="default" r:id="rId8"/>
       <w:footerReference w:type="default" r:id="rId9"/>

</xml_diff>

<commit_message>
fix(report): fix stretched justification on step headings in section 2.3.4
</commit_message>
<xml_diff>
--- a/docs/report/M7_Thuyet_minh_Cong_trinh_ChuanHoa.docx
+++ b/docs/report/M7_Thuyet_minh_Cong_trinh_ChuanHoa.docx
@@ -6064,9 +6064,48 @@
     </w:p>
     <w:p>
       <w:pPr>
-        <w:spacing w:before="0" w:beforeAutospacing="1" w:after="40" w:afterAutospacing="1" w:line="288" w:lineRule="auto"/>
+        <w:keepNext/>
+        <w:spacing w:before="80" w:beforeAutospacing="1" w:after="40" w:afterAutospacing="1" w:line="288" w:lineRule="auto"/>
+        <w:ind w:firstLine="720"/>
+        <w:jc w:val="left"/>
+        <w:rPr>
+          <w:rFonts w:asciiTheme="majorHAnsi" w:eastAsiaTheme="minorEastAsia" w:hAnsiTheme="majorHAnsi" w:cstheme="majorHAnsi"/>
+          <w:bCs w:val="0"/>
+          <w:lang w:val="vi-VN" w:eastAsia="vi-VN"/>
+        </w:rPr>
+      </w:pPr>
+      <w:r>
+        <w:rPr>
+          <w:rFonts w:ascii="Times New Roman" w:hAnsi="Times New Roman" w:cs="Times New Roman" w:eastAsia="Times New Roman"/>
+          <w:b/>
+          <w:i w:val="0"/>
+          <w:sz w:val="26"/>
+        </w:rPr>
+        <w:t>Bước 1. Tiếp nhận và đối chiếu bệnh phẩm</w:t>
+      </w:r>
+    </w:p>
+    <w:p>
+      <w:pPr>
+        <w:spacing w:before="0" w:after="40" w:line="288" w:lineRule="auto"/>
         <w:ind w:firstLine="720"/>
         <w:jc w:val="both"/>
+      </w:pPr>
+      <w:r>
+        <w:rPr>
+          <w:rFonts w:ascii="Times New Roman" w:hAnsi="Times New Roman" w:cs="Times New Roman" w:eastAsia="Times New Roman"/>
+          <w:b w:val="0"/>
+          <w:i w:val="0"/>
+          <w:sz w:val="26"/>
+        </w:rPr>
+        <w:t>Người nhận tiếp nhận bệnh phẩm từ người giao; đối chiếu thông tin giữa LIS, phiếu chỉ định, nhãn trên dụng cụ chứa và bệnh phẩm; kiểm tra số lượng lọ, tình trạng lọ chứa và các bất thường có thể nhận biết tại thời điểm giao nhận. Nếu phát hiện thông tin không thống nhất hoặc bệnh phẩm không bảo đảm yêu cầu, người nhận ghi nhận và xử lý theo quy định của đơn vị trước khi thực hiện các bước tiếp theo.</w:t>
+      </w:r>
+    </w:p>
+    <w:p>
+      <w:pPr>
+        <w:keepNext/>
+        <w:spacing w:before="80" w:beforeAutospacing="1" w:after="40" w:afterAutospacing="1" w:line="288" w:lineRule="auto"/>
+        <w:ind w:firstLine="720"/>
+        <w:jc w:val="left"/>
         <w:rPr>
           <w:rFonts w:asciiTheme="majorHAnsi" w:eastAsiaTheme="minorEastAsia" w:hAnsiTheme="majorHAnsi" w:cstheme="majorHAnsi"/>
           <w:bCs w:val="0"/>
@@ -6075,34 +6114,36 @@
       </w:pPr>
       <w:r>
         <w:rPr>
-          <w:rFonts w:asciiTheme="majorHAnsi" w:eastAsiaTheme="minorEastAsia" w:hAnsiTheme="majorHAnsi" w:cstheme="majorHAnsi" w:ascii="Times New Roman" w:hAnsi="Times New Roman" w:cs="Times New Roman" w:eastAsia="Times New Roman"/>
-          <w:b w:val="0"/>
-          <w:bCs w:val="0"/>
-          <w:i w:val="0"/>
-          <w:sz w:val="26"/>
-          <w:lang w:val="vi-VN" w:eastAsia="vi-VN"/>
-        </w:rPr>
-        <w:lastRenderedPageBreak/>
-        <w:t>Bước 1. Tiếp nhận và đối chiếu bệnh phẩm</w:t>
-      </w:r>
-      <w:r>
-        <w:rPr>
-          <w:rFonts w:asciiTheme="majorHAnsi" w:eastAsiaTheme="minorEastAsia" w:hAnsiTheme="majorHAnsi" w:cstheme="majorHAnsi" w:ascii="Times New Roman" w:hAnsi="Times New Roman" w:cs="Times New Roman" w:eastAsia="Times New Roman"/>
-          <w:b w:val="0"/>
-          <w:bCs w:val="0"/>
-          <w:i w:val="0"/>
-          <w:sz w:val="26"/>
-          <w:lang w:val="vi-VN" w:eastAsia="vi-VN"/>
-        </w:rPr>
-        <w:br/>
-        <w:t>Người nhận tiếp nhận bệnh phẩm từ người giao; đối chiếu thông tin giữa LIS, phiếu chỉ định, nhãn trên dụng cụ chứa và bệnh phẩm; kiểm tra số lượng lọ, tình trạng lọ chứa và các bất thường có thể nhận biết tại thời điểm giao nhận. Nếu phát hiện thông tin không thống nhất hoặc bệnh phẩm không bảo đảm yêu cầu, người nhận ghi nhận và xử lý theo quy định của đơn vị trước khi thực hiện các bước tiếp theo.</w:t>
-      </w:r>
-    </w:p>
-    <w:p>
-      <w:pPr>
-        <w:spacing w:before="0" w:beforeAutospacing="1" w:after="40" w:afterAutospacing="1" w:line="288" w:lineRule="auto"/>
+          <w:rFonts w:ascii="Times New Roman" w:hAnsi="Times New Roman" w:cs="Times New Roman" w:eastAsia="Times New Roman"/>
+          <w:b/>
+          <w:i w:val="0"/>
+          <w:sz w:val="26"/>
+        </w:rPr>
+        <w:t>Bước 2. Ghi nhận thông tin giao nhận</w:t>
+      </w:r>
+    </w:p>
+    <w:p>
+      <w:pPr>
+        <w:spacing w:before="0" w:after="40" w:line="288" w:lineRule="auto"/>
         <w:ind w:firstLine="720"/>
         <w:jc w:val="both"/>
+      </w:pPr>
+      <w:r>
+        <w:rPr>
+          <w:rFonts w:ascii="Times New Roman" w:hAnsi="Times New Roman" w:cs="Times New Roman" w:eastAsia="Times New Roman"/>
+          <w:b w:val="0"/>
+          <w:i w:val="0"/>
+          <w:sz w:val="26"/>
+        </w:rPr>
+        <w:t>Người nhận đối chiếu với người giao và nhập trên phần mềm các thông tin gồm người giao, khoa gửi, người nhận, thời gian giao nhận, số lượng lọ, tình trạng lọ chứa và bất thường được phát hiện; kiểm tra tính chính xác trước khi xác nhận lưu.</w:t>
+      </w:r>
+    </w:p>
+    <w:p>
+      <w:pPr>
+        <w:keepNext/>
+        <w:spacing w:before="80" w:beforeAutospacing="1" w:after="40" w:afterAutospacing="1" w:line="288" w:lineRule="auto"/>
+        <w:ind w:firstLine="720"/>
+        <w:jc w:val="left"/>
         <w:rPr>
           <w:rFonts w:asciiTheme="majorHAnsi" w:eastAsiaTheme="minorEastAsia" w:hAnsiTheme="majorHAnsi" w:cstheme="majorHAnsi"/>
           <w:bCs w:val="0"/>
@@ -6111,101 +6152,76 @@
       </w:pPr>
       <w:r>
         <w:rPr>
-          <w:rFonts w:asciiTheme="majorHAnsi" w:eastAsiaTheme="minorEastAsia" w:hAnsiTheme="majorHAnsi" w:cstheme="majorHAnsi" w:ascii="Times New Roman" w:hAnsi="Times New Roman" w:cs="Times New Roman" w:eastAsia="Times New Roman"/>
-          <w:b w:val="0"/>
-          <w:bCs w:val="0"/>
-          <w:i w:val="0"/>
-          <w:sz w:val="26"/>
-          <w:lang w:val="vi-VN" w:eastAsia="vi-VN"/>
-        </w:rPr>
-        <w:t>Bước 2. Ghi nhận thông tin giao nhận</w:t>
-      </w:r>
-      <w:r>
-        <w:rPr>
-          <w:rFonts w:asciiTheme="majorHAnsi" w:eastAsiaTheme="minorEastAsia" w:hAnsiTheme="majorHAnsi" w:cstheme="majorHAnsi" w:ascii="Times New Roman" w:hAnsi="Times New Roman" w:cs="Times New Roman" w:eastAsia="Times New Roman"/>
-          <w:b w:val="0"/>
-          <w:bCs w:val="0"/>
-          <w:i w:val="0"/>
-          <w:sz w:val="26"/>
-          <w:lang w:val="vi-VN" w:eastAsia="vi-VN"/>
-        </w:rPr>
-        <w:br/>
-        <w:t>Người nhận đối chiếu với người giao và nhập trên phần mềm các thông tin gồm người giao, khoa gửi, người nhận, thời gian giao nhận, số lượng lọ, tình trạng lọ chứa và bất thường được phát hiện; kiểm tra tính chính xác trước khi xác nhận lưu.</w:t>
-      </w:r>
-    </w:p>
-    <w:p>
-      <w:pPr>
-        <w:spacing w:before="0" w:beforeAutospacing="1" w:after="40" w:afterAutospacing="1" w:line="288" w:lineRule="auto"/>
+          <w:rFonts w:ascii="Times New Roman" w:hAnsi="Times New Roman" w:cs="Times New Roman" w:eastAsia="Times New Roman"/>
+          <w:b/>
+          <w:i w:val="0"/>
+          <w:sz w:val="26"/>
+        </w:rPr>
+        <w:t>Bước 3. Xác nhận định danh</w:t>
+      </w:r>
+    </w:p>
+    <w:p>
+      <w:pPr>
+        <w:spacing w:before="0" w:after="40" w:line="288" w:lineRule="auto"/>
         <w:ind w:firstLine="720"/>
         <w:jc w:val="both"/>
+      </w:pPr>
+      <w:r>
+        <w:rPr>
+          <w:rFonts w:ascii="Times New Roman" w:hAnsi="Times New Roman" w:cs="Times New Roman" w:eastAsia="Times New Roman"/>
+          <w:b w:val="0"/>
+          <w:i w:val="0"/>
+          <w:sz w:val="26"/>
+        </w:rPr>
+        <w:t>Kiểm tra lại mã định danh trên phần mềm, phiếu chỉ định và nhãn trên dụng cụ chứa, bảo đảm thông tin thống nhất trước khi ghi nhận hình ảnh.</w:t>
+      </w:r>
+    </w:p>
+    <w:p>
+      <w:pPr>
+        <w:keepNext/>
+        <w:spacing w:before="80" w:beforeAutospacing="1" w:after="40" w:afterAutospacing="1" w:line="288" w:lineRule="auto"/>
+        <w:ind w:firstLine="720"/>
+        <w:jc w:val="left"/>
         <w:rPr>
           <w:rFonts w:asciiTheme="majorHAnsi" w:eastAsiaTheme="minorEastAsia" w:hAnsiTheme="majorHAnsi" w:cstheme="majorHAnsi"/>
           <w:bCs w:val="0"/>
-          <w:lang w:val="vi-VN" w:eastAsia="vi-VN"/>
-        </w:rPr>
-      </w:pPr>
-      <w:r>
-        <w:rPr>
-          <w:rFonts w:asciiTheme="majorHAnsi" w:eastAsiaTheme="minorEastAsia" w:hAnsiTheme="majorHAnsi" w:cstheme="majorHAnsi" w:ascii="Times New Roman" w:hAnsi="Times New Roman" w:cs="Times New Roman" w:eastAsia="Times New Roman"/>
-          <w:b w:val="0"/>
-          <w:bCs w:val="0"/>
-          <w:i w:val="0"/>
-          <w:sz w:val="26"/>
-          <w:lang w:val="vi-VN" w:eastAsia="vi-VN"/>
-        </w:rPr>
-        <w:t>Bước 3. Xác nhận định danh</w:t>
-      </w:r>
-      <w:r>
-        <w:rPr>
-          <w:rFonts w:asciiTheme="majorHAnsi" w:eastAsiaTheme="minorEastAsia" w:hAnsiTheme="majorHAnsi" w:cstheme="majorHAnsi" w:ascii="Times New Roman" w:hAnsi="Times New Roman" w:cs="Times New Roman" w:eastAsia="Times New Roman"/>
-          <w:b w:val="0"/>
-          <w:bCs w:val="0"/>
-          <w:i w:val="0"/>
-          <w:sz w:val="26"/>
-          <w:lang w:val="vi-VN" w:eastAsia="vi-VN"/>
-        </w:rPr>
-        <w:br/>
-        <w:t xml:space="preserve">Kiểm tra lại </w:t>
-      </w:r>
-      <w:r>
-        <w:rPr>
-          <w:rFonts w:asciiTheme="majorHAnsi" w:hAnsiTheme="majorHAnsi" w:cstheme="majorHAnsi" w:ascii="Times New Roman" w:hAnsi="Times New Roman" w:cs="Times New Roman" w:eastAsia="Times New Roman"/>
-          <w:b w:val="0"/>
-          <w:bCs w:val="0"/>
-          <w:i w:val="0"/>
-          <w:sz w:val="26"/>
-          <w:lang w:val="vi-VN" w:eastAsia="vi-VN"/>
-        </w:rPr>
-        <w:t>mã định danh</w:t>
-      </w:r>
-      <w:r>
-        <w:rPr>
-          <w:rFonts w:asciiTheme="majorHAnsi" w:eastAsiaTheme="minorEastAsia" w:hAnsiTheme="majorHAnsi" w:cstheme="majorHAnsi" w:ascii="Times New Roman" w:hAnsi="Times New Roman" w:cs="Times New Roman" w:eastAsia="Times New Roman"/>
-          <w:b w:val="0"/>
-          <w:bCs w:val="0"/>
-          <w:i w:val="0"/>
-          <w:sz w:val="26"/>
-          <w:lang w:val="vi-VN" w:eastAsia="vi-VN"/>
-        </w:rPr>
-        <w:t xml:space="preserve"> </w:t>
-      </w:r>
-      <w:r>
-        <w:rPr>
-          <w:rFonts w:asciiTheme="majorHAnsi" w:eastAsiaTheme="minorEastAsia" w:hAnsiTheme="majorHAnsi" w:cstheme="majorHAnsi" w:ascii="Times New Roman" w:hAnsi="Times New Roman" w:cs="Times New Roman" w:eastAsia="Times New Roman"/>
-          <w:b w:val="0"/>
-          <w:bCs w:val="0"/>
-          <w:i w:val="0"/>
-          <w:sz w:val="26"/>
-          <w:lang w:val="vi-VN" w:eastAsia="vi-VN"/>
-        </w:rPr>
-        <w:t>trên phần mềm, phiếu chỉ định và nhãn trên dụng cụ chứa, bảo đảm thông tin thống nhất trước khi ghi nhận hình ảnh.</w:t>
-      </w:r>
-    </w:p>
-    <w:p>
-      <w:pPr>
-        <w:spacing w:before="0" w:beforeAutospacing="1" w:after="40" w:afterAutospacing="1" w:line="288" w:lineRule="auto"/>
+          <w:sz w:val="26"/>
+          <w:szCs w:val="26"/>
+          <w:lang w:val="vi-VN" w:eastAsia="vi-VN"/>
+        </w:rPr>
+      </w:pPr>
+      <w:r>
+        <w:rPr>
+          <w:rFonts w:ascii="Times New Roman" w:hAnsi="Times New Roman" w:cs="Times New Roman" w:eastAsia="Times New Roman"/>
+          <w:b/>
+          <w:i w:val="0"/>
+          <w:sz w:val="26"/>
+        </w:rPr>
+        <w:t>Bước 4. Đặt bệnh phẩm và kiểm tra trường ảnh</w:t>
+      </w:r>
+    </w:p>
+    <w:p>
+      <w:pPr>
+        <w:spacing w:before="0" w:after="40" w:line="288" w:lineRule="auto"/>
         <w:ind w:firstLine="720"/>
         <w:jc w:val="both"/>
+      </w:pPr>
+      <w:r>
+        <w:rPr>
+          <w:rFonts w:ascii="Times New Roman" w:hAnsi="Times New Roman" w:cs="Times New Roman" w:eastAsia="Times New Roman"/>
+          <w:b w:val="0"/>
+          <w:i w:val="0"/>
+          <w:sz w:val="26"/>
+        </w:rPr>
+        <w:t>Đặt lọ, khay hoặc bệnh phẩm vào đúng vùng quy định trên đế. Kiểm tra hình ảnh hiển thị trên màn hình, bảo đảm đối tượng cần ghi nhận được đặt ổn định, không bị che khuất, nằm đầy đủ trong trường ảnh, đủ sáng và rõ nét.</w:t>
+      </w:r>
+    </w:p>
+    <w:p>
+      <w:pPr>
+        <w:keepNext/>
+        <w:spacing w:before="80" w:beforeAutospacing="1" w:after="40" w:afterAutospacing="1" w:line="288" w:lineRule="auto"/>
+        <w:ind w:firstLine="720"/>
+        <w:jc w:val="left"/>
         <w:rPr>
           <w:rFonts w:asciiTheme="majorHAnsi" w:eastAsiaTheme="minorEastAsia" w:hAnsiTheme="majorHAnsi" w:cstheme="majorHAnsi"/>
           <w:bCs w:val="0"/>
@@ -6216,35 +6232,36 @@
       </w:pPr>
       <w:r>
         <w:rPr>
-          <w:rFonts w:asciiTheme="majorHAnsi" w:eastAsiaTheme="minorEastAsia" w:hAnsiTheme="majorHAnsi" w:cstheme="majorHAnsi" w:ascii="Times New Roman" w:hAnsi="Times New Roman" w:cs="Times New Roman" w:eastAsia="Times New Roman"/>
-          <w:b w:val="0"/>
-          <w:bCs w:val="0"/>
-          <w:i w:val="0"/>
-          <w:sz w:val="26"/>
-          <w:szCs w:val="26"/>
-          <w:lang w:val="vi-VN" w:eastAsia="vi-VN"/>
-        </w:rPr>
-        <w:t>Bước 4. Đặt bệnh phẩm và kiểm tra trường ảnh</w:t>
-      </w:r>
-      <w:r>
-        <w:rPr>
-          <w:rFonts w:asciiTheme="majorHAnsi" w:eastAsiaTheme="minorEastAsia" w:hAnsiTheme="majorHAnsi" w:cstheme="majorHAnsi" w:ascii="Times New Roman" w:hAnsi="Times New Roman" w:cs="Times New Roman" w:eastAsia="Times New Roman"/>
-          <w:b w:val="0"/>
-          <w:bCs w:val="0"/>
-          <w:i w:val="0"/>
-          <w:sz w:val="26"/>
-          <w:szCs w:val="26"/>
-          <w:lang w:val="vi-VN" w:eastAsia="vi-VN"/>
-        </w:rPr>
-        <w:br/>
-        <w:t>Đặt lọ, khay hoặc bệnh phẩm vào đúng vùng quy định trên đế. Kiểm tra hình ảnh hiển thị trên màn hình, bảo đảm đối tượng cần ghi nhận được đặt ổn định, không bị che khuất, nằm đầy đủ trong trường ảnh, đủ sáng và rõ nét.</w:t>
-      </w:r>
-    </w:p>
-    <w:p>
-      <w:pPr>
-        <w:spacing w:before="0" w:beforeAutospacing="1" w:after="40" w:afterAutospacing="1" w:line="288" w:lineRule="auto"/>
+          <w:rFonts w:ascii="Times New Roman" w:hAnsi="Times New Roman" w:cs="Times New Roman" w:eastAsia="Times New Roman"/>
+          <w:b/>
+          <w:i w:val="0"/>
+          <w:sz w:val="26"/>
+        </w:rPr>
+        <w:t>Bước 5. Chụp và kiểm tra hình ảnh</w:t>
+      </w:r>
+    </w:p>
+    <w:p>
+      <w:pPr>
+        <w:spacing w:before="0" w:after="40" w:line="288" w:lineRule="auto"/>
         <w:ind w:firstLine="720"/>
         <w:jc w:val="both"/>
+      </w:pPr>
+      <w:r>
+        <w:rPr>
+          <w:rFonts w:ascii="Times New Roman" w:hAnsi="Times New Roman" w:cs="Times New Roman" w:eastAsia="Times New Roman"/>
+          <w:b w:val="0"/>
+          <w:i w:val="0"/>
+          <w:sz w:val="26"/>
+        </w:rPr>
+        <w:t>Nhấn bàn đạp chân để chụp ảnh. Kiểm tra hình ảnh vừa ghi nhận; chụp lại nếu ảnh bị mờ, thiếu trường ảnh, che khuất, phản sáng hoặc chưa thể hiện rõ đặc điểm cần kiểm soát.</w:t>
+      </w:r>
+    </w:p>
+    <w:p>
+      <w:pPr>
+        <w:keepNext/>
+        <w:spacing w:before="80" w:beforeAutospacing="1" w:after="40" w:afterAutospacing="1" w:line="288" w:lineRule="auto"/>
+        <w:ind w:firstLine="720"/>
+        <w:jc w:val="left"/>
         <w:rPr>
           <w:rFonts w:asciiTheme="majorHAnsi" w:eastAsiaTheme="minorEastAsia" w:hAnsiTheme="majorHAnsi" w:cstheme="majorHAnsi"/>
           <w:bCs w:val="0"/>
@@ -6255,35 +6272,36 @@
       </w:pPr>
       <w:r>
         <w:rPr>
-          <w:rFonts w:asciiTheme="majorHAnsi" w:eastAsiaTheme="minorEastAsia" w:hAnsiTheme="majorHAnsi" w:cstheme="majorHAnsi" w:ascii="Times New Roman" w:hAnsi="Times New Roman" w:cs="Times New Roman" w:eastAsia="Times New Roman"/>
-          <w:b w:val="0"/>
-          <w:bCs w:val="0"/>
-          <w:i w:val="0"/>
-          <w:sz w:val="26"/>
-          <w:szCs w:val="26"/>
-          <w:lang w:val="vi-VN" w:eastAsia="vi-VN"/>
-        </w:rPr>
-        <w:t>Bước 5. Chụp và kiểm tra hình ảnh</w:t>
-      </w:r>
-      <w:r>
-        <w:rPr>
-          <w:rFonts w:asciiTheme="majorHAnsi" w:eastAsiaTheme="minorEastAsia" w:hAnsiTheme="majorHAnsi" w:cstheme="majorHAnsi" w:ascii="Times New Roman" w:hAnsi="Times New Roman" w:cs="Times New Roman" w:eastAsia="Times New Roman"/>
-          <w:b w:val="0"/>
-          <w:bCs w:val="0"/>
-          <w:i w:val="0"/>
-          <w:sz w:val="26"/>
-          <w:szCs w:val="26"/>
-          <w:lang w:val="vi-VN" w:eastAsia="vi-VN"/>
-        </w:rPr>
-        <w:br/>
-        <w:t>Nhấn bàn đạp chân để chụp ảnh. Kiểm tra hình ảnh vừa ghi nhận; chụp lại nếu ảnh bị mờ, thiếu trường ảnh, che khuất, phản sáng hoặc chưa thể hiện rõ đặc điểm cần kiểm soát.</w:t>
-      </w:r>
-    </w:p>
-    <w:p>
-      <w:pPr>
-        <w:spacing w:before="0" w:beforeAutospacing="1" w:after="40" w:afterAutospacing="1" w:line="288" w:lineRule="auto"/>
+          <w:rFonts w:ascii="Times New Roman" w:hAnsi="Times New Roman" w:cs="Times New Roman" w:eastAsia="Times New Roman"/>
+          <w:b/>
+          <w:i w:val="0"/>
+          <w:sz w:val="26"/>
+        </w:rPr>
+        <w:t>Bước 6. Kiểm tra liên kết dữ liệu</w:t>
+      </w:r>
+    </w:p>
+    <w:p>
+      <w:pPr>
+        <w:spacing w:before="0" w:after="40" w:line="288" w:lineRule="auto"/>
         <w:ind w:firstLine="720"/>
         <w:jc w:val="both"/>
+      </w:pPr>
+      <w:r>
+        <w:rPr>
+          <w:rFonts w:ascii="Times New Roman" w:hAnsi="Times New Roman" w:cs="Times New Roman" w:eastAsia="Times New Roman"/>
+          <w:b w:val="0"/>
+          <w:i w:val="0"/>
+          <w:sz w:val="26"/>
+        </w:rPr>
+        <w:t>Kiểm tra thông tin giao nhận và hình ảnh đã được liên kết đúng với GPB-ID, thời gian, người thực hiện và công đoạn tương ứng.</w:t>
+      </w:r>
+    </w:p>
+    <w:p>
+      <w:pPr>
+        <w:keepNext/>
+        <w:spacing w:before="80" w:beforeAutospacing="1" w:after="40" w:afterAutospacing="1" w:line="288" w:lineRule="auto"/>
+        <w:ind w:firstLine="720"/>
+        <w:jc w:val="left"/>
         <w:rPr>
           <w:rFonts w:asciiTheme="majorHAnsi" w:eastAsiaTheme="minorEastAsia" w:hAnsiTheme="majorHAnsi" w:cstheme="majorHAnsi"/>
           <w:bCs w:val="0"/>
@@ -6294,66 +6312,27 @@
       </w:pPr>
       <w:r>
         <w:rPr>
-          <w:rFonts w:asciiTheme="majorHAnsi" w:eastAsiaTheme="minorEastAsia" w:hAnsiTheme="majorHAnsi" w:cstheme="majorHAnsi" w:ascii="Times New Roman" w:hAnsi="Times New Roman" w:cs="Times New Roman" w:eastAsia="Times New Roman"/>
-          <w:b w:val="0"/>
-          <w:bCs w:val="0"/>
-          <w:i w:val="0"/>
-          <w:sz w:val="26"/>
-          <w:szCs w:val="26"/>
-          <w:lang w:val="vi-VN" w:eastAsia="vi-VN"/>
-        </w:rPr>
-        <w:t>Bước 6. Kiểm tra liên kết dữ liệu</w:t>
-      </w:r>
-      <w:r>
-        <w:rPr>
-          <w:rFonts w:asciiTheme="majorHAnsi" w:eastAsiaTheme="minorEastAsia" w:hAnsiTheme="majorHAnsi" w:cstheme="majorHAnsi" w:ascii="Times New Roman" w:hAnsi="Times New Roman" w:cs="Times New Roman" w:eastAsia="Times New Roman"/>
-          <w:b w:val="0"/>
-          <w:bCs w:val="0"/>
-          <w:i w:val="0"/>
-          <w:sz w:val="26"/>
-          <w:szCs w:val="26"/>
-          <w:lang w:val="vi-VN" w:eastAsia="vi-VN"/>
-        </w:rPr>
-        <w:br/>
-        <w:t>Kiểm tra thông tin giao nhận và hình ảnh đã được liên kết đúng với GPB-ID, thời gian, người thực hiện và công đoạn tương ứng.</w:t>
-      </w:r>
-    </w:p>
-    <w:p>
-      <w:pPr>
-        <w:spacing w:before="0" w:beforeAutospacing="1" w:after="40" w:afterAutospacing="1" w:line="288" w:lineRule="auto"/>
+          <w:rFonts w:ascii="Times New Roman" w:hAnsi="Times New Roman" w:cs="Times New Roman" w:eastAsia="Times New Roman"/>
+          <w:b/>
+          <w:i w:val="0"/>
+          <w:sz w:val="26"/>
+        </w:rPr>
+        <w:t>Bước 7. Xác nhận lưu hồ sơ</w:t>
+      </w:r>
+    </w:p>
+    <w:p>
+      <w:pPr>
+        <w:spacing w:before="0" w:after="40" w:line="288" w:lineRule="auto"/>
         <w:ind w:firstLine="720"/>
         <w:jc w:val="both"/>
-        <w:rPr>
-          <w:rFonts w:asciiTheme="majorHAnsi" w:eastAsiaTheme="minorEastAsia" w:hAnsiTheme="majorHAnsi" w:cstheme="majorHAnsi"/>
-          <w:bCs w:val="0"/>
-          <w:sz w:val="26"/>
-          <w:szCs w:val="26"/>
-          <w:lang w:val="vi-VN" w:eastAsia="vi-VN"/>
-        </w:rPr>
-      </w:pPr>
-      <w:r>
-        <w:rPr>
-          <w:rFonts w:asciiTheme="majorHAnsi" w:eastAsiaTheme="minorEastAsia" w:hAnsiTheme="majorHAnsi" w:cstheme="majorHAnsi" w:ascii="Times New Roman" w:hAnsi="Times New Roman" w:cs="Times New Roman" w:eastAsia="Times New Roman"/>
-          <w:b w:val="0"/>
-          <w:bCs w:val="0"/>
-          <w:i w:val="0"/>
-          <w:sz w:val="26"/>
-          <w:szCs w:val="26"/>
-          <w:lang w:val="vi-VN" w:eastAsia="vi-VN"/>
-        </w:rPr>
-        <w:t>Bước 7. Xác nhận lưu hồ sơ</w:t>
-      </w:r>
-      <w:r>
-        <w:rPr>
-          <w:rFonts w:asciiTheme="majorHAnsi" w:eastAsiaTheme="minorEastAsia" w:hAnsiTheme="majorHAnsi" w:cstheme="majorHAnsi" w:ascii="Times New Roman" w:hAnsi="Times New Roman" w:cs="Times New Roman" w:eastAsia="Times New Roman"/>
-          <w:b w:val="0"/>
-          <w:bCs w:val="0"/>
-          <w:i w:val="0"/>
-          <w:sz w:val="26"/>
-          <w:szCs w:val="26"/>
-          <w:lang w:val="vi-VN" w:eastAsia="vi-VN"/>
-        </w:rPr>
-        <w:br/>
+      </w:pPr>
+      <w:r>
+        <w:rPr>
+          <w:rFonts w:ascii="Times New Roman" w:hAnsi="Times New Roman" w:cs="Times New Roman" w:eastAsia="Times New Roman"/>
+          <w:b w:val="0"/>
+          <w:i w:val="0"/>
+          <w:sz w:val="26"/>
+        </w:rPr>
         <w:t>Xác nhận lưu thông tin giao nhận, hình ảnh và dữ liệu liên quan vào hồ sơ bằng chứng số của bệnh phẩm.</w:t>
       </w:r>
     </w:p>

</xml_diff>

<commit_message>
chore(report): finalize 20-page document with side-by-side images
</commit_message>
<xml_diff>
--- a/docs/report/M7_Thuyet_minh_Cong_trinh_ChuanHoa.docx
+++ b/docs/report/M7_Thuyet_minh_Cong_trinh_ChuanHoa.docx
@@ -5,7 +5,7 @@
     <w:p>
       <w:pPr>
         <w:keepNext/>
-        <w:spacing w:before="120" w:after="120" w:line="288" w:lineRule="auto"/>
+        <w:spacing w:before="80" w:after="80" w:line="276" w:lineRule="auto"/>
         <w:ind w:firstLine="0"/>
         <w:jc w:val="center"/>
         <w:rPr>
@@ -36,7 +36,7 @@
       <w:pPr>
         <w:pStyle w:val="ThngthngWeb"/>
         <w:keepNext/>
-        <w:spacing w:before="120" w:beforeAutospacing="0" w:after="120" w:afterAutospacing="0" w:line="288" w:lineRule="auto"/>
+        <w:spacing w:before="80" w:beforeAutospacing="0" w:after="80" w:afterAutospacing="0" w:line="276" w:lineRule="auto"/>
         <w:ind w:firstLine="0"/>
         <w:jc w:val="center"/>
         <w:rPr>
@@ -131,7 +131,7 @@
     <w:p>
       <w:pPr>
         <w:keepNext/>
-        <w:spacing w:before="120" w:after="60" w:line="288" w:lineRule="auto"/>
+        <w:spacing w:before="80" w:after="40" w:line="276" w:lineRule="auto"/>
         <w:ind w:firstLine="0"/>
         <w:jc w:val="left"/>
         <w:rPr>
@@ -153,7 +153,7 @@
     <w:p>
       <w:pPr>
         <w:keepNext/>
-        <w:spacing w:before="120" w:after="60" w:line="288" w:lineRule="auto"/>
+        <w:spacing w:before="80" w:after="40" w:line="276" w:lineRule="auto"/>
         <w:ind w:firstLine="0"/>
         <w:jc w:val="left"/>
         <w:rPr>
@@ -1162,7 +1162,7 @@
       <w:pPr>
         <w:pStyle w:val="p1"/>
         <w:keepNext/>
-        <w:spacing w:before="120" w:beforeAutospacing="0" w:after="60" w:afterAutospacing="0" w:line="288" w:lineRule="auto"/>
+        <w:spacing w:before="80" w:beforeAutospacing="0" w:after="40" w:afterAutospacing="0" w:line="276" w:lineRule="auto"/>
         <w:ind w:firstLine="0"/>
         <w:jc w:val="left"/>
         <w:divId w:val="1591818185"/>
@@ -1215,7 +1215,7 @@
       <w:pPr>
         <w:pStyle w:val="Style2"/>
         <w:keepNext/>
-        <w:spacing w:before="120" w:after="60" w:line="288" w:lineRule="auto"/>
+        <w:spacing w:before="80" w:after="40" w:line="276" w:lineRule="auto"/>
         <w:ind w:firstLine="0"/>
         <w:jc w:val="left"/>
         <w:divId w:val="1591818185"/>
@@ -1255,7 +1255,7 @@
       <w:pPr>
         <w:pStyle w:val="p1"/>
         <w:keepNext/>
-        <w:spacing w:before="120" w:beforeAutospacing="0" w:after="60" w:afterAutospacing="0" w:line="288" w:lineRule="auto"/>
+        <w:spacing w:before="80" w:beforeAutospacing="0" w:after="40" w:afterAutospacing="0" w:line="276" w:lineRule="auto"/>
         <w:ind w:firstLine="0"/>
         <w:jc w:val="left"/>
         <w:rPr>
@@ -1358,7 +1358,7 @@
     <w:p>
       <w:pPr>
         <w:pStyle w:val="p1"/>
-        <w:spacing w:before="0" w:after="40" w:line="288" w:lineRule="auto"/>
+        <w:spacing w:before="0" w:after="30" w:line="276" w:lineRule="auto"/>
         <w:ind w:firstLine="720"/>
         <w:jc w:val="both"/>
         <w:rPr>
@@ -1429,7 +1429,7 @@
     <w:p>
       <w:pPr>
         <w:pStyle w:val="p1"/>
-        <w:spacing w:before="0" w:after="40" w:line="288" w:lineRule="auto"/>
+        <w:spacing w:before="0" w:after="30" w:line="276" w:lineRule="auto"/>
         <w:ind w:firstLine="720"/>
         <w:jc w:val="both"/>
         <w:rPr>
@@ -1513,7 +1513,7 @@
     </w:p>
     <w:p>
       <w:pPr>
-        <w:spacing w:before="0" w:beforeAutospacing="1" w:after="40" w:afterAutospacing="1" w:line="288" w:lineRule="auto"/>
+        <w:spacing w:before="0" w:beforeAutospacing="1" w:after="30" w:afterAutospacing="1" w:line="276" w:lineRule="auto"/>
         <w:ind w:firstLine="720"/>
         <w:jc w:val="both"/>
         <w:rPr>
@@ -1558,7 +1558,7 @@
     <w:p>
       <w:pPr>
         <w:pStyle w:val="p1"/>
-        <w:spacing w:before="0" w:after="40" w:line="288" w:lineRule="auto"/>
+        <w:spacing w:before="0" w:after="30" w:line="276" w:lineRule="auto"/>
         <w:ind w:firstLine="720"/>
         <w:jc w:val="both"/>
         <w:rPr>
@@ -1613,7 +1613,7 @@
     </w:p>
     <w:p>
       <w:pPr>
-        <w:spacing w:before="0" w:beforeAutospacing="1" w:after="40" w:afterAutospacing="1" w:line="288" w:lineRule="auto"/>
+        <w:spacing w:before="0" w:beforeAutospacing="1" w:after="30" w:afterAutospacing="1" w:line="276" w:lineRule="auto"/>
         <w:ind w:firstLine="720"/>
         <w:jc w:val="both"/>
         <w:rPr>
@@ -1698,7 +1698,7 @@
     </w:p>
     <w:p>
       <w:pPr>
-        <w:spacing w:before="0" w:beforeAutospacing="1" w:after="40" w:afterAutospacing="1" w:line="288" w:lineRule="auto"/>
+        <w:spacing w:before="0" w:beforeAutospacing="1" w:after="30" w:afterAutospacing="1" w:line="276" w:lineRule="auto"/>
         <w:ind w:firstLine="720"/>
         <w:jc w:val="both"/>
         <w:rPr>
@@ -1784,7 +1784,7 @@
     </w:p>
     <w:p>
       <w:pPr>
-        <w:spacing w:before="0" w:beforeAutospacing="1" w:after="40" w:afterAutospacing="1" w:line="288" w:lineRule="auto"/>
+        <w:spacing w:before="0" w:beforeAutospacing="1" w:after="30" w:afterAutospacing="1" w:line="276" w:lineRule="auto"/>
         <w:ind w:firstLine="720"/>
         <w:jc w:val="both"/>
         <w:rPr>
@@ -1807,7 +1807,7 @@
     </w:p>
     <w:p>
       <w:pPr>
-        <w:spacing w:before="0" w:beforeAutospacing="1" w:after="40" w:afterAutospacing="1" w:line="288" w:lineRule="auto"/>
+        <w:spacing w:before="0" w:beforeAutospacing="1" w:after="30" w:afterAutospacing="1" w:line="276" w:lineRule="auto"/>
         <w:ind w:firstLine="720"/>
         <w:jc w:val="both"/>
         <w:rPr>
@@ -1856,7 +1856,7 @@
     </w:p>
     <w:p>
       <w:pPr>
-        <w:spacing w:before="0" w:beforeAutospacing="1" w:after="40" w:afterAutospacing="1" w:line="288" w:lineRule="auto"/>
+        <w:spacing w:before="0" w:beforeAutospacing="1" w:after="30" w:afterAutospacing="1" w:line="276" w:lineRule="auto"/>
         <w:ind w:firstLine="720"/>
         <w:jc w:val="both"/>
         <w:rPr>
@@ -1894,7 +1894,7 @@
     </w:p>
     <w:p>
       <w:pPr>
-        <w:spacing w:before="0" w:beforeAutospacing="1" w:after="40" w:afterAutospacing="1" w:line="288" w:lineRule="auto"/>
+        <w:spacing w:before="0" w:beforeAutospacing="1" w:after="30" w:afterAutospacing="1" w:line="276" w:lineRule="auto"/>
         <w:ind w:firstLine="720"/>
         <w:jc w:val="both"/>
         <w:rPr>
@@ -1932,7 +1932,7 @@
     </w:p>
     <w:p>
       <w:pPr>
-        <w:spacing w:before="0" w:beforeAutospacing="1" w:after="40" w:afterAutospacing="1" w:line="288" w:lineRule="auto"/>
+        <w:spacing w:before="0" w:beforeAutospacing="1" w:after="30" w:afterAutospacing="1" w:line="276" w:lineRule="auto"/>
         <w:ind w:firstLine="720"/>
         <w:jc w:val="both"/>
         <w:rPr>
@@ -1970,7 +1970,7 @@
     </w:p>
     <w:p>
       <w:pPr>
-        <w:spacing w:before="0" w:beforeAutospacing="1" w:after="40" w:afterAutospacing="1" w:line="288" w:lineRule="auto"/>
+        <w:spacing w:before="0" w:beforeAutospacing="1" w:after="30" w:afterAutospacing="1" w:line="276" w:lineRule="auto"/>
         <w:ind w:firstLine="720"/>
         <w:jc w:val="both"/>
         <w:rPr>
@@ -2008,7 +2008,7 @@
     </w:p>
     <w:p>
       <w:pPr>
-        <w:spacing w:before="0" w:beforeAutospacing="1" w:after="40" w:afterAutospacing="1" w:line="288" w:lineRule="auto"/>
+        <w:spacing w:before="0" w:beforeAutospacing="1" w:after="30" w:afterAutospacing="1" w:line="276" w:lineRule="auto"/>
         <w:ind w:firstLine="720"/>
         <w:jc w:val="both"/>
         <w:rPr>
@@ -2046,7 +2046,7 @@
     </w:p>
     <w:p>
       <w:pPr>
-        <w:spacing w:before="0" w:beforeAutospacing="1" w:after="40" w:afterAutospacing="1" w:line="288" w:lineRule="auto"/>
+        <w:spacing w:before="0" w:beforeAutospacing="1" w:after="30" w:afterAutospacing="1" w:line="276" w:lineRule="auto"/>
         <w:ind w:firstLine="720"/>
         <w:jc w:val="both"/>
         <w:rPr>
@@ -2085,7 +2085,7 @@
     <w:p>
       <w:pPr>
         <w:keepNext/>
-        <w:spacing w:before="120" w:beforeAutospacing="1" w:after="60" w:afterAutospacing="1" w:line="288" w:lineRule="auto"/>
+        <w:spacing w:before="80" w:beforeAutospacing="1" w:after="40" w:afterAutospacing="1" w:line="276" w:lineRule="auto"/>
         <w:ind w:firstLine="0"/>
         <w:jc w:val="left"/>
         <w:rPr>
@@ -2111,7 +2111,7 @@
     </w:p>
     <w:p>
       <w:pPr>
-        <w:spacing w:before="0" w:beforeAutospacing="1" w:after="40" w:afterAutospacing="1" w:line="288" w:lineRule="auto"/>
+        <w:spacing w:before="0" w:beforeAutospacing="1" w:after="30" w:afterAutospacing="1" w:line="276" w:lineRule="auto"/>
         <w:ind w:firstLine="720"/>
         <w:jc w:val="both"/>
         <w:rPr>
@@ -2137,7 +2137,7 @@
     </w:p>
     <w:p>
       <w:pPr>
-        <w:spacing w:before="0" w:beforeAutospacing="1" w:after="40" w:afterAutospacing="1" w:line="288" w:lineRule="auto"/>
+        <w:spacing w:before="0" w:beforeAutospacing="1" w:after="30" w:afterAutospacing="1" w:line="276" w:lineRule="auto"/>
         <w:ind w:firstLine="720"/>
         <w:jc w:val="both"/>
         <w:rPr>
@@ -2163,7 +2163,7 @@
     </w:p>
     <w:p>
       <w:pPr>
-        <w:spacing w:before="0" w:beforeAutospacing="1" w:after="40" w:afterAutospacing="1" w:line="288" w:lineRule="auto"/>
+        <w:spacing w:before="0" w:beforeAutospacing="1" w:after="30" w:afterAutospacing="1" w:line="276" w:lineRule="auto"/>
         <w:ind w:firstLine="720"/>
         <w:jc w:val="both"/>
         <w:rPr>
@@ -2190,7 +2190,7 @@
     <w:p>
       <w:pPr>
         <w:keepNext/>
-        <w:spacing w:before="120" w:beforeAutospacing="1" w:after="60" w:afterAutospacing="1" w:line="288" w:lineRule="auto"/>
+        <w:spacing w:before="80" w:beforeAutospacing="1" w:after="40" w:afterAutospacing="1" w:line="276" w:lineRule="auto"/>
         <w:ind w:firstLine="0"/>
         <w:jc w:val="left"/>
         <w:rPr>
@@ -2232,7 +2232,7 @@
       <w:r>
         <w:drawing>
           <wp:inline xmlns:a="http://schemas.openxmlformats.org/drawingml/2006/main" xmlns:pic="http://schemas.openxmlformats.org/drawingml/2006/picture">
-            <wp:extent cx="3240000" cy="4320000"/>
+            <wp:extent cx="2340000" cy="3120000"/>
             <wp:docPr id="16" name="Picture 16"/>
             <wp:cNvGraphicFramePr>
               <a:graphicFrameLocks noChangeAspect="1"/>
@@ -2253,7 +2253,7 @@
                   <pic:spPr>
                     <a:xfrm>
                       <a:off x="0" y="0"/>
-                      <a:ext cx="3240000" cy="4320000"/>
+                      <a:ext cx="2340000" cy="3120000"/>
                     </a:xfrm>
                     <a:prstGeom prst="rect"/>
                   </pic:spPr>
@@ -2267,7 +2267,7 @@
     <w:p>
       <w:pPr>
         <w:keepNext/>
-        <w:spacing w:before="40" w:after="120" w:line="276" w:lineRule="auto"/>
+        <w:spacing w:before="20" w:after="80" w:line="264" w:lineRule="auto"/>
         <w:ind w:firstLine="0"/>
         <w:jc w:val="center"/>
       </w:pPr>
@@ -2276,14 +2276,14 @@
           <w:rFonts w:ascii="Times New Roman" w:hAnsi="Times New Roman" w:cs="Times New Roman" w:eastAsia="Times New Roman"/>
           <w:b w:val="0"/>
           <w:i/>
-          <w:sz w:val="22"/>
+          <w:sz w:val="20"/>
         </w:rPr>
         <w:t>Ảnh 1: Mã định danh và mã vạch quản lý bệnh phẩm</w:t>
       </w:r>
     </w:p>
     <w:p>
       <w:pPr>
-        <w:spacing w:before="0" w:beforeAutospacing="1" w:after="40" w:afterAutospacing="1" w:line="288" w:lineRule="auto"/>
+        <w:spacing w:before="0" w:beforeAutospacing="1" w:after="30" w:afterAutospacing="1" w:line="276" w:lineRule="auto"/>
         <w:ind w:firstLine="720"/>
         <w:jc w:val="both"/>
         <w:rPr>
@@ -2321,7 +2321,7 @@
     </w:p>
     <w:p>
       <w:pPr>
-        <w:spacing w:before="0" w:beforeAutospacing="1" w:after="40" w:afterAutospacing="1" w:line="288" w:lineRule="auto"/>
+        <w:spacing w:before="0" w:beforeAutospacing="1" w:after="30" w:afterAutospacing="1" w:line="276" w:lineRule="auto"/>
         <w:ind w:firstLine="720"/>
         <w:jc w:val="both"/>
         <w:rPr>
@@ -2375,7 +2375,7 @@
     <w:p>
       <w:pPr>
         <w:keepNext/>
-        <w:spacing w:before="120" w:beforeAutospacing="1" w:after="60" w:afterAutospacing="1" w:line="288" w:lineRule="auto"/>
+        <w:spacing w:before="80" w:beforeAutospacing="1" w:after="40" w:afterAutospacing="1" w:line="276" w:lineRule="auto"/>
         <w:ind w:firstLine="0"/>
         <w:jc w:val="left"/>
         <w:rPr>
@@ -2417,7 +2417,7 @@
       <w:r>
         <w:drawing>
           <wp:inline xmlns:a="http://schemas.openxmlformats.org/drawingml/2006/main" xmlns:pic="http://schemas.openxmlformats.org/drawingml/2006/picture">
-            <wp:extent cx="2448000" cy="2448000"/>
+            <wp:extent cx="1980000" cy="1980000"/>
             <wp:docPr id="17" name="Picture 17"/>
             <wp:cNvGraphicFramePr>
               <a:graphicFrameLocks noChangeAspect="1"/>
@@ -2438,7 +2438,7 @@
                   <pic:spPr>
                     <a:xfrm>
                       <a:off x="0" y="0"/>
-                      <a:ext cx="2448000" cy="2448000"/>
+                      <a:ext cx="1980000" cy="1980000"/>
                     </a:xfrm>
                     <a:prstGeom prst="rect"/>
                   </pic:spPr>
@@ -2452,7 +2452,7 @@
     <w:p>
       <w:pPr>
         <w:keepNext/>
-        <w:spacing w:before="40" w:after="120" w:line="276" w:lineRule="auto"/>
+        <w:spacing w:before="20" w:after="80" w:line="264" w:lineRule="auto"/>
         <w:ind w:firstLine="0"/>
         <w:jc w:val="center"/>
       </w:pPr>
@@ -2461,14 +2461,14 @@
           <w:rFonts w:ascii="Times New Roman" w:hAnsi="Times New Roman" w:cs="Times New Roman" w:eastAsia="Times New Roman"/>
           <w:b w:val="0"/>
           <w:i/>
-          <w:sz w:val="22"/>
+          <w:sz w:val="20"/>
         </w:rPr>
         <w:t>Ảnh 2: Tai nghe có dây tích hợp micro thu nhận giọng nói</w:t>
       </w:r>
     </w:p>
     <w:p>
       <w:pPr>
-        <w:spacing w:before="0" w:beforeAutospacing="1" w:after="40" w:afterAutospacing="1" w:line="288" w:lineRule="auto"/>
+        <w:spacing w:before="0" w:beforeAutospacing="1" w:after="30" w:afterAutospacing="1" w:line="276" w:lineRule="auto"/>
         <w:ind w:firstLine="720"/>
         <w:jc w:val="both"/>
         <w:rPr>
@@ -2507,7 +2507,7 @@
     </w:p>
     <w:p>
       <w:pPr>
-        <w:spacing w:before="0" w:beforeAutospacing="1" w:after="40" w:afterAutospacing="1" w:line="288" w:lineRule="auto"/>
+        <w:spacing w:before="0" w:beforeAutospacing="1" w:after="30" w:afterAutospacing="1" w:line="276" w:lineRule="auto"/>
         <w:ind w:firstLine="720"/>
         <w:jc w:val="both"/>
         <w:rPr>
@@ -2534,7 +2534,7 @@
     <w:p>
       <w:pPr>
         <w:keepNext/>
-        <w:spacing w:before="120" w:beforeAutospacing="1" w:after="60" w:afterAutospacing="1" w:line="288" w:lineRule="auto"/>
+        <w:spacing w:before="80" w:beforeAutospacing="1" w:after="40" w:afterAutospacing="1" w:line="276" w:lineRule="auto"/>
         <w:ind w:firstLine="0"/>
         <w:jc w:val="left"/>
         <w:rPr>
@@ -2556,6 +2556,301 @@
           <w:lang w:val="vi-VN" w:eastAsia="vi-VN"/>
         </w:rPr>
         <w:t>d) Webcam Logitech C920e</w:t>
+      </w:r>
+    </w:p>
+    <w:tbl>
+      <w:tblPr>
+        <w:tblW w:type="auto" w:w="0"/>
+        <w:jc w:val="center"/>
+        <w:tblLayout w:type="fixed"/>
+        <w:tblLook w:firstColumn="1" w:firstRow="1" w:lastColumn="0" w:lastRow="0" w:noHBand="0" w:noVBand="1" w:val="04A0"/>
+        <w:tblBorders>
+          <w:top w:val="none"/>
+          <w:left w:val="none"/>
+          <w:bottom w:val="none"/>
+          <w:right w:val="none"/>
+          <w:insideH w:val="none"/>
+          <w:insideV w:val="none"/>
+        </w:tblBorders>
+      </w:tblPr>
+      <w:tblGrid>
+        <w:gridCol w:w="4677"/>
+        <w:gridCol w:w="4677"/>
+      </w:tblGrid>
+      <w:tr>
+        <w:trPr>
+          <w:cantSplit/>
+        </w:trPr>
+        <w:tc>
+          <w:tcPr>
+            <w:tcW w:type="dxa" w:w="4677"/>
+            <w:tcBorders>
+              <w:top w:val="none"/>
+              <w:left w:val="none"/>
+              <w:bottom w:val="none"/>
+              <w:right w:val="none"/>
+            </w:tcBorders>
+          </w:tcPr>
+          <w:p>
+            <w:pPr>
+              <w:keepNext/>
+              <w:spacing w:before="40" w:after="40"/>
+              <w:ind w:firstLine="0"/>
+              <w:jc w:val="center"/>
+            </w:pPr>
+            <w:r>
+              <w:drawing>
+                <wp:inline xmlns:a="http://schemas.openxmlformats.org/drawingml/2006/main" xmlns:pic="http://schemas.openxmlformats.org/drawingml/2006/picture">
+                  <wp:extent cx="1980000" cy="1980000"/>
+                  <wp:docPr id="18" name="Picture 18"/>
+                  <wp:cNvGraphicFramePr>
+                    <a:graphicFrameLocks noChangeAspect="1"/>
+                  </wp:cNvGraphicFramePr>
+                  <a:graphic>
+                    <a:graphicData uri="http://schemas.openxmlformats.org/drawingml/2006/picture">
+                      <pic:pic>
+                        <pic:nvPicPr>
+                          <pic:cNvPr id="0" name="Ảnh 3.2.jpg"/>
+                          <pic:cNvPicPr/>
+                        </pic:nvPicPr>
+                        <pic:blipFill>
+                          <a:blip r:embed="rId14"/>
+                          <a:stretch>
+                            <a:fillRect/>
+                          </a:stretch>
+                        </pic:blipFill>
+                        <pic:spPr>
+                          <a:xfrm>
+                            <a:off x="0" y="0"/>
+                            <a:ext cx="1980000" cy="1980000"/>
+                          </a:xfrm>
+                          <a:prstGeom prst="rect"/>
+                        </pic:spPr>
+                      </pic:pic>
+                    </a:graphicData>
+                  </a:graphic>
+                </wp:inline>
+              </w:drawing>
+            </w:r>
+          </w:p>
+        </w:tc>
+        <w:tc>
+          <w:tcPr>
+            <w:tcW w:type="dxa" w:w="4677"/>
+            <w:tcBorders>
+              <w:top w:val="none"/>
+              <w:left w:val="none"/>
+              <w:bottom w:val="none"/>
+              <w:right w:val="none"/>
+            </w:tcBorders>
+          </w:tcPr>
+          <w:p>
+            <w:pPr>
+              <w:keepNext/>
+              <w:spacing w:before="40" w:after="40"/>
+              <w:ind w:firstLine="0"/>
+              <w:jc w:val="center"/>
+            </w:pPr>
+            <w:r>
+              <w:drawing>
+                <wp:inline xmlns:a="http://schemas.openxmlformats.org/drawingml/2006/main" xmlns:pic="http://schemas.openxmlformats.org/drawingml/2006/picture">
+                  <wp:extent cx="1980000" cy="2640000"/>
+                  <wp:docPr id="19" name="Picture 19"/>
+                  <wp:cNvGraphicFramePr>
+                    <a:graphicFrameLocks noChangeAspect="1"/>
+                  </wp:cNvGraphicFramePr>
+                  <a:graphic>
+                    <a:graphicData uri="http://schemas.openxmlformats.org/drawingml/2006/picture">
+                      <pic:pic>
+                        <pic:nvPicPr>
+                          <pic:cNvPr id="0" name="Ảnh 3.jpg"/>
+                          <pic:cNvPicPr/>
+                        </pic:nvPicPr>
+                        <pic:blipFill>
+                          <a:blip r:embed="rId15"/>
+                          <a:stretch>
+                            <a:fillRect/>
+                          </a:stretch>
+                        </pic:blipFill>
+                        <pic:spPr>
+                          <a:xfrm>
+                            <a:off x="0" y="0"/>
+                            <a:ext cx="1980000" cy="2640000"/>
+                          </a:xfrm>
+                          <a:prstGeom prst="rect"/>
+                        </pic:spPr>
+                      </pic:pic>
+                    </a:graphicData>
+                  </a:graphic>
+                </wp:inline>
+              </w:drawing>
+            </w:r>
+          </w:p>
+        </w:tc>
+      </w:tr>
+      <w:tr>
+        <w:trPr>
+          <w:cantSplit/>
+        </w:trPr>
+        <w:tc>
+          <w:tcPr>
+            <w:tcW w:type="dxa" w:w="4677"/>
+            <w:tcBorders>
+              <w:top w:val="none"/>
+              <w:left w:val="none"/>
+              <w:bottom w:val="none"/>
+              <w:right w:val="none"/>
+            </w:tcBorders>
+          </w:tcPr>
+          <w:p>
+            <w:pPr>
+              <w:spacing w:before="20" w:after="60" w:line="264" w:lineRule="auto"/>
+              <w:ind w:firstLine="0"/>
+              <w:jc w:val="center"/>
+            </w:pPr>
+            <w:r>
+              <w:rPr>
+                <w:rFonts w:ascii="Times New Roman" w:hAnsi="Times New Roman" w:cs="Times New Roman" w:eastAsia="Times New Roman"/>
+                <w:b w:val="0"/>
+                <w:i/>
+                <w:sz w:val="20"/>
+              </w:rPr>
+              <w:t>Ảnh 3a: Webcam Logitech C920e Full HD</w:t>
+            </w:r>
+          </w:p>
+        </w:tc>
+        <w:tc>
+          <w:tcPr>
+            <w:tcW w:type="dxa" w:w="4677"/>
+            <w:tcBorders>
+              <w:top w:val="none"/>
+              <w:left w:val="none"/>
+              <w:bottom w:val="none"/>
+              <w:right w:val="none"/>
+            </w:tcBorders>
+          </w:tcPr>
+          <w:p>
+            <w:pPr>
+              <w:spacing w:before="20" w:after="60" w:line="264" w:lineRule="auto"/>
+              <w:ind w:firstLine="0"/>
+              <w:jc w:val="center"/>
+            </w:pPr>
+            <w:r>
+              <w:rPr>
+                <w:rFonts w:ascii="Times New Roman" w:hAnsi="Times New Roman" w:cs="Times New Roman" w:eastAsia="Times New Roman"/>
+                <w:b w:val="0"/>
+                <w:i/>
+                <w:sz w:val="20"/>
+              </w:rPr>
+              <w:t>Ảnh 3b: Vị trí lắp đặt trong hộp chụp</w:t>
+            </w:r>
+          </w:p>
+        </w:tc>
+      </w:tr>
+    </w:tbl>
+    <w:p>
+      <w:pPr>
+        <w:spacing w:before="0" w:beforeAutospacing="1" w:after="30" w:afterAutospacing="1" w:line="276" w:lineRule="auto"/>
+        <w:ind w:firstLine="720"/>
+        <w:jc w:val="both"/>
+        <w:rPr>
+          <w:rFonts w:asciiTheme="majorHAnsi" w:eastAsiaTheme="minorEastAsia" w:hAnsiTheme="majorHAnsi" w:cstheme="majorHAnsi"/>
+          <w:bCs w:val="0"/>
+          <w:sz w:val="26"/>
+          <w:szCs w:val="26"/>
+          <w:lang w:val="vi-VN" w:eastAsia="vi-VN"/>
+        </w:rPr>
+      </w:pPr>
+      <w:r>
+        <w:rPr>
+          <w:rFonts w:asciiTheme="majorHAnsi" w:eastAsiaTheme="minorEastAsia" w:hAnsiTheme="majorHAnsi" w:cstheme="majorHAnsi" w:ascii="Times New Roman" w:hAnsi="Times New Roman" w:cs="Times New Roman" w:eastAsia="Times New Roman"/>
+          <w:b w:val="0"/>
+          <w:bCs w:val="0"/>
+          <w:i w:val="0"/>
+          <w:sz w:val="26"/>
+          <w:szCs w:val="26"/>
+          <w:lang w:val="vi-VN" w:eastAsia="vi-VN"/>
+        </w:rPr>
+        <w:t>Webcam Logitech C920e là thiết bị ghi nhận hình ảnh bệnh phẩm, được kết nối trực tiếp với máy tính qua cổng USB-A. Webcam được lắp cố định trên giá đỡ trong hộp chụp, hướng vào trung tâm đế đặt bệnh phẩm.</w:t>
+      </w:r>
+    </w:p>
+    <w:p>
+      <w:pPr>
+        <w:spacing w:before="0" w:beforeAutospacing="1" w:after="30" w:afterAutospacing="1" w:line="276" w:lineRule="auto"/>
+        <w:ind w:firstLine="720"/>
+        <w:jc w:val="both"/>
+        <w:rPr>
+          <w:rFonts w:asciiTheme="majorHAnsi" w:eastAsiaTheme="minorEastAsia" w:hAnsiTheme="majorHAnsi" w:cstheme="majorHAnsi"/>
+          <w:bCs w:val="0"/>
+          <w:sz w:val="26"/>
+          <w:szCs w:val="26"/>
+          <w:lang w:val="vi-VN" w:eastAsia="vi-VN"/>
+        </w:rPr>
+      </w:pPr>
+      <w:r>
+        <w:rPr>
+          <w:rFonts w:asciiTheme="majorHAnsi" w:eastAsiaTheme="minorEastAsia" w:hAnsiTheme="majorHAnsi" w:cstheme="majorHAnsi" w:ascii="Times New Roman" w:hAnsi="Times New Roman" w:cs="Times New Roman" w:eastAsia="Times New Roman"/>
+          <w:b w:val="0"/>
+          <w:bCs w:val="0"/>
+          <w:i w:val="0"/>
+          <w:sz w:val="26"/>
+          <w:szCs w:val="26"/>
+          <w:lang w:val="vi-VN" w:eastAsia="vi-VN"/>
+        </w:rPr>
+        <w:t>Chiều cao, góc đặt và khoảng cách từ webcam đến đế được điều chỉnh phù hợp để vùng cần ghi nhận nằm trọn trong trường ảnh. Vị trí của webcam được duy trì tương đối ổn định nhằm hạn chế sự khác biệt về góc chụp và khoảng cách giữa các lần ghi nhận.</w:t>
+      </w:r>
+    </w:p>
+    <w:p>
+      <w:pPr>
+        <w:spacing w:before="0" w:beforeAutospacing="1" w:after="30" w:afterAutospacing="1" w:line="276" w:lineRule="auto"/>
+        <w:ind w:firstLine="720"/>
+        <w:jc w:val="both"/>
+        <w:rPr>
+          <w:rFonts w:asciiTheme="majorHAnsi" w:eastAsiaTheme="minorEastAsia" w:hAnsiTheme="majorHAnsi" w:cstheme="majorHAnsi"/>
+          <w:bCs w:val="0"/>
+          <w:sz w:val="26"/>
+          <w:szCs w:val="26"/>
+          <w:lang w:val="vi-VN" w:eastAsia="vi-VN"/>
+        </w:rPr>
+      </w:pPr>
+      <w:r>
+        <w:rPr>
+          <w:rFonts w:asciiTheme="majorHAnsi" w:eastAsiaTheme="minorEastAsia" w:hAnsiTheme="majorHAnsi" w:cstheme="majorHAnsi" w:ascii="Times New Roman" w:hAnsi="Times New Roman" w:cs="Times New Roman" w:eastAsia="Times New Roman"/>
+          <w:b w:val="0"/>
+          <w:bCs w:val="0"/>
+          <w:i w:val="0"/>
+          <w:sz w:val="26"/>
+          <w:szCs w:val="26"/>
+          <w:lang w:val="vi-VN" w:eastAsia="vi-VN"/>
+        </w:rPr>
+        <w:t>Webcam chỉ thực hiện chức năng thu nhận và truyền hình ảnh đến phần mềm, không phân tích bệnh phẩm và không đưa ra nhận định hoặc chẩn đoán. Micro tích hợp trên webcam được vô hiệu hóa do sáng kiến sử dụng riêng tai nghe có dây tích hợp micro để hỗ trợ nhập liệu bằng giọng nói.</w:t>
+      </w:r>
+    </w:p>
+    <w:p>
+      <w:pPr>
+        <w:keepNext/>
+        <w:spacing w:before="80" w:beforeAutospacing="1" w:after="40" w:afterAutospacing="1" w:line="276" w:lineRule="auto"/>
+        <w:ind w:firstLine="0"/>
+        <w:jc w:val="left"/>
+        <w:rPr>
+          <w:rFonts w:asciiTheme="majorHAnsi" w:eastAsiaTheme="minorEastAsia" w:hAnsiTheme="majorHAnsi" w:cstheme="majorHAnsi"/>
+          <w:bCs w:val="0"/>
+          <w:sz w:val="26"/>
+          <w:szCs w:val="26"/>
+          <w:lang w:val="vi-VN" w:eastAsia="vi-VN"/>
+        </w:rPr>
+      </w:pPr>
+      <w:r>
+        <w:rPr>
+          <w:rFonts w:asciiTheme="majorHAnsi" w:eastAsiaTheme="minorEastAsia" w:hAnsiTheme="majorHAnsi" w:cstheme="majorHAnsi" w:ascii="Times New Roman" w:hAnsi="Times New Roman" w:cs="Times New Roman" w:eastAsia="Times New Roman"/>
+          <w:b/>
+          <w:bCs w:val="0"/>
+          <w:i w:val="0"/>
+          <w:sz w:val="26"/>
+          <w:szCs w:val="26"/>
+          <w:lang w:val="vi-VN" w:eastAsia="vi-VN"/>
+        </w:rPr>
+        <w:t>đ) Hộp chụp ảnh tích hợp hệ thống chiếu sáng</w:t>
       </w:r>
     </w:p>
     <w:p>
@@ -2576,239 +2871,7 @@
       <w:r>
         <w:drawing>
           <wp:inline xmlns:a="http://schemas.openxmlformats.org/drawingml/2006/main" xmlns:pic="http://schemas.openxmlformats.org/drawingml/2006/picture">
-            <wp:extent cx="2340000" cy="2340000"/>
-            <wp:docPr id="18" name="Picture 18"/>
-            <wp:cNvGraphicFramePr>
-              <a:graphicFrameLocks noChangeAspect="1"/>
-            </wp:cNvGraphicFramePr>
-            <a:graphic>
-              <a:graphicData uri="http://schemas.openxmlformats.org/drawingml/2006/picture">
-                <pic:pic>
-                  <pic:nvPicPr>
-                    <pic:cNvPr id="0" name="Ảnh 3.2.jpg"/>
-                    <pic:cNvPicPr/>
-                  </pic:nvPicPr>
-                  <pic:blipFill>
-                    <a:blip r:embed="rId14"/>
-                    <a:stretch>
-                      <a:fillRect/>
-                    </a:stretch>
-                  </pic:blipFill>
-                  <pic:spPr>
-                    <a:xfrm>
-                      <a:off x="0" y="0"/>
-                      <a:ext cx="2340000" cy="2340000"/>
-                    </a:xfrm>
-                    <a:prstGeom prst="rect"/>
-                  </pic:spPr>
-                </pic:pic>
-              </a:graphicData>
-            </a:graphic>
-          </wp:inline>
-        </w:drawing>
-      </w:r>
-    </w:p>
-    <w:p>
-      <w:pPr>
-        <w:keepNext/>
-        <w:spacing w:before="40" w:after="120" w:line="276" w:lineRule="auto"/>
-        <w:ind w:firstLine="0"/>
-        <w:jc w:val="center"/>
-      </w:pPr>
-      <w:r>
-        <w:rPr>
-          <w:rFonts w:ascii="Times New Roman" w:hAnsi="Times New Roman" w:cs="Times New Roman" w:eastAsia="Times New Roman"/>
-          <w:b w:val="0"/>
-          <w:i/>
-          <w:sz w:val="22"/>
-        </w:rPr>
-        <w:t>Ảnh 3a: Webcam Logitech C920e độ phân giải Full HD</w:t>
-      </w:r>
-    </w:p>
-    <w:p>
-      <w:pPr>
-        <w:keepNext/>
-        <w:spacing w:before="80" w:after="40"/>
-        <w:ind w:firstLine="0"/>
-        <w:jc w:val="center"/>
-      </w:pPr>
-      <w:r/>
-      <w:r>
-        <w:drawing>
-          <wp:inline xmlns:a="http://schemas.openxmlformats.org/drawingml/2006/main" xmlns:pic="http://schemas.openxmlformats.org/drawingml/2006/picture">
-            <wp:extent cx="2951999" cy="3935999"/>
-            <wp:docPr id="19" name="Picture 19"/>
-            <wp:cNvGraphicFramePr>
-              <a:graphicFrameLocks noChangeAspect="1"/>
-            </wp:cNvGraphicFramePr>
-            <a:graphic>
-              <a:graphicData uri="http://schemas.openxmlformats.org/drawingml/2006/picture">
-                <pic:pic>
-                  <pic:nvPicPr>
-                    <pic:cNvPr id="0" name="Ảnh 3.jpg"/>
-                    <pic:cNvPicPr/>
-                  </pic:nvPicPr>
-                  <pic:blipFill>
-                    <a:blip r:embed="rId15"/>
-                    <a:stretch>
-                      <a:fillRect/>
-                    </a:stretch>
-                  </pic:blipFill>
-                  <pic:spPr>
-                    <a:xfrm>
-                      <a:off x="0" y="0"/>
-                      <a:ext cx="2951999" cy="3935999"/>
-                    </a:xfrm>
-                    <a:prstGeom prst="rect"/>
-                  </pic:spPr>
-                </pic:pic>
-              </a:graphicData>
-            </a:graphic>
-          </wp:inline>
-        </w:drawing>
-      </w:r>
-    </w:p>
-    <w:p>
-      <w:pPr>
-        <w:keepNext/>
-        <w:spacing w:before="40" w:after="120" w:line="276" w:lineRule="auto"/>
-        <w:ind w:firstLine="0"/>
-        <w:jc w:val="center"/>
-      </w:pPr>
-      <w:r>
-        <w:rPr>
-          <w:rFonts w:ascii="Times New Roman" w:hAnsi="Times New Roman" w:cs="Times New Roman" w:eastAsia="Times New Roman"/>
-          <w:b w:val="0"/>
-          <w:i/>
-          <w:sz w:val="22"/>
-        </w:rPr>
-        <w:t>Ảnh 3b: Vị trí lắp đặt webcam cố định trong hộp chụp</w:t>
-      </w:r>
-    </w:p>
-    <w:p>
-      <w:pPr>
-        <w:spacing w:before="0" w:beforeAutospacing="1" w:after="40" w:afterAutospacing="1" w:line="288" w:lineRule="auto"/>
-        <w:ind w:firstLine="720"/>
-        <w:jc w:val="both"/>
-        <w:rPr>
-          <w:rFonts w:asciiTheme="majorHAnsi" w:eastAsiaTheme="minorEastAsia" w:hAnsiTheme="majorHAnsi" w:cstheme="majorHAnsi"/>
-          <w:bCs w:val="0"/>
-          <w:sz w:val="26"/>
-          <w:szCs w:val="26"/>
-          <w:lang w:val="vi-VN" w:eastAsia="vi-VN"/>
-        </w:rPr>
-      </w:pPr>
-      <w:r>
-        <w:rPr>
-          <w:rFonts w:asciiTheme="majorHAnsi" w:eastAsiaTheme="minorEastAsia" w:hAnsiTheme="majorHAnsi" w:cstheme="majorHAnsi" w:ascii="Times New Roman" w:hAnsi="Times New Roman" w:cs="Times New Roman" w:eastAsia="Times New Roman"/>
-          <w:b w:val="0"/>
-          <w:bCs w:val="0"/>
-          <w:i w:val="0"/>
-          <w:sz w:val="26"/>
-          <w:szCs w:val="26"/>
-          <w:lang w:val="vi-VN" w:eastAsia="vi-VN"/>
-        </w:rPr>
-        <w:t>Webcam Logitech C920e là thiết bị ghi nhận hình ảnh bệnh phẩm, được kết nối trực tiếp với máy tính qua cổng USB-A. Webcam được lắp cố định trên giá đỡ trong hộp chụp, hướng vào trung tâm đế đặt bệnh phẩm.</w:t>
-      </w:r>
-    </w:p>
-    <w:p>
-      <w:pPr>
-        <w:spacing w:before="0" w:beforeAutospacing="1" w:after="40" w:afterAutospacing="1" w:line="288" w:lineRule="auto"/>
-        <w:ind w:firstLine="720"/>
-        <w:jc w:val="both"/>
-        <w:rPr>
-          <w:rFonts w:asciiTheme="majorHAnsi" w:eastAsiaTheme="minorEastAsia" w:hAnsiTheme="majorHAnsi" w:cstheme="majorHAnsi"/>
-          <w:bCs w:val="0"/>
-          <w:sz w:val="26"/>
-          <w:szCs w:val="26"/>
-          <w:lang w:val="vi-VN" w:eastAsia="vi-VN"/>
-        </w:rPr>
-      </w:pPr>
-      <w:r>
-        <w:rPr>
-          <w:rFonts w:asciiTheme="majorHAnsi" w:eastAsiaTheme="minorEastAsia" w:hAnsiTheme="majorHAnsi" w:cstheme="majorHAnsi" w:ascii="Times New Roman" w:hAnsi="Times New Roman" w:cs="Times New Roman" w:eastAsia="Times New Roman"/>
-          <w:b w:val="0"/>
-          <w:bCs w:val="0"/>
-          <w:i w:val="0"/>
-          <w:sz w:val="26"/>
-          <w:szCs w:val="26"/>
-          <w:lang w:val="vi-VN" w:eastAsia="vi-VN"/>
-        </w:rPr>
-        <w:t>Chiều cao, góc đặt và khoảng cách từ webcam đến đế được điều chỉnh phù hợp để vùng cần ghi nhận nằm trọn trong trường ảnh. Vị trí của webcam được duy trì tương đối ổn định nhằm hạn chế sự khác biệt về góc chụp và khoảng cách giữa các lần ghi nhận.</w:t>
-      </w:r>
-    </w:p>
-    <w:p>
-      <w:pPr>
-        <w:spacing w:before="0" w:beforeAutospacing="1" w:after="40" w:afterAutospacing="1" w:line="288" w:lineRule="auto"/>
-        <w:ind w:firstLine="720"/>
-        <w:jc w:val="both"/>
-        <w:rPr>
-          <w:rFonts w:asciiTheme="majorHAnsi" w:eastAsiaTheme="minorEastAsia" w:hAnsiTheme="majorHAnsi" w:cstheme="majorHAnsi"/>
-          <w:bCs w:val="0"/>
-          <w:sz w:val="26"/>
-          <w:szCs w:val="26"/>
-          <w:lang w:val="vi-VN" w:eastAsia="vi-VN"/>
-        </w:rPr>
-      </w:pPr>
-      <w:r>
-        <w:rPr>
-          <w:rFonts w:asciiTheme="majorHAnsi" w:eastAsiaTheme="minorEastAsia" w:hAnsiTheme="majorHAnsi" w:cstheme="majorHAnsi" w:ascii="Times New Roman" w:hAnsi="Times New Roman" w:cs="Times New Roman" w:eastAsia="Times New Roman"/>
-          <w:b w:val="0"/>
-          <w:bCs w:val="0"/>
-          <w:i w:val="0"/>
-          <w:sz w:val="26"/>
-          <w:szCs w:val="26"/>
-          <w:lang w:val="vi-VN" w:eastAsia="vi-VN"/>
-        </w:rPr>
-        <w:t>Webcam chỉ thực hiện chức năng thu nhận và truyền hình ảnh đến phần mềm, không phân tích bệnh phẩm và không đưa ra nhận định hoặc chẩn đoán. Micro tích hợp trên webcam được vô hiệu hóa do sáng kiến sử dụng riêng tai nghe có dây tích hợp micro để hỗ trợ nhập liệu bằng giọng nói.</w:t>
-      </w:r>
-    </w:p>
-    <w:p>
-      <w:pPr>
-        <w:keepNext/>
-        <w:spacing w:before="120" w:beforeAutospacing="1" w:after="60" w:afterAutospacing="1" w:line="288" w:lineRule="auto"/>
-        <w:ind w:firstLine="0"/>
-        <w:jc w:val="left"/>
-        <w:rPr>
-          <w:rFonts w:asciiTheme="majorHAnsi" w:eastAsiaTheme="minorEastAsia" w:hAnsiTheme="majorHAnsi" w:cstheme="majorHAnsi"/>
-          <w:bCs w:val="0"/>
-          <w:sz w:val="26"/>
-          <w:szCs w:val="26"/>
-          <w:lang w:val="vi-VN" w:eastAsia="vi-VN"/>
-        </w:rPr>
-      </w:pPr>
-      <w:r>
-        <w:rPr>
-          <w:rFonts w:asciiTheme="majorHAnsi" w:eastAsiaTheme="minorEastAsia" w:hAnsiTheme="majorHAnsi" w:cstheme="majorHAnsi" w:ascii="Times New Roman" w:hAnsi="Times New Roman" w:cs="Times New Roman" w:eastAsia="Times New Roman"/>
-          <w:b/>
-          <w:bCs w:val="0"/>
-          <w:i w:val="0"/>
-          <w:sz w:val="26"/>
-          <w:szCs w:val="26"/>
-          <w:lang w:val="vi-VN" w:eastAsia="vi-VN"/>
-        </w:rPr>
-        <w:t>đ) Hộp chụp ảnh tích hợp hệ thống chiếu sáng</w:t>
-      </w:r>
-    </w:p>
-    <w:p>
-      <w:pPr>
-        <w:keepNext/>
-        <w:spacing w:before="80" w:beforeAutospacing="1" w:after="40" w:afterAutospacing="1"/>
-        <w:ind w:firstLine="0"/>
-        <w:jc w:val="center"/>
-        <w:rPr>
-          <w:rFonts w:asciiTheme="majorHAnsi" w:eastAsiaTheme="minorEastAsia" w:hAnsiTheme="majorHAnsi" w:cstheme="majorHAnsi"/>
-          <w:bCs w:val="0"/>
-          <w:sz w:val="26"/>
-          <w:szCs w:val="26"/>
-          <w:lang w:val="vi-VN" w:eastAsia="vi-VN"/>
-        </w:rPr>
-      </w:pPr>
-      <w:r/>
-      <w:r>
-        <w:drawing>
-          <wp:inline xmlns:a="http://schemas.openxmlformats.org/drawingml/2006/main" xmlns:pic="http://schemas.openxmlformats.org/drawingml/2006/picture">
-            <wp:extent cx="3168000" cy="4224000"/>
+            <wp:extent cx="2340000" cy="3120000"/>
             <wp:docPr id="20" name="Picture 20"/>
             <wp:cNvGraphicFramePr>
               <a:graphicFrameLocks noChangeAspect="1"/>
@@ -2829,7 +2892,7 @@
                   <pic:spPr>
                     <a:xfrm>
                       <a:off x="0" y="0"/>
-                      <a:ext cx="3168000" cy="4224000"/>
+                      <a:ext cx="2340000" cy="3120000"/>
                     </a:xfrm>
                     <a:prstGeom prst="rect"/>
                   </pic:spPr>
@@ -2843,7 +2906,7 @@
     <w:p>
       <w:pPr>
         <w:keepNext/>
-        <w:spacing w:before="40" w:after="120" w:line="276" w:lineRule="auto"/>
+        <w:spacing w:before="20" w:after="80" w:line="264" w:lineRule="auto"/>
         <w:ind w:firstLine="0"/>
         <w:jc w:val="center"/>
       </w:pPr>
@@ -2852,14 +2915,14 @@
           <w:rFonts w:ascii="Times New Roman" w:hAnsi="Times New Roman" w:cs="Times New Roman" w:eastAsia="Times New Roman"/>
           <w:b w:val="0"/>
           <w:i/>
-          <w:sz w:val="22"/>
+          <w:sz w:val="20"/>
         </w:rPr>
         <w:t>Ảnh 4: Hộp chụp ảnh tích hợp hệ thống chiếu sáng</w:t>
       </w:r>
     </w:p>
     <w:p>
       <w:pPr>
-        <w:spacing w:before="0" w:beforeAutospacing="1" w:after="40" w:afterAutospacing="1" w:line="288" w:lineRule="auto"/>
+        <w:spacing w:before="0" w:beforeAutospacing="1" w:after="30" w:afterAutospacing="1" w:line="276" w:lineRule="auto"/>
         <w:ind w:firstLine="720"/>
         <w:jc w:val="both"/>
         <w:rPr>
@@ -2885,7 +2948,7 @@
     </w:p>
     <w:p>
       <w:pPr>
-        <w:spacing w:before="0" w:beforeAutospacing="1" w:after="40" w:afterAutospacing="1" w:line="288" w:lineRule="auto"/>
+        <w:spacing w:before="0" w:beforeAutospacing="1" w:after="30" w:afterAutospacing="1" w:line="276" w:lineRule="auto"/>
         <w:ind w:firstLine="720"/>
         <w:jc w:val="both"/>
         <w:rPr>
@@ -2911,7 +2974,7 @@
     </w:p>
     <w:p>
       <w:pPr>
-        <w:spacing w:before="0" w:beforeAutospacing="1" w:after="40" w:afterAutospacing="1" w:line="288" w:lineRule="auto"/>
+        <w:spacing w:before="0" w:beforeAutospacing="1" w:after="30" w:afterAutospacing="1" w:line="276" w:lineRule="auto"/>
         <w:ind w:firstLine="720"/>
         <w:jc w:val="both"/>
         <w:rPr>
@@ -2938,7 +3001,7 @@
     <w:p>
       <w:pPr>
         <w:keepNext/>
-        <w:spacing w:before="120" w:beforeAutospacing="1" w:after="60" w:afterAutospacing="1" w:line="288" w:lineRule="auto"/>
+        <w:spacing w:before="80" w:beforeAutospacing="1" w:after="40" w:afterAutospacing="1" w:line="276" w:lineRule="auto"/>
         <w:ind w:firstLine="0"/>
         <w:jc w:val="left"/>
         <w:rPr>
@@ -2980,7 +3043,7 @@
       <w:r>
         <w:drawing>
           <wp:inline xmlns:a="http://schemas.openxmlformats.org/drawingml/2006/main" xmlns:pic="http://schemas.openxmlformats.org/drawingml/2006/picture">
-            <wp:extent cx="3168000" cy="4224000"/>
+            <wp:extent cx="2340000" cy="3120000"/>
             <wp:docPr id="21" name="Picture 21"/>
             <wp:cNvGraphicFramePr>
               <a:graphicFrameLocks noChangeAspect="1"/>
@@ -3001,7 +3064,7 @@
                   <pic:spPr>
                     <a:xfrm>
                       <a:off x="0" y="0"/>
-                      <a:ext cx="3168000" cy="4224000"/>
+                      <a:ext cx="2340000" cy="3120000"/>
                     </a:xfrm>
                     <a:prstGeom prst="rect"/>
                   </pic:spPr>
@@ -3015,7 +3078,7 @@
     <w:p>
       <w:pPr>
         <w:keepNext/>
-        <w:spacing w:before="40" w:after="120" w:line="276" w:lineRule="auto"/>
+        <w:spacing w:before="20" w:after="80" w:line="264" w:lineRule="auto"/>
         <w:ind w:firstLine="0"/>
         <w:jc w:val="center"/>
       </w:pPr>
@@ -3024,14 +3087,14 @@
           <w:rFonts w:ascii="Times New Roman" w:hAnsi="Times New Roman" w:cs="Times New Roman" w:eastAsia="Times New Roman"/>
           <w:b w:val="0"/>
           <w:i/>
-          <w:sz w:val="22"/>
+          <w:sz w:val="20"/>
         </w:rPr>
         <w:t>Ảnh 5: Đế đặt bệnh phẩm có định vị trường quan sát</w:t>
       </w:r>
     </w:p>
     <w:p>
       <w:pPr>
-        <w:spacing w:before="0" w:beforeAutospacing="1" w:after="40" w:afterAutospacing="1" w:line="288" w:lineRule="auto"/>
+        <w:spacing w:before="0" w:beforeAutospacing="1" w:after="30" w:afterAutospacing="1" w:line="276" w:lineRule="auto"/>
         <w:ind w:firstLine="720"/>
         <w:jc w:val="both"/>
         <w:rPr>
@@ -3057,7 +3120,7 @@
     </w:p>
     <w:p>
       <w:pPr>
-        <w:spacing w:before="0" w:beforeAutospacing="1" w:after="40" w:afterAutospacing="1" w:line="288" w:lineRule="auto"/>
+        <w:spacing w:before="0" w:beforeAutospacing="1" w:after="30" w:afterAutospacing="1" w:line="276" w:lineRule="auto"/>
         <w:ind w:firstLine="720"/>
         <w:jc w:val="both"/>
         <w:rPr>
@@ -3085,7 +3148,7 @@
     <w:p>
       <w:pPr>
         <w:keepNext/>
-        <w:spacing w:before="120" w:beforeAutospacing="1" w:after="60" w:afterAutospacing="1" w:line="288" w:lineRule="auto"/>
+        <w:spacing w:before="80" w:beforeAutospacing="1" w:after="40" w:afterAutospacing="1" w:line="276" w:lineRule="auto"/>
         <w:ind w:firstLine="0"/>
         <w:jc w:val="left"/>
         <w:rPr>
@@ -3127,7 +3190,7 @@
       <w:r>
         <w:drawing>
           <wp:inline xmlns:a="http://schemas.openxmlformats.org/drawingml/2006/main" xmlns:pic="http://schemas.openxmlformats.org/drawingml/2006/picture">
-            <wp:extent cx="3060000" cy="4080000"/>
+            <wp:extent cx="2232000" cy="2976000"/>
             <wp:docPr id="22" name="Picture 22"/>
             <wp:cNvGraphicFramePr>
               <a:graphicFrameLocks noChangeAspect="1"/>
@@ -3148,7 +3211,7 @@
                   <pic:spPr>
                     <a:xfrm>
                       <a:off x="0" y="0"/>
-                      <a:ext cx="3060000" cy="4080000"/>
+                      <a:ext cx="2232000" cy="2976000"/>
                     </a:xfrm>
                     <a:prstGeom prst="rect"/>
                   </pic:spPr>
@@ -3162,7 +3225,7 @@
     <w:p>
       <w:pPr>
         <w:keepNext/>
-        <w:spacing w:before="40" w:after="120" w:line="276" w:lineRule="auto"/>
+        <w:spacing w:before="20" w:after="80" w:line="264" w:lineRule="auto"/>
         <w:ind w:firstLine="0"/>
         <w:jc w:val="center"/>
       </w:pPr>
@@ -3171,14 +3234,14 @@
           <w:rFonts w:ascii="Times New Roman" w:hAnsi="Times New Roman" w:cs="Times New Roman" w:eastAsia="Times New Roman"/>
           <w:b w:val="0"/>
           <w:i/>
-          <w:sz w:val="22"/>
+          <w:sz w:val="20"/>
         </w:rPr>
         <w:t>Ảnh 6: Bàn đạp chân USB kích hoạt lệnh chụp ảnh rảnh tay</w:t>
       </w:r>
     </w:p>
     <w:p>
       <w:pPr>
-        <w:spacing w:before="0" w:beforeAutospacing="1" w:after="40" w:afterAutospacing="1" w:line="288" w:lineRule="auto"/>
+        <w:spacing w:before="0" w:beforeAutospacing="1" w:after="30" w:afterAutospacing="1" w:line="276" w:lineRule="auto"/>
         <w:ind w:firstLine="720"/>
         <w:jc w:val="both"/>
         <w:rPr>
@@ -3204,7 +3267,7 @@
     </w:p>
     <w:p>
       <w:pPr>
-        <w:spacing w:before="0" w:beforeAutospacing="1" w:after="40" w:afterAutospacing="1" w:line="288" w:lineRule="auto"/>
+        <w:spacing w:before="0" w:beforeAutospacing="1" w:after="30" w:afterAutospacing="1" w:line="276" w:lineRule="auto"/>
         <w:ind w:firstLine="720"/>
         <w:jc w:val="both"/>
         <w:rPr>
@@ -3230,7 +3293,7 @@
     </w:p>
     <w:p>
       <w:pPr>
-        <w:spacing w:before="0" w:beforeAutospacing="1" w:after="40" w:afterAutospacing="1" w:line="288" w:lineRule="auto"/>
+        <w:spacing w:before="0" w:beforeAutospacing="1" w:after="30" w:afterAutospacing="1" w:line="276" w:lineRule="auto"/>
         <w:ind w:firstLine="720"/>
         <w:jc w:val="both"/>
         <w:rPr>
@@ -3269,7 +3332,7 @@
     <w:p>
       <w:pPr>
         <w:keepNext/>
-        <w:spacing w:before="120" w:beforeAutospacing="1" w:after="60" w:afterAutospacing="1" w:line="288" w:lineRule="auto"/>
+        <w:spacing w:before="80" w:beforeAutospacing="1" w:after="40" w:afterAutospacing="1" w:line="276" w:lineRule="auto"/>
         <w:ind w:firstLine="0"/>
         <w:jc w:val="left"/>
         <w:outlineLvl w:val="2"/>
@@ -3294,197 +3357,280 @@
         <w:t>2.1. Tính năng chung</w:t>
       </w:r>
     </w:p>
-    <w:p>
-      <w:pPr>
-        <w:keepNext/>
-        <w:spacing w:before="80" w:beforeAutospacing="1" w:after="40" w:afterAutospacing="1"/>
-        <w:ind w:firstLine="0"/>
+    <w:tbl>
+      <w:tblPr>
+        <w:tblW w:type="auto" w:w="0"/>
         <w:jc w:val="center"/>
-        <w:outlineLvl w:val="2"/>
-        <w:rPr>
-          <w:rFonts w:asciiTheme="majorHAnsi" w:hAnsiTheme="majorHAnsi" w:cstheme="majorHAnsi"/>
-          <w:bCs w:val="0"/>
-          <w:sz w:val="26"/>
-          <w:szCs w:val="26"/>
-          <w:lang w:val="vi-VN" w:eastAsia="vi-VN"/>
-        </w:rPr>
-      </w:pPr>
-      <w:r/>
-      <w:r>
-        <w:drawing>
-          <wp:inline xmlns:a="http://schemas.openxmlformats.org/drawingml/2006/main" xmlns:pic="http://schemas.openxmlformats.org/drawingml/2006/picture">
-            <wp:extent cx="2736000" cy="3648000"/>
-            <wp:docPr id="23" name="Picture 23"/>
-            <wp:cNvGraphicFramePr>
-              <a:graphicFrameLocks noChangeAspect="1"/>
-            </wp:cNvGraphicFramePr>
-            <a:graphic>
-              <a:graphicData uri="http://schemas.openxmlformats.org/drawingml/2006/picture">
-                <pic:pic>
-                  <pic:nvPicPr>
-                    <pic:cNvPr id="0" name="Ảnh 7.1.jpg"/>
-                    <pic:cNvPicPr/>
-                  </pic:nvPicPr>
-                  <pic:blipFill>
-                    <a:blip r:embed="rId19"/>
-                    <a:stretch>
-                      <a:fillRect/>
-                    </a:stretch>
-                  </pic:blipFill>
-                  <pic:spPr>
-                    <a:xfrm>
-                      <a:off x="0" y="0"/>
-                      <a:ext cx="2736000" cy="3648000"/>
-                    </a:xfrm>
-                    <a:prstGeom prst="rect"/>
-                  </pic:spPr>
-                </pic:pic>
-              </a:graphicData>
-            </a:graphic>
-          </wp:inline>
-        </w:drawing>
-      </w:r>
-    </w:p>
-    <w:p>
-      <w:pPr>
-        <w:keepNext/>
-        <w:spacing w:before="40" w:after="120" w:line="276" w:lineRule="auto"/>
-        <w:ind w:firstLine="0"/>
-        <w:jc w:val="center"/>
-      </w:pPr>
-      <w:r>
-        <w:rPr>
-          <w:rFonts w:ascii="Times New Roman" w:hAnsi="Times New Roman" w:cs="Times New Roman" w:eastAsia="Times New Roman"/>
-          <w:b w:val="0"/>
-          <w:i/>
-          <w:sz w:val="22"/>
-        </w:rPr>
-        <w:t>Ảnh 7a: Thao tác tiếp nhận và chụp lưu mẫu bệnh phẩm tại Khoa</w:t>
-      </w:r>
-    </w:p>
-    <w:p>
-      <w:pPr>
-        <w:keepNext/>
-        <w:spacing w:before="80" w:after="40"/>
-        <w:ind w:firstLine="0"/>
-        <w:jc w:val="center"/>
-      </w:pPr>
-      <w:r/>
-      <w:r>
-        <w:drawing>
-          <wp:inline xmlns:a="http://schemas.openxmlformats.org/drawingml/2006/main" xmlns:pic="http://schemas.openxmlformats.org/drawingml/2006/picture">
-            <wp:extent cx="2736000" cy="3648000"/>
-            <wp:docPr id="24" name="Picture 24"/>
-            <wp:cNvGraphicFramePr>
-              <a:graphicFrameLocks noChangeAspect="1"/>
-            </wp:cNvGraphicFramePr>
-            <a:graphic>
-              <a:graphicData uri="http://schemas.openxmlformats.org/drawingml/2006/picture">
-                <pic:pic>
-                  <pic:nvPicPr>
-                    <pic:cNvPr id="0" name="Ảnh 7.2.jpg"/>
-                    <pic:cNvPicPr/>
-                  </pic:nvPicPr>
-                  <pic:blipFill>
-                    <a:blip r:embed="rId20"/>
-                    <a:stretch>
-                      <a:fillRect/>
-                    </a:stretch>
-                  </pic:blipFill>
-                  <pic:spPr>
-                    <a:xfrm>
-                      <a:off x="0" y="0"/>
-                      <a:ext cx="2736000" cy="3648000"/>
-                    </a:xfrm>
-                    <a:prstGeom prst="rect"/>
-                  </pic:spPr>
-                </pic:pic>
-              </a:graphicData>
-            </a:graphic>
-          </wp:inline>
-        </w:drawing>
-      </w:r>
-    </w:p>
-    <w:p>
-      <w:pPr>
-        <w:keepNext/>
-        <w:spacing w:before="40" w:after="120" w:line="276" w:lineRule="auto"/>
-        <w:ind w:firstLine="0"/>
-        <w:jc w:val="center"/>
-      </w:pPr>
-      <w:r>
-        <w:rPr>
-          <w:rFonts w:ascii="Times New Roman" w:hAnsi="Times New Roman" w:cs="Times New Roman" w:eastAsia="Times New Roman"/>
-          <w:b w:val="0"/>
-          <w:i/>
-          <w:sz w:val="22"/>
-        </w:rPr>
-        <w:t>Ảnh 7b: Giao diện tiếp nhận và quản lý thông tin bệnh phẩm</w:t>
-      </w:r>
-    </w:p>
-    <w:p>
-      <w:pPr>
-        <w:keepNext/>
-        <w:spacing w:before="80" w:after="40"/>
-        <w:ind w:firstLine="0"/>
-        <w:jc w:val="center"/>
-      </w:pPr>
-      <w:r/>
-      <w:r>
-        <w:drawing>
-          <wp:inline xmlns:a="http://schemas.openxmlformats.org/drawingml/2006/main" xmlns:pic="http://schemas.openxmlformats.org/drawingml/2006/picture">
-            <wp:extent cx="4140000" cy="3105000"/>
-            <wp:docPr id="25" name="Picture 25"/>
-            <wp:cNvGraphicFramePr>
-              <a:graphicFrameLocks noChangeAspect="1"/>
-            </wp:cNvGraphicFramePr>
-            <a:graphic>
-              <a:graphicData uri="http://schemas.openxmlformats.org/drawingml/2006/picture">
-                <pic:pic>
-                  <pic:nvPicPr>
-                    <pic:cNvPr id="0" name="Ảnh 7.3.jpg"/>
-                    <pic:cNvPicPr/>
-                  </pic:nvPicPr>
-                  <pic:blipFill>
-                    <a:blip r:embed="rId21"/>
-                    <a:stretch>
-                      <a:fillRect/>
-                    </a:stretch>
-                  </pic:blipFill>
-                  <pic:spPr>
-                    <a:xfrm>
-                      <a:off x="0" y="0"/>
-                      <a:ext cx="4140000" cy="3105000"/>
-                    </a:xfrm>
-                    <a:prstGeom prst="rect"/>
-                  </pic:spPr>
-                </pic:pic>
-              </a:graphicData>
-            </a:graphic>
-          </wp:inline>
-        </w:drawing>
-      </w:r>
-    </w:p>
-    <w:p>
-      <w:pPr>
-        <w:keepNext/>
-        <w:spacing w:before="40" w:after="120" w:line="276" w:lineRule="auto"/>
-        <w:ind w:firstLine="0"/>
-        <w:jc w:val="center"/>
-      </w:pPr>
-      <w:r>
-        <w:rPr>
-          <w:rFonts w:ascii="Times New Roman" w:hAnsi="Times New Roman" w:cs="Times New Roman" w:eastAsia="Times New Roman"/>
-          <w:b w:val="0"/>
-          <w:i/>
-          <w:sz w:val="22"/>
-        </w:rPr>
-        <w:t>Ảnh 7c: Hồ sơ bằng chứng số được liên kết và lưu trữ hoàn chỉnh</w:t>
-      </w:r>
-    </w:p>
-    <w:p>
-      <w:pPr>
-        <w:spacing w:before="0" w:beforeAutospacing="1" w:after="40" w:afterAutospacing="1" w:line="288" w:lineRule="auto"/>
+        <w:tblLayout w:type="fixed"/>
+        <w:tblLook w:firstColumn="1" w:firstRow="1" w:lastColumn="0" w:lastRow="0" w:noHBand="0" w:noVBand="1" w:val="04A0"/>
+        <w:tblBorders>
+          <w:top w:val="none"/>
+          <w:left w:val="none"/>
+          <w:bottom w:val="none"/>
+          <w:right w:val="none"/>
+          <w:insideH w:val="none"/>
+          <w:insideV w:val="none"/>
+        </w:tblBorders>
+      </w:tblPr>
+      <w:tblGrid>
+        <w:gridCol w:w="3118"/>
+        <w:gridCol w:w="3118"/>
+        <w:gridCol w:w="3118"/>
+      </w:tblGrid>
+      <w:tr>
+        <w:trPr>
+          <w:cantSplit/>
+        </w:trPr>
+        <w:tc>
+          <w:tcPr>
+            <w:tcW w:type="dxa" w:w="3118"/>
+            <w:tcBorders>
+              <w:top w:val="none"/>
+              <w:left w:val="none"/>
+              <w:bottom w:val="none"/>
+              <w:right w:val="none"/>
+            </w:tcBorders>
+          </w:tcPr>
+          <w:p>
+            <w:pPr>
+              <w:keepNext/>
+              <w:spacing w:before="40" w:after="40"/>
+              <w:ind w:firstLine="0"/>
+              <w:jc w:val="center"/>
+            </w:pPr>
+            <w:r>
+              <w:drawing>
+                <wp:inline xmlns:a="http://schemas.openxmlformats.org/drawingml/2006/main" xmlns:pic="http://schemas.openxmlformats.org/drawingml/2006/picture">
+                  <wp:extent cx="1728000" cy="2304000"/>
+                  <wp:docPr id="23" name="Picture 23"/>
+                  <wp:cNvGraphicFramePr>
+                    <a:graphicFrameLocks noChangeAspect="1"/>
+                  </wp:cNvGraphicFramePr>
+                  <a:graphic>
+                    <a:graphicData uri="http://schemas.openxmlformats.org/drawingml/2006/picture">
+                      <pic:pic>
+                        <pic:nvPicPr>
+                          <pic:cNvPr id="0" name="Ảnh 7.1.jpg"/>
+                          <pic:cNvPicPr/>
+                        </pic:nvPicPr>
+                        <pic:blipFill>
+                          <a:blip r:embed="rId19"/>
+                          <a:stretch>
+                            <a:fillRect/>
+                          </a:stretch>
+                        </pic:blipFill>
+                        <pic:spPr>
+                          <a:xfrm>
+                            <a:off x="0" y="0"/>
+                            <a:ext cx="1728000" cy="2304000"/>
+                          </a:xfrm>
+                          <a:prstGeom prst="rect"/>
+                        </pic:spPr>
+                      </pic:pic>
+                    </a:graphicData>
+                  </a:graphic>
+                </wp:inline>
+              </w:drawing>
+            </w:r>
+          </w:p>
+        </w:tc>
+        <w:tc>
+          <w:tcPr>
+            <w:tcW w:type="dxa" w:w="3118"/>
+            <w:tcBorders>
+              <w:top w:val="none"/>
+              <w:left w:val="none"/>
+              <w:bottom w:val="none"/>
+              <w:right w:val="none"/>
+            </w:tcBorders>
+          </w:tcPr>
+          <w:p>
+            <w:pPr>
+              <w:keepNext/>
+              <w:spacing w:before="40" w:after="40"/>
+              <w:ind w:firstLine="0"/>
+              <w:jc w:val="center"/>
+            </w:pPr>
+            <w:r>
+              <w:drawing>
+                <wp:inline xmlns:a="http://schemas.openxmlformats.org/drawingml/2006/main" xmlns:pic="http://schemas.openxmlformats.org/drawingml/2006/picture">
+                  <wp:extent cx="1728000" cy="2304000"/>
+                  <wp:docPr id="24" name="Picture 24"/>
+                  <wp:cNvGraphicFramePr>
+                    <a:graphicFrameLocks noChangeAspect="1"/>
+                  </wp:cNvGraphicFramePr>
+                  <a:graphic>
+                    <a:graphicData uri="http://schemas.openxmlformats.org/drawingml/2006/picture">
+                      <pic:pic>
+                        <pic:nvPicPr>
+                          <pic:cNvPr id="0" name="Ảnh 7.2.jpg"/>
+                          <pic:cNvPicPr/>
+                        </pic:nvPicPr>
+                        <pic:blipFill>
+                          <a:blip r:embed="rId20"/>
+                          <a:stretch>
+                            <a:fillRect/>
+                          </a:stretch>
+                        </pic:blipFill>
+                        <pic:spPr>
+                          <a:xfrm>
+                            <a:off x="0" y="0"/>
+                            <a:ext cx="1728000" cy="2304000"/>
+                          </a:xfrm>
+                          <a:prstGeom prst="rect"/>
+                        </pic:spPr>
+                      </pic:pic>
+                    </a:graphicData>
+                  </a:graphic>
+                </wp:inline>
+              </w:drawing>
+            </w:r>
+          </w:p>
+        </w:tc>
+        <w:tc>
+          <w:tcPr>
+            <w:tcW w:type="dxa" w:w="3118"/>
+            <w:tcBorders>
+              <w:top w:val="none"/>
+              <w:left w:val="none"/>
+              <w:bottom w:val="none"/>
+              <w:right w:val="none"/>
+            </w:tcBorders>
+          </w:tcPr>
+          <w:p>
+            <w:pPr>
+              <w:keepNext/>
+              <w:spacing w:before="40" w:after="40"/>
+              <w:ind w:firstLine="0"/>
+              <w:jc w:val="center"/>
+            </w:pPr>
+            <w:r>
+              <w:drawing>
+                <wp:inline xmlns:a="http://schemas.openxmlformats.org/drawingml/2006/main" xmlns:pic="http://schemas.openxmlformats.org/drawingml/2006/picture">
+                  <wp:extent cx="1728000" cy="1296000"/>
+                  <wp:docPr id="25" name="Picture 25"/>
+                  <wp:cNvGraphicFramePr>
+                    <a:graphicFrameLocks noChangeAspect="1"/>
+                  </wp:cNvGraphicFramePr>
+                  <a:graphic>
+                    <a:graphicData uri="http://schemas.openxmlformats.org/drawingml/2006/picture">
+                      <pic:pic>
+                        <pic:nvPicPr>
+                          <pic:cNvPr id="0" name="Ảnh 7.3.jpg"/>
+                          <pic:cNvPicPr/>
+                        </pic:nvPicPr>
+                        <pic:blipFill>
+                          <a:blip r:embed="rId21"/>
+                          <a:stretch>
+                            <a:fillRect/>
+                          </a:stretch>
+                        </pic:blipFill>
+                        <pic:spPr>
+                          <a:xfrm>
+                            <a:off x="0" y="0"/>
+                            <a:ext cx="1728000" cy="1296000"/>
+                          </a:xfrm>
+                          <a:prstGeom prst="rect"/>
+                        </pic:spPr>
+                      </pic:pic>
+                    </a:graphicData>
+                  </a:graphic>
+                </wp:inline>
+              </w:drawing>
+            </w:r>
+          </w:p>
+        </w:tc>
+      </w:tr>
+      <w:tr>
+        <w:trPr>
+          <w:cantSplit/>
+        </w:trPr>
+        <w:tc>
+          <w:tcPr>
+            <w:tcW w:type="dxa" w:w="3118"/>
+            <w:tcBorders>
+              <w:top w:val="none"/>
+              <w:left w:val="none"/>
+              <w:bottom w:val="none"/>
+              <w:right w:val="none"/>
+            </w:tcBorders>
+          </w:tcPr>
+          <w:p>
+            <w:pPr>
+              <w:spacing w:before="20" w:after="60" w:line="264" w:lineRule="auto"/>
+              <w:ind w:firstLine="0"/>
+              <w:jc w:val="center"/>
+            </w:pPr>
+            <w:r>
+              <w:rPr>
+                <w:rFonts w:ascii="Times New Roman" w:hAnsi="Times New Roman" w:cs="Times New Roman" w:eastAsia="Times New Roman"/>
+                <w:b w:val="0"/>
+                <w:i/>
+                <w:sz w:val="20"/>
+              </w:rPr>
+              <w:t>Ảnh 7a: Tiếp nhận và chụp lưu mẫu</w:t>
+            </w:r>
+          </w:p>
+        </w:tc>
+        <w:tc>
+          <w:tcPr>
+            <w:tcW w:type="dxa" w:w="3118"/>
+            <w:tcBorders>
+              <w:top w:val="none"/>
+              <w:left w:val="none"/>
+              <w:bottom w:val="none"/>
+              <w:right w:val="none"/>
+            </w:tcBorders>
+          </w:tcPr>
+          <w:p>
+            <w:pPr>
+              <w:spacing w:before="20" w:after="60" w:line="264" w:lineRule="auto"/>
+              <w:ind w:firstLine="0"/>
+              <w:jc w:val="center"/>
+            </w:pPr>
+            <w:r>
+              <w:rPr>
+                <w:rFonts w:ascii="Times New Roman" w:hAnsi="Times New Roman" w:cs="Times New Roman" w:eastAsia="Times New Roman"/>
+                <w:b w:val="0"/>
+                <w:i/>
+                <w:sz w:val="20"/>
+              </w:rPr>
+              <w:t>Ảnh 7b: Giao diện tiếp nhận thông tin</w:t>
+            </w:r>
+          </w:p>
+        </w:tc>
+        <w:tc>
+          <w:tcPr>
+            <w:tcW w:type="dxa" w:w="3118"/>
+            <w:tcBorders>
+              <w:top w:val="none"/>
+              <w:left w:val="none"/>
+              <w:bottom w:val="none"/>
+              <w:right w:val="none"/>
+            </w:tcBorders>
+          </w:tcPr>
+          <w:p>
+            <w:pPr>
+              <w:spacing w:before="20" w:after="60" w:line="264" w:lineRule="auto"/>
+              <w:ind w:firstLine="0"/>
+              <w:jc w:val="center"/>
+            </w:pPr>
+            <w:r>
+              <w:rPr>
+                <w:rFonts w:ascii="Times New Roman" w:hAnsi="Times New Roman" w:cs="Times New Roman" w:eastAsia="Times New Roman"/>
+                <w:b w:val="0"/>
+                <w:i/>
+                <w:sz w:val="20"/>
+              </w:rPr>
+              <w:t>Ảnh 7c: Hồ sơ bằng chứng số</w:t>
+            </w:r>
+          </w:p>
+        </w:tc>
+      </w:tr>
+    </w:tbl>
+    <w:p>
+      <w:pPr>
+        <w:spacing w:before="0" w:beforeAutospacing="1" w:after="30" w:afterAutospacing="1" w:line="276" w:lineRule="auto"/>
         <w:ind w:firstLine="720"/>
         <w:jc w:val="both"/>
         <w:rPr>
@@ -3578,7 +3724,7 @@
     <w:p>
       <w:pPr>
         <w:keepNext/>
-        <w:spacing w:before="120" w:beforeAutospacing="1" w:after="60" w:afterAutospacing="1" w:line="288" w:lineRule="auto"/>
+        <w:spacing w:before="80" w:beforeAutospacing="1" w:after="40" w:afterAutospacing="1" w:line="276" w:lineRule="auto"/>
         <w:ind w:firstLine="0"/>
         <w:jc w:val="left"/>
         <w:outlineLvl w:val="2"/>
@@ -3629,7 +3775,7 @@
     </w:p>
     <w:p>
       <w:pPr>
-        <w:spacing w:before="0" w:beforeAutospacing="1" w:after="40" w:afterAutospacing="1" w:line="288" w:lineRule="auto"/>
+        <w:spacing w:before="0" w:beforeAutospacing="1" w:after="30" w:afterAutospacing="1" w:line="276" w:lineRule="auto"/>
         <w:ind w:firstLine="720"/>
         <w:jc w:val="both"/>
         <w:rPr>
@@ -3659,7 +3805,7 @@
           <w:ilvl w:val="0"/>
           <w:numId w:val="6"/>
         </w:numPr>
-        <w:spacing w:before="0" w:beforeAutospacing="1" w:after="40" w:afterAutospacing="1" w:line="288" w:lineRule="auto"/>
+        <w:spacing w:before="0" w:beforeAutospacing="1" w:after="30" w:afterAutospacing="1" w:line="276" w:lineRule="auto"/>
         <w:ind w:firstLine="720"/>
         <w:jc w:val="both"/>
         <w:rPr>
@@ -3689,7 +3835,7 @@
           <w:ilvl w:val="0"/>
           <w:numId w:val="6"/>
         </w:numPr>
-        <w:spacing w:before="0" w:beforeAutospacing="1" w:after="40" w:afterAutospacing="1" w:line="288" w:lineRule="auto"/>
+        <w:spacing w:before="0" w:beforeAutospacing="1" w:after="30" w:afterAutospacing="1" w:line="276" w:lineRule="auto"/>
         <w:ind w:firstLine="720"/>
         <w:jc w:val="both"/>
         <w:rPr>
@@ -3719,7 +3865,7 @@
           <w:ilvl w:val="0"/>
           <w:numId w:val="6"/>
         </w:numPr>
-        <w:spacing w:before="0" w:beforeAutospacing="1" w:after="40" w:afterAutospacing="1" w:line="288" w:lineRule="auto"/>
+        <w:spacing w:before="0" w:beforeAutospacing="1" w:after="30" w:afterAutospacing="1" w:line="276" w:lineRule="auto"/>
         <w:ind w:firstLine="720"/>
         <w:jc w:val="both"/>
         <w:rPr>
@@ -3749,7 +3895,7 @@
           <w:ilvl w:val="0"/>
           <w:numId w:val="6"/>
         </w:numPr>
-        <w:spacing w:before="0" w:beforeAutospacing="1" w:after="40" w:afterAutospacing="1" w:line="288" w:lineRule="auto"/>
+        <w:spacing w:before="0" w:beforeAutospacing="1" w:after="30" w:afterAutospacing="1" w:line="276" w:lineRule="auto"/>
         <w:ind w:firstLine="720"/>
         <w:jc w:val="both"/>
         <w:rPr>
@@ -3779,7 +3925,7 @@
           <w:ilvl w:val="0"/>
           <w:numId w:val="6"/>
         </w:numPr>
-        <w:spacing w:before="0" w:beforeAutospacing="1" w:after="40" w:afterAutospacing="1" w:line="288" w:lineRule="auto"/>
+        <w:spacing w:before="0" w:beforeAutospacing="1" w:after="30" w:afterAutospacing="1" w:line="276" w:lineRule="auto"/>
         <w:ind w:firstLine="720"/>
         <w:jc w:val="both"/>
         <w:rPr>
@@ -3809,7 +3955,7 @@
           <w:ilvl w:val="0"/>
           <w:numId w:val="6"/>
         </w:numPr>
-        <w:spacing w:before="0" w:beforeAutospacing="1" w:after="40" w:afterAutospacing="1" w:line="288" w:lineRule="auto"/>
+        <w:spacing w:before="0" w:beforeAutospacing="1" w:after="30" w:afterAutospacing="1" w:line="276" w:lineRule="auto"/>
         <w:ind w:firstLine="720"/>
         <w:jc w:val="both"/>
         <w:rPr>
@@ -3835,7 +3981,7 @@
     </w:p>
     <w:p>
       <w:pPr>
-        <w:spacing w:before="0" w:beforeAutospacing="1" w:after="40" w:afterAutospacing="1" w:line="288" w:lineRule="auto"/>
+        <w:spacing w:before="0" w:beforeAutospacing="1" w:after="30" w:afterAutospacing="1" w:line="276" w:lineRule="auto"/>
         <w:ind w:firstLine="720"/>
         <w:jc w:val="both"/>
         <w:rPr>
@@ -3890,7 +4036,7 @@
     <w:p>
       <w:pPr>
         <w:keepNext/>
-        <w:spacing w:before="120" w:beforeAutospacing="1" w:after="60" w:afterAutospacing="1" w:line="288" w:lineRule="auto"/>
+        <w:spacing w:before="80" w:beforeAutospacing="1" w:after="40" w:afterAutospacing="1" w:line="276" w:lineRule="auto"/>
         <w:ind w:firstLine="0"/>
         <w:jc w:val="left"/>
         <w:rPr>
@@ -3935,7 +4081,7 @@
     </w:p>
     <w:p>
       <w:pPr>
-        <w:spacing w:before="0" w:beforeAutospacing="1" w:after="40" w:afterAutospacing="1" w:line="288" w:lineRule="auto"/>
+        <w:spacing w:before="0" w:beforeAutospacing="1" w:after="30" w:afterAutospacing="1" w:line="276" w:lineRule="auto"/>
         <w:ind w:firstLine="720"/>
         <w:jc w:val="both"/>
         <w:rPr>
@@ -3958,7 +4104,7 @@
     </w:p>
     <w:p>
       <w:pPr>
-        <w:spacing w:before="0" w:beforeAutospacing="1" w:after="40" w:afterAutospacing="1" w:line="288" w:lineRule="auto"/>
+        <w:spacing w:before="0" w:beforeAutospacing="1" w:after="30" w:afterAutospacing="1" w:line="276" w:lineRule="auto"/>
         <w:ind w:firstLine="720"/>
         <w:jc w:val="both"/>
         <w:rPr>
@@ -3981,7 +4127,7 @@
     </w:p>
     <w:p>
       <w:pPr>
-        <w:spacing w:before="0" w:beforeAutospacing="1" w:after="40" w:afterAutospacing="1" w:line="288" w:lineRule="auto"/>
+        <w:spacing w:before="0" w:beforeAutospacing="1" w:after="30" w:afterAutospacing="1" w:line="276" w:lineRule="auto"/>
         <w:ind w:firstLine="720"/>
         <w:jc w:val="both"/>
         <w:rPr>
@@ -4005,7 +4151,7 @@
     <w:p>
       <w:pPr>
         <w:keepNext/>
-        <w:spacing w:before="120" w:beforeAutospacing="1" w:after="60" w:afterAutospacing="1" w:line="288" w:lineRule="auto"/>
+        <w:spacing w:before="80" w:beforeAutospacing="1" w:after="40" w:afterAutospacing="1" w:line="276" w:lineRule="auto"/>
         <w:ind w:firstLine="0"/>
         <w:jc w:val="left"/>
         <w:rPr>
@@ -4050,7 +4196,7 @@
     </w:p>
     <w:p>
       <w:pPr>
-        <w:spacing w:before="0" w:beforeAutospacing="1" w:after="40" w:afterAutospacing="1" w:line="288" w:lineRule="auto"/>
+        <w:spacing w:before="0" w:beforeAutospacing="1" w:after="30" w:afterAutospacing="1" w:line="276" w:lineRule="auto"/>
         <w:ind w:firstLine="720"/>
         <w:jc w:val="both"/>
         <w:rPr>
@@ -4227,7 +4373,7 @@
     </w:p>
     <w:p>
       <w:pPr>
-        <w:spacing w:before="0" w:beforeAutospacing="1" w:after="40" w:afterAutospacing="1" w:line="288" w:lineRule="auto"/>
+        <w:spacing w:before="0" w:beforeAutospacing="1" w:after="30" w:afterAutospacing="1" w:line="276" w:lineRule="auto"/>
         <w:ind w:firstLine="720"/>
         <w:jc w:val="both"/>
         <w:rPr>
@@ -4250,7 +4396,7 @@
     </w:p>
     <w:p>
       <w:pPr>
-        <w:spacing w:before="0" w:beforeAutospacing="1" w:after="40" w:afterAutospacing="1" w:line="288" w:lineRule="auto"/>
+        <w:spacing w:before="0" w:beforeAutospacing="1" w:after="30" w:afterAutospacing="1" w:line="276" w:lineRule="auto"/>
         <w:ind w:firstLine="720"/>
         <w:jc w:val="both"/>
         <w:rPr>
@@ -4273,7 +4419,7 @@
     </w:p>
     <w:p>
       <w:pPr>
-        <w:spacing w:before="0" w:beforeAutospacing="1" w:after="40" w:afterAutospacing="1" w:line="288" w:lineRule="auto"/>
+        <w:spacing w:before="0" w:beforeAutospacing="1" w:after="30" w:afterAutospacing="1" w:line="276" w:lineRule="auto"/>
         <w:ind w:firstLine="720"/>
         <w:jc w:val="both"/>
         <w:rPr>
@@ -4300,7 +4446,7 @@
           <w:ilvl w:val="0"/>
           <w:numId w:val="8"/>
         </w:numPr>
-        <w:spacing w:before="0" w:beforeAutospacing="1" w:after="40" w:afterAutospacing="1" w:line="288" w:lineRule="auto"/>
+        <w:spacing w:before="0" w:beforeAutospacing="1" w:after="30" w:afterAutospacing="1" w:line="276" w:lineRule="auto"/>
         <w:ind w:firstLine="720"/>
         <w:jc w:val="both"/>
         <w:rPr>
@@ -4336,7 +4482,7 @@
           <w:ilvl w:val="0"/>
           <w:numId w:val="8"/>
         </w:numPr>
-        <w:spacing w:before="0" w:beforeAutospacing="1" w:after="40" w:afterAutospacing="1" w:line="288" w:lineRule="auto"/>
+        <w:spacing w:before="0" w:beforeAutospacing="1" w:after="30" w:afterAutospacing="1" w:line="276" w:lineRule="auto"/>
         <w:ind w:firstLine="720"/>
         <w:jc w:val="both"/>
         <w:rPr>
@@ -4363,7 +4509,7 @@
           <w:ilvl w:val="0"/>
           <w:numId w:val="8"/>
         </w:numPr>
-        <w:spacing w:before="0" w:beforeAutospacing="1" w:after="40" w:afterAutospacing="1" w:line="288" w:lineRule="auto"/>
+        <w:spacing w:before="0" w:beforeAutospacing="1" w:after="30" w:afterAutospacing="1" w:line="276" w:lineRule="auto"/>
         <w:ind w:firstLine="720"/>
         <w:jc w:val="both"/>
         <w:rPr>
@@ -4390,7 +4536,7 @@
           <w:ilvl w:val="0"/>
           <w:numId w:val="8"/>
         </w:numPr>
-        <w:spacing w:before="0" w:beforeAutospacing="1" w:after="40" w:afterAutospacing="1" w:line="288" w:lineRule="auto"/>
+        <w:spacing w:before="0" w:beforeAutospacing="1" w:after="30" w:afterAutospacing="1" w:line="276" w:lineRule="auto"/>
         <w:ind w:firstLine="720"/>
         <w:jc w:val="both"/>
         <w:rPr>
@@ -4417,7 +4563,7 @@
           <w:ilvl w:val="0"/>
           <w:numId w:val="8"/>
         </w:numPr>
-        <w:spacing w:before="0" w:beforeAutospacing="1" w:after="40" w:afterAutospacing="1" w:line="288" w:lineRule="auto"/>
+        <w:spacing w:before="0" w:beforeAutospacing="1" w:after="30" w:afterAutospacing="1" w:line="276" w:lineRule="auto"/>
         <w:ind w:firstLine="720"/>
         <w:jc w:val="both"/>
         <w:rPr>
@@ -4440,7 +4586,7 @@
     </w:p>
     <w:p>
       <w:pPr>
-        <w:spacing w:before="0" w:beforeAutospacing="1" w:after="40" w:afterAutospacing="1" w:line="288" w:lineRule="auto"/>
+        <w:spacing w:before="0" w:beforeAutospacing="1" w:after="30" w:afterAutospacing="1" w:line="276" w:lineRule="auto"/>
         <w:ind w:firstLine="720"/>
         <w:jc w:val="both"/>
         <w:rPr>
@@ -4465,7 +4611,7 @@
     <w:p>
       <w:pPr>
         <w:keepNext/>
-        <w:spacing w:before="120" w:beforeAutospacing="1" w:after="60" w:afterAutospacing="1" w:line="288" w:lineRule="auto"/>
+        <w:spacing w:before="80" w:beforeAutospacing="1" w:after="40" w:afterAutospacing="1" w:line="276" w:lineRule="auto"/>
         <w:ind w:firstLine="0"/>
         <w:jc w:val="left"/>
         <w:rPr>
@@ -4521,7 +4667,7 @@
     </w:p>
     <w:p>
       <w:pPr>
-        <w:spacing w:before="0" w:beforeAutospacing="1" w:after="40" w:afterAutospacing="1" w:line="288" w:lineRule="auto"/>
+        <w:spacing w:before="0" w:beforeAutospacing="1" w:after="30" w:afterAutospacing="1" w:line="276" w:lineRule="auto"/>
         <w:ind w:firstLine="720"/>
         <w:jc w:val="both"/>
         <w:rPr>
@@ -4544,7 +4690,7 @@
     </w:p>
     <w:p>
       <w:pPr>
-        <w:spacing w:before="0" w:beforeAutospacing="1" w:after="40" w:afterAutospacing="1" w:line="288" w:lineRule="auto"/>
+        <w:spacing w:before="0" w:beforeAutospacing="1" w:after="30" w:afterAutospacing="1" w:line="276" w:lineRule="auto"/>
         <w:ind w:firstLine="720"/>
         <w:jc w:val="both"/>
         <w:rPr>
@@ -4568,7 +4714,7 @@
     <w:p>
       <w:pPr>
         <w:keepNext/>
-        <w:spacing w:before="120" w:beforeAutospacing="1" w:after="60" w:afterAutospacing="1" w:line="288" w:lineRule="auto"/>
+        <w:spacing w:before="80" w:beforeAutospacing="1" w:after="40" w:afterAutospacing="1" w:line="276" w:lineRule="auto"/>
         <w:ind w:firstLine="0"/>
         <w:jc w:val="left"/>
         <w:rPr>
@@ -4602,7 +4748,7 @@
     </w:p>
     <w:p>
       <w:pPr>
-        <w:spacing w:before="0" w:beforeAutospacing="1" w:after="40" w:afterAutospacing="1" w:line="288" w:lineRule="auto"/>
+        <w:spacing w:before="0" w:beforeAutospacing="1" w:after="30" w:afterAutospacing="1" w:line="276" w:lineRule="auto"/>
         <w:ind w:firstLine="720"/>
         <w:jc w:val="both"/>
         <w:rPr>
@@ -4655,7 +4801,7 @@
     </w:p>
     <w:p>
       <w:pPr>
-        <w:spacing w:before="0" w:beforeAutospacing="1" w:after="40" w:afterAutospacing="1" w:line="288" w:lineRule="auto"/>
+        <w:spacing w:before="0" w:beforeAutospacing="1" w:after="30" w:afterAutospacing="1" w:line="276" w:lineRule="auto"/>
         <w:ind w:firstLine="720"/>
         <w:jc w:val="both"/>
         <w:rPr>
@@ -4698,7 +4844,7 @@
     </w:p>
     <w:p>
       <w:pPr>
-        <w:spacing w:before="0" w:beforeAutospacing="1" w:after="40" w:afterAutospacing="1" w:line="288" w:lineRule="auto"/>
+        <w:spacing w:before="0" w:beforeAutospacing="1" w:after="30" w:afterAutospacing="1" w:line="276" w:lineRule="auto"/>
         <w:ind w:firstLine="720"/>
         <w:jc w:val="both"/>
         <w:rPr>
@@ -4722,7 +4868,7 @@
     <w:p>
       <w:pPr>
         <w:keepNext/>
-        <w:spacing w:before="120" w:beforeAutospacing="1" w:after="60" w:afterAutospacing="1" w:line="288" w:lineRule="auto"/>
+        <w:spacing w:before="80" w:beforeAutospacing="1" w:after="40" w:afterAutospacing="1" w:line="276" w:lineRule="auto"/>
         <w:ind w:firstLine="0"/>
         <w:jc w:val="left"/>
         <w:rPr>
@@ -4767,7 +4913,7 @@
     </w:p>
     <w:p>
       <w:pPr>
-        <w:spacing w:before="0" w:beforeAutospacing="1" w:after="40" w:afterAutospacing="1" w:line="288" w:lineRule="auto"/>
+        <w:spacing w:before="0" w:beforeAutospacing="1" w:after="30" w:afterAutospacing="1" w:line="276" w:lineRule="auto"/>
         <w:ind w:firstLine="720"/>
         <w:jc w:val="both"/>
         <w:rPr>
@@ -4866,7 +5012,7 @@
     <w:p>
       <w:pPr>
         <w:keepNext/>
-        <w:spacing w:before="120" w:beforeAutospacing="1" w:after="60" w:afterAutospacing="1" w:line="288" w:lineRule="auto"/>
+        <w:spacing w:before="80" w:beforeAutospacing="1" w:after="40" w:afterAutospacing="1" w:line="276" w:lineRule="auto"/>
         <w:ind w:firstLine="0"/>
         <w:jc w:val="left"/>
         <w:rPr>
@@ -4900,7 +5046,7 @@
     </w:p>
     <w:p>
       <w:pPr>
-        <w:spacing w:before="0" w:beforeAutospacing="1" w:after="40" w:afterAutospacing="1" w:line="288" w:lineRule="auto"/>
+        <w:spacing w:before="0" w:beforeAutospacing="1" w:after="30" w:afterAutospacing="1" w:line="276" w:lineRule="auto"/>
         <w:ind w:firstLine="720"/>
         <w:jc w:val="both"/>
         <w:rPr>
@@ -4923,7 +5069,7 @@
     </w:p>
     <w:p>
       <w:pPr>
-        <w:spacing w:before="0" w:beforeAutospacing="1" w:after="40" w:afterAutospacing="1" w:line="288" w:lineRule="auto"/>
+        <w:spacing w:before="0" w:beforeAutospacing="1" w:after="30" w:afterAutospacing="1" w:line="276" w:lineRule="auto"/>
         <w:ind w:firstLine="720"/>
         <w:jc w:val="both"/>
         <w:rPr>
@@ -4947,7 +5093,7 @@
     </w:p>
     <w:p>
       <w:pPr>
-        <w:spacing w:before="0" w:beforeAutospacing="1" w:after="40" w:afterAutospacing="1" w:line="288" w:lineRule="auto"/>
+        <w:spacing w:before="0" w:beforeAutospacing="1" w:after="30" w:afterAutospacing="1" w:line="276" w:lineRule="auto"/>
         <w:ind w:firstLine="720"/>
         <w:jc w:val="both"/>
         <w:rPr>
@@ -4971,7 +5117,7 @@
     <w:p>
       <w:pPr>
         <w:keepNext/>
-        <w:spacing w:before="120" w:beforeAutospacing="1" w:after="60" w:afterAutospacing="1" w:line="288" w:lineRule="auto"/>
+        <w:spacing w:before="80" w:beforeAutospacing="1" w:after="40" w:afterAutospacing="1" w:line="276" w:lineRule="auto"/>
         <w:ind w:firstLine="0"/>
         <w:jc w:val="left"/>
         <w:outlineLvl w:val="2"/>
@@ -4998,7 +5144,7 @@
     </w:p>
     <w:p>
       <w:pPr>
-        <w:spacing w:before="0" w:beforeAutospacing="1" w:after="40" w:afterAutospacing="1" w:line="288" w:lineRule="auto"/>
+        <w:spacing w:before="0" w:beforeAutospacing="1" w:after="30" w:afterAutospacing="1" w:line="276" w:lineRule="auto"/>
         <w:ind w:firstLine="720"/>
         <w:jc w:val="both"/>
         <w:rPr>
@@ -5024,7 +5170,7 @@
     </w:p>
     <w:p>
       <w:pPr>
-        <w:spacing w:before="0" w:beforeAutospacing="1" w:after="40" w:afterAutospacing="1" w:line="288" w:lineRule="auto"/>
+        <w:spacing w:before="0" w:beforeAutospacing="1" w:after="30" w:afterAutospacing="1" w:line="276" w:lineRule="auto"/>
         <w:ind w:firstLine="720"/>
         <w:jc w:val="both"/>
         <w:rPr>
@@ -5050,7 +5196,7 @@
     </w:p>
     <w:p>
       <w:pPr>
-        <w:spacing w:before="0" w:beforeAutospacing="1" w:after="40" w:afterAutospacing="1" w:line="288" w:lineRule="auto"/>
+        <w:spacing w:before="0" w:beforeAutospacing="1" w:after="30" w:afterAutospacing="1" w:line="276" w:lineRule="auto"/>
         <w:ind w:firstLine="720"/>
         <w:jc w:val="both"/>
         <w:rPr>
@@ -5076,7 +5222,7 @@
     </w:p>
     <w:p>
       <w:pPr>
-        <w:spacing w:before="0" w:beforeAutospacing="1" w:after="40" w:afterAutospacing="1" w:line="288" w:lineRule="auto"/>
+        <w:spacing w:before="0" w:beforeAutospacing="1" w:after="30" w:afterAutospacing="1" w:line="276" w:lineRule="auto"/>
         <w:ind w:firstLine="720"/>
         <w:jc w:val="both"/>
         <w:rPr>
@@ -5102,7 +5248,7 @@
     </w:p>
     <w:p>
       <w:pPr>
-        <w:spacing w:before="0" w:beforeAutospacing="1" w:after="40" w:afterAutospacing="1" w:line="288" w:lineRule="auto"/>
+        <w:spacing w:before="0" w:beforeAutospacing="1" w:after="30" w:afterAutospacing="1" w:line="276" w:lineRule="auto"/>
         <w:ind w:firstLine="720"/>
         <w:jc w:val="both"/>
         <w:rPr>
@@ -5129,7 +5275,7 @@
     <w:p>
       <w:pPr>
         <w:keepNext/>
-        <w:spacing w:before="120" w:after="60" w:line="288" w:lineRule="auto"/>
+        <w:spacing w:before="80" w:after="40" w:line="276" w:lineRule="auto"/>
         <w:ind w:firstLine="0"/>
         <w:jc w:val="left"/>
         <w:outlineLvl w:val="3"/>
@@ -5178,7 +5324,7 @@
     <w:p>
       <w:pPr>
         <w:keepNext/>
-        <w:spacing w:before="120" w:beforeAutospacing="1" w:after="60" w:afterAutospacing="1" w:line="288" w:lineRule="auto"/>
+        <w:spacing w:before="80" w:beforeAutospacing="1" w:after="40" w:afterAutospacing="1" w:line="276" w:lineRule="auto"/>
         <w:ind w:firstLine="0"/>
         <w:jc w:val="left"/>
         <w:outlineLvl w:val="2"/>
@@ -5229,7 +5375,7 @@
     </w:p>
     <w:p>
       <w:pPr>
-        <w:spacing w:before="0" w:beforeAutospacing="1" w:after="40" w:afterAutospacing="1" w:line="288" w:lineRule="auto"/>
+        <w:spacing w:before="0" w:beforeAutospacing="1" w:after="30" w:afterAutospacing="1" w:line="276" w:lineRule="auto"/>
         <w:ind w:firstLine="720"/>
         <w:jc w:val="both"/>
         <w:rPr>
@@ -5259,7 +5405,7 @@
           <w:ilvl w:val="0"/>
           <w:numId w:val="1"/>
         </w:numPr>
-        <w:spacing w:before="0" w:beforeAutospacing="1" w:after="40" w:afterAutospacing="1" w:line="288" w:lineRule="auto"/>
+        <w:spacing w:before="0" w:beforeAutospacing="1" w:after="30" w:afterAutospacing="1" w:line="276" w:lineRule="auto"/>
         <w:ind w:firstLine="720"/>
         <w:jc w:val="both"/>
         <w:rPr>
@@ -5289,7 +5435,7 @@
           <w:ilvl w:val="0"/>
           <w:numId w:val="1"/>
         </w:numPr>
-        <w:spacing w:before="0" w:beforeAutospacing="1" w:after="40" w:afterAutospacing="1" w:line="288" w:lineRule="auto"/>
+        <w:spacing w:before="0" w:beforeAutospacing="1" w:after="30" w:afterAutospacing="1" w:line="276" w:lineRule="auto"/>
         <w:ind w:firstLine="720"/>
         <w:jc w:val="both"/>
         <w:rPr>
@@ -5319,7 +5465,7 @@
           <w:ilvl w:val="0"/>
           <w:numId w:val="1"/>
         </w:numPr>
-        <w:spacing w:before="0" w:beforeAutospacing="1" w:after="40" w:afterAutospacing="1" w:line="288" w:lineRule="auto"/>
+        <w:spacing w:before="0" w:beforeAutospacing="1" w:after="30" w:afterAutospacing="1" w:line="276" w:lineRule="auto"/>
         <w:ind w:firstLine="720"/>
         <w:jc w:val="both"/>
         <w:rPr>
@@ -5349,7 +5495,7 @@
           <w:ilvl w:val="0"/>
           <w:numId w:val="1"/>
         </w:numPr>
-        <w:spacing w:before="0" w:beforeAutospacing="1" w:after="40" w:afterAutospacing="1" w:line="288" w:lineRule="auto"/>
+        <w:spacing w:before="0" w:beforeAutospacing="1" w:after="30" w:afterAutospacing="1" w:line="276" w:lineRule="auto"/>
         <w:ind w:firstLine="720"/>
         <w:jc w:val="both"/>
         <w:rPr>
@@ -5379,7 +5525,7 @@
           <w:ilvl w:val="0"/>
           <w:numId w:val="1"/>
         </w:numPr>
-        <w:spacing w:before="0" w:beforeAutospacing="1" w:after="40" w:afterAutospacing="1" w:line="288" w:lineRule="auto"/>
+        <w:spacing w:before="0" w:beforeAutospacing="1" w:after="30" w:afterAutospacing="1" w:line="276" w:lineRule="auto"/>
         <w:ind w:firstLine="720"/>
         <w:jc w:val="both"/>
         <w:rPr>
@@ -5410,7 +5556,7 @@
           <w:ilvl w:val="0"/>
           <w:numId w:val="1"/>
         </w:numPr>
-        <w:spacing w:before="0" w:beforeAutospacing="1" w:after="40" w:afterAutospacing="1" w:line="288" w:lineRule="auto"/>
+        <w:spacing w:before="0" w:beforeAutospacing="1" w:after="30" w:afterAutospacing="1" w:line="276" w:lineRule="auto"/>
         <w:ind w:firstLine="720"/>
         <w:jc w:val="both"/>
         <w:rPr>
@@ -5440,7 +5586,7 @@
           <w:ilvl w:val="0"/>
           <w:numId w:val="1"/>
         </w:numPr>
-        <w:spacing w:before="0" w:beforeAutospacing="1" w:after="40" w:afterAutospacing="1" w:line="288" w:lineRule="auto"/>
+        <w:spacing w:before="0" w:beforeAutospacing="1" w:after="30" w:afterAutospacing="1" w:line="276" w:lineRule="auto"/>
         <w:ind w:firstLine="720"/>
         <w:jc w:val="both"/>
         <w:rPr>
@@ -5470,7 +5616,7 @@
           <w:ilvl w:val="0"/>
           <w:numId w:val="1"/>
         </w:numPr>
-        <w:spacing w:before="0" w:beforeAutospacing="1" w:after="40" w:afterAutospacing="1" w:line="288" w:lineRule="auto"/>
+        <w:spacing w:before="0" w:beforeAutospacing="1" w:after="30" w:afterAutospacing="1" w:line="276" w:lineRule="auto"/>
         <w:ind w:firstLine="720"/>
         <w:jc w:val="both"/>
         <w:rPr>
@@ -5496,7 +5642,7 @@
     </w:p>
     <w:p>
       <w:pPr>
-        <w:spacing w:before="0" w:beforeAutospacing="1" w:after="40" w:afterAutospacing="1" w:line="288" w:lineRule="auto"/>
+        <w:spacing w:before="0" w:beforeAutospacing="1" w:after="30" w:afterAutospacing="1" w:line="276" w:lineRule="auto"/>
         <w:ind w:firstLine="720"/>
         <w:jc w:val="both"/>
         <w:rPr>
@@ -5523,7 +5669,7 @@
     <w:p>
       <w:pPr>
         <w:keepNext/>
-        <w:spacing w:before="120" w:beforeAutospacing="1" w:after="60" w:afterAutospacing="1" w:line="288" w:lineRule="auto"/>
+        <w:spacing w:before="80" w:beforeAutospacing="1" w:after="40" w:afterAutospacing="1" w:line="276" w:lineRule="auto"/>
         <w:ind w:firstLine="0"/>
         <w:jc w:val="left"/>
         <w:outlineLvl w:val="2"/>
@@ -5574,7 +5720,7 @@
     </w:p>
     <w:p>
       <w:pPr>
-        <w:spacing w:before="0" w:beforeAutospacing="1" w:after="40" w:afterAutospacing="1" w:line="288" w:lineRule="auto"/>
+        <w:spacing w:before="0" w:beforeAutospacing="1" w:after="30" w:afterAutospacing="1" w:line="276" w:lineRule="auto"/>
         <w:ind w:firstLine="720"/>
         <w:jc w:val="both"/>
         <w:rPr>
@@ -5597,7 +5743,7 @@
     </w:p>
     <w:p>
       <w:pPr>
-        <w:spacing w:before="0" w:beforeAutospacing="1" w:after="40" w:afterAutospacing="1" w:line="288" w:lineRule="auto"/>
+        <w:spacing w:before="0" w:beforeAutospacing="1" w:after="30" w:afterAutospacing="1" w:line="276" w:lineRule="auto"/>
         <w:ind w:firstLine="720"/>
         <w:jc w:val="both"/>
         <w:rPr>
@@ -5625,7 +5771,7 @@
           <w:ilvl w:val="0"/>
           <w:numId w:val="10"/>
         </w:numPr>
-        <w:spacing w:before="0" w:beforeAutospacing="1" w:after="40" w:afterAutospacing="1" w:line="288" w:lineRule="auto"/>
+        <w:spacing w:before="0" w:beforeAutospacing="1" w:after="30" w:afterAutospacing="1" w:line="276" w:lineRule="auto"/>
         <w:ind w:firstLine="720"/>
         <w:jc w:val="both"/>
         <w:rPr>
@@ -5683,7 +5829,7 @@
           <w:ilvl w:val="0"/>
           <w:numId w:val="10"/>
         </w:numPr>
-        <w:spacing w:before="0" w:beforeAutospacing="1" w:after="40" w:afterAutospacing="1" w:line="288" w:lineRule="auto"/>
+        <w:spacing w:before="0" w:beforeAutospacing="1" w:after="30" w:afterAutospacing="1" w:line="276" w:lineRule="auto"/>
         <w:ind w:firstLine="720"/>
         <w:jc w:val="both"/>
         <w:rPr>
@@ -5733,7 +5879,7 @@
           <w:ilvl w:val="0"/>
           <w:numId w:val="10"/>
         </w:numPr>
-        <w:spacing w:before="0" w:beforeAutospacing="1" w:after="40" w:afterAutospacing="1" w:line="288" w:lineRule="auto"/>
+        <w:spacing w:before="0" w:beforeAutospacing="1" w:after="30" w:afterAutospacing="1" w:line="276" w:lineRule="auto"/>
         <w:ind w:firstLine="720"/>
         <w:jc w:val="both"/>
         <w:rPr>
@@ -5761,7 +5907,7 @@
           <w:ilvl w:val="0"/>
           <w:numId w:val="10"/>
         </w:numPr>
-        <w:spacing w:before="0" w:beforeAutospacing="1" w:after="40" w:afterAutospacing="1" w:line="288" w:lineRule="auto"/>
+        <w:spacing w:before="0" w:beforeAutospacing="1" w:after="30" w:afterAutospacing="1" w:line="276" w:lineRule="auto"/>
         <w:ind w:firstLine="720"/>
         <w:jc w:val="both"/>
         <w:rPr>
@@ -5789,7 +5935,7 @@
           <w:ilvl w:val="0"/>
           <w:numId w:val="10"/>
         </w:numPr>
-        <w:spacing w:before="0" w:beforeAutospacing="1" w:after="40" w:afterAutospacing="1" w:line="288" w:lineRule="auto"/>
+        <w:spacing w:before="0" w:beforeAutospacing="1" w:after="30" w:afterAutospacing="1" w:line="276" w:lineRule="auto"/>
         <w:ind w:firstLine="720"/>
         <w:jc w:val="both"/>
         <w:rPr>
@@ -5812,7 +5958,7 @@
     </w:p>
     <w:p>
       <w:pPr>
-        <w:spacing w:before="0" w:beforeAutospacing="1" w:after="40" w:afterAutospacing="1" w:line="288" w:lineRule="auto"/>
+        <w:spacing w:before="0" w:beforeAutospacing="1" w:after="30" w:afterAutospacing="1" w:line="276" w:lineRule="auto"/>
         <w:ind w:firstLine="720"/>
         <w:jc w:val="both"/>
         <w:rPr>
@@ -5836,7 +5982,7 @@
     <w:p>
       <w:pPr>
         <w:keepNext/>
-        <w:spacing w:before="120" w:beforeAutospacing="1" w:after="60" w:afterAutospacing="1" w:line="288" w:lineRule="auto"/>
+        <w:spacing w:before="80" w:beforeAutospacing="1" w:after="40" w:afterAutospacing="1" w:line="276" w:lineRule="auto"/>
         <w:ind w:firstLine="0"/>
         <w:jc w:val="left"/>
         <w:outlineLvl w:val="2"/>
@@ -5871,7 +6017,7 @@
     </w:p>
     <w:p>
       <w:pPr>
-        <w:spacing w:before="0" w:beforeAutospacing="1" w:after="40" w:afterAutospacing="1" w:line="288" w:lineRule="auto"/>
+        <w:spacing w:before="0" w:beforeAutospacing="1" w:after="30" w:afterAutospacing="1" w:line="276" w:lineRule="auto"/>
         <w:ind w:firstLine="720"/>
         <w:jc w:val="both"/>
         <w:rPr>
@@ -5894,7 +6040,7 @@
     </w:p>
     <w:p>
       <w:pPr>
-        <w:spacing w:before="0" w:beforeAutospacing="1" w:after="40" w:afterAutospacing="1" w:line="288" w:lineRule="auto"/>
+        <w:spacing w:before="0" w:beforeAutospacing="1" w:after="30" w:afterAutospacing="1" w:line="276" w:lineRule="auto"/>
         <w:ind w:firstLine="720"/>
         <w:jc w:val="both"/>
         <w:rPr>
@@ -6006,7 +6152,7 @@
     <w:p>
       <w:pPr>
         <w:keepNext/>
-        <w:spacing w:before="120" w:beforeAutospacing="1" w:after="60" w:afterAutospacing="1" w:line="288" w:lineRule="auto"/>
+        <w:spacing w:before="80" w:beforeAutospacing="1" w:after="40" w:afterAutospacing="1" w:line="276" w:lineRule="auto"/>
         <w:ind w:firstLine="0"/>
         <w:jc w:val="left"/>
         <w:outlineLvl w:val="2"/>
@@ -6041,7 +6187,7 @@
     </w:p>
     <w:p>
       <w:pPr>
-        <w:spacing w:before="0" w:beforeAutospacing="1" w:after="40" w:afterAutospacing="1" w:line="288" w:lineRule="auto"/>
+        <w:spacing w:before="0" w:beforeAutospacing="1" w:after="30" w:afterAutospacing="1" w:line="276" w:lineRule="auto"/>
         <w:ind w:firstLine="720"/>
         <w:jc w:val="both"/>
         <w:rPr>
@@ -6065,7 +6211,7 @@
     <w:p>
       <w:pPr>
         <w:keepNext/>
-        <w:spacing w:before="80" w:beforeAutospacing="1" w:after="40" w:afterAutospacing="1" w:line="288" w:lineRule="auto"/>
+        <w:spacing w:before="60" w:beforeAutospacing="1" w:after="20" w:afterAutospacing="1" w:line="276" w:lineRule="auto"/>
         <w:ind w:firstLine="720"/>
         <w:jc w:val="left"/>
         <w:rPr>
@@ -6086,7 +6232,7 @@
     </w:p>
     <w:p>
       <w:pPr>
-        <w:spacing w:before="0" w:after="40" w:line="288" w:lineRule="auto"/>
+        <w:spacing w:before="0" w:after="30" w:line="276" w:lineRule="auto"/>
         <w:ind w:firstLine="720"/>
         <w:jc w:val="both"/>
       </w:pPr>
@@ -6103,7 +6249,7 @@
     <w:p>
       <w:pPr>
         <w:keepNext/>
-        <w:spacing w:before="80" w:beforeAutospacing="1" w:after="40" w:afterAutospacing="1" w:line="288" w:lineRule="auto"/>
+        <w:spacing w:before="60" w:beforeAutospacing="1" w:after="20" w:afterAutospacing="1" w:line="276" w:lineRule="auto"/>
         <w:ind w:firstLine="720"/>
         <w:jc w:val="left"/>
         <w:rPr>
@@ -6124,7 +6270,7 @@
     </w:p>
     <w:p>
       <w:pPr>
-        <w:spacing w:before="0" w:after="40" w:line="288" w:lineRule="auto"/>
+        <w:spacing w:before="0" w:after="30" w:line="276" w:lineRule="auto"/>
         <w:ind w:firstLine="720"/>
         <w:jc w:val="both"/>
       </w:pPr>
@@ -6141,7 +6287,7 @@
     <w:p>
       <w:pPr>
         <w:keepNext/>
-        <w:spacing w:before="80" w:beforeAutospacing="1" w:after="40" w:afterAutospacing="1" w:line="288" w:lineRule="auto"/>
+        <w:spacing w:before="60" w:beforeAutospacing="1" w:after="20" w:afterAutospacing="1" w:line="276" w:lineRule="auto"/>
         <w:ind w:firstLine="720"/>
         <w:jc w:val="left"/>
         <w:rPr>
@@ -6162,7 +6308,7 @@
     </w:p>
     <w:p>
       <w:pPr>
-        <w:spacing w:before="0" w:after="40" w:line="288" w:lineRule="auto"/>
+        <w:spacing w:before="0" w:after="30" w:line="276" w:lineRule="auto"/>
         <w:ind w:firstLine="720"/>
         <w:jc w:val="both"/>
       </w:pPr>
@@ -6179,7 +6325,7 @@
     <w:p>
       <w:pPr>
         <w:keepNext/>
-        <w:spacing w:before="80" w:beforeAutospacing="1" w:after="40" w:afterAutospacing="1" w:line="288" w:lineRule="auto"/>
+        <w:spacing w:before="60" w:beforeAutospacing="1" w:after="20" w:afterAutospacing="1" w:line="276" w:lineRule="auto"/>
         <w:ind w:firstLine="720"/>
         <w:jc w:val="left"/>
         <w:rPr>
@@ -6202,7 +6348,7 @@
     </w:p>
     <w:p>
       <w:pPr>
-        <w:spacing w:before="0" w:after="40" w:line="288" w:lineRule="auto"/>
+        <w:spacing w:before="0" w:after="30" w:line="276" w:lineRule="auto"/>
         <w:ind w:firstLine="720"/>
         <w:jc w:val="both"/>
       </w:pPr>
@@ -6219,7 +6365,7 @@
     <w:p>
       <w:pPr>
         <w:keepNext/>
-        <w:spacing w:before="80" w:beforeAutospacing="1" w:after="40" w:afterAutospacing="1" w:line="288" w:lineRule="auto"/>
+        <w:spacing w:before="60" w:beforeAutospacing="1" w:after="20" w:afterAutospacing="1" w:line="276" w:lineRule="auto"/>
         <w:ind w:firstLine="720"/>
         <w:jc w:val="left"/>
         <w:rPr>
@@ -6242,7 +6388,7 @@
     </w:p>
     <w:p>
       <w:pPr>
-        <w:spacing w:before="0" w:after="40" w:line="288" w:lineRule="auto"/>
+        <w:spacing w:before="0" w:after="30" w:line="276" w:lineRule="auto"/>
         <w:ind w:firstLine="720"/>
         <w:jc w:val="both"/>
       </w:pPr>
@@ -6259,7 +6405,7 @@
     <w:p>
       <w:pPr>
         <w:keepNext/>
-        <w:spacing w:before="80" w:beforeAutospacing="1" w:after="40" w:afterAutospacing="1" w:line="288" w:lineRule="auto"/>
+        <w:spacing w:before="60" w:beforeAutospacing="1" w:after="20" w:afterAutospacing="1" w:line="276" w:lineRule="auto"/>
         <w:ind w:firstLine="720"/>
         <w:jc w:val="left"/>
         <w:rPr>
@@ -6282,7 +6428,7 @@
     </w:p>
     <w:p>
       <w:pPr>
-        <w:spacing w:before="0" w:after="40" w:line="288" w:lineRule="auto"/>
+        <w:spacing w:before="0" w:after="30" w:line="276" w:lineRule="auto"/>
         <w:ind w:firstLine="720"/>
         <w:jc w:val="both"/>
       </w:pPr>
@@ -6299,7 +6445,7 @@
     <w:p>
       <w:pPr>
         <w:keepNext/>
-        <w:spacing w:before="80" w:beforeAutospacing="1" w:after="40" w:afterAutospacing="1" w:line="288" w:lineRule="auto"/>
+        <w:spacing w:before="60" w:beforeAutospacing="1" w:after="20" w:afterAutospacing="1" w:line="276" w:lineRule="auto"/>
         <w:ind w:firstLine="720"/>
         <w:jc w:val="left"/>
         <w:rPr>
@@ -6322,7 +6468,7 @@
     </w:p>
     <w:p>
       <w:pPr>
-        <w:spacing w:before="0" w:after="40" w:line="288" w:lineRule="auto"/>
+        <w:spacing w:before="0" w:after="30" w:line="276" w:lineRule="auto"/>
         <w:ind w:firstLine="720"/>
         <w:jc w:val="both"/>
       </w:pPr>
@@ -6338,7 +6484,7 @@
     </w:p>
     <w:p>
       <w:pPr>
-        <w:spacing w:before="0" w:beforeAutospacing="1" w:after="40" w:afterAutospacing="1" w:line="288" w:lineRule="auto"/>
+        <w:spacing w:before="0" w:beforeAutospacing="1" w:after="30" w:afterAutospacing="1" w:line="276" w:lineRule="auto"/>
         <w:ind w:firstLine="720"/>
         <w:jc w:val="both"/>
         <w:rPr>
@@ -6401,7 +6547,7 @@
     <w:p>
       <w:pPr>
         <w:keepNext/>
-        <w:spacing w:before="120" w:beforeAutospacing="1" w:after="60" w:afterAutospacing="1" w:line="288" w:lineRule="auto"/>
+        <w:spacing w:before="80" w:beforeAutospacing="1" w:after="40" w:afterAutospacing="1" w:line="276" w:lineRule="auto"/>
         <w:ind w:firstLine="0"/>
         <w:jc w:val="left"/>
         <w:outlineLvl w:val="2"/>
@@ -6440,7 +6586,7 @@
     </w:p>
     <w:p>
       <w:pPr>
-        <w:spacing w:before="0" w:beforeAutospacing="1" w:after="40" w:afterAutospacing="1" w:line="288" w:lineRule="auto"/>
+        <w:spacing w:before="0" w:beforeAutospacing="1" w:after="30" w:afterAutospacing="1" w:line="276" w:lineRule="auto"/>
         <w:ind w:firstLine="720"/>
         <w:jc w:val="both"/>
         <w:rPr>
@@ -6463,7 +6609,7 @@
     </w:p>
     <w:p>
       <w:pPr>
-        <w:spacing w:before="0" w:beforeAutospacing="1" w:after="40" w:afterAutospacing="1" w:line="288" w:lineRule="auto"/>
+        <w:spacing w:before="0" w:beforeAutospacing="1" w:after="30" w:afterAutospacing="1" w:line="276" w:lineRule="auto"/>
         <w:ind w:firstLine="720"/>
         <w:jc w:val="both"/>
         <w:rPr>
@@ -6498,7 +6644,7 @@
     </w:p>
     <w:p>
       <w:pPr>
-        <w:spacing w:before="0" w:beforeAutospacing="1" w:after="40" w:afterAutospacing="1" w:line="288" w:lineRule="auto"/>
+        <w:spacing w:before="0" w:beforeAutospacing="1" w:after="30" w:afterAutospacing="1" w:line="276" w:lineRule="auto"/>
         <w:ind w:firstLine="720"/>
         <w:jc w:val="both"/>
         <w:rPr>
@@ -6522,7 +6668,7 @@
     <w:p>
       <w:pPr>
         <w:keepNext/>
-        <w:spacing w:before="120" w:beforeAutospacing="1" w:after="60" w:afterAutospacing="1" w:line="288" w:lineRule="auto"/>
+        <w:spacing w:before="80" w:beforeAutospacing="1" w:after="40" w:afterAutospacing="1" w:line="276" w:lineRule="auto"/>
         <w:ind w:firstLine="0"/>
         <w:jc w:val="left"/>
         <w:outlineLvl w:val="2"/>
@@ -6557,7 +6703,7 @@
     </w:p>
     <w:p>
       <w:pPr>
-        <w:spacing w:before="0" w:beforeAutospacing="1" w:after="40" w:afterAutospacing="1" w:line="288" w:lineRule="auto"/>
+        <w:spacing w:before="0" w:beforeAutospacing="1" w:after="30" w:afterAutospacing="1" w:line="276" w:lineRule="auto"/>
         <w:ind w:firstLine="720"/>
         <w:jc w:val="both"/>
         <w:rPr>
@@ -6735,7 +6881,7 @@
     <w:p>
       <w:pPr>
         <w:keepNext/>
-        <w:spacing w:before="120" w:beforeAutospacing="1" w:after="60" w:afterAutospacing="1" w:line="288" w:lineRule="auto"/>
+        <w:spacing w:before="80" w:beforeAutospacing="1" w:after="40" w:afterAutospacing="1" w:line="276" w:lineRule="auto"/>
         <w:ind w:firstLine="0"/>
         <w:jc w:val="left"/>
         <w:rPr>
@@ -8946,7 +9092,7 @@
       <w:pPr>
         <w:pStyle w:val="p1"/>
         <w:keepNext/>
-        <w:spacing w:before="120" w:beforeAutospacing="0" w:after="60" w:afterAutospacing="0" w:line="288" w:lineRule="auto"/>
+        <w:spacing w:before="80" w:beforeAutospacing="0" w:after="40" w:afterAutospacing="0" w:line="276" w:lineRule="auto"/>
         <w:ind w:firstLine="0"/>
         <w:jc w:val="left"/>
         <w:rPr>
@@ -8989,7 +9135,7 @@
     <w:p>
       <w:pPr>
         <w:keepNext/>
-        <w:spacing w:before="120" w:beforeAutospacing="1" w:after="60" w:afterAutospacing="1" w:line="288" w:lineRule="auto"/>
+        <w:spacing w:before="80" w:beforeAutospacing="1" w:after="40" w:afterAutospacing="1" w:line="276" w:lineRule="auto"/>
         <w:ind w:firstLine="0"/>
         <w:jc w:val="left"/>
         <w:outlineLvl w:val="2"/>
@@ -9051,7 +9197,7 @@
     </w:p>
     <w:p>
       <w:pPr>
-        <w:spacing w:before="0" w:beforeAutospacing="1" w:after="40" w:afterAutospacing="1" w:line="288" w:lineRule="auto"/>
+        <w:spacing w:before="0" w:beforeAutospacing="1" w:after="30" w:afterAutospacing="1" w:line="276" w:lineRule="auto"/>
         <w:ind w:firstLine="720"/>
         <w:jc w:val="both"/>
         <w:rPr>
@@ -9162,7 +9308,7 @@
     </w:p>
     <w:p>
       <w:pPr>
-        <w:spacing w:before="0" w:beforeAutospacing="1" w:after="40" w:afterAutospacing="1" w:line="288" w:lineRule="auto"/>
+        <w:spacing w:before="0" w:beforeAutospacing="1" w:after="30" w:afterAutospacing="1" w:line="276" w:lineRule="auto"/>
         <w:ind w:firstLine="720"/>
         <w:jc w:val="both"/>
         <w:rPr>
@@ -9237,7 +9383,7 @@
     <w:p>
       <w:pPr>
         <w:pStyle w:val="p1"/>
-        <w:spacing w:before="0" w:after="40" w:line="288" w:lineRule="auto"/>
+        <w:spacing w:before="0" w:after="30" w:line="276" w:lineRule="auto"/>
         <w:ind w:firstLine="720"/>
         <w:jc w:val="both"/>
         <w:rPr>
@@ -9298,7 +9444,7 @@
     </w:p>
     <w:p>
       <w:pPr>
-        <w:spacing w:before="0" w:beforeAutospacing="1" w:after="40" w:afterAutospacing="1" w:line="288" w:lineRule="auto"/>
+        <w:spacing w:before="0" w:beforeAutospacing="1" w:after="30" w:afterAutospacing="1" w:line="276" w:lineRule="auto"/>
         <w:ind w:firstLine="720"/>
         <w:jc w:val="both"/>
         <w:rPr>
@@ -9349,7 +9495,7 @@
     <w:p>
       <w:pPr>
         <w:keepNext/>
-        <w:spacing w:before="120" w:after="60" w:line="288" w:lineRule="auto"/>
+        <w:spacing w:before="80" w:after="40" w:line="276" w:lineRule="auto"/>
         <w:ind w:firstLine="0"/>
         <w:jc w:val="left"/>
         <w:rPr>
@@ -9439,7 +9585,7 @@
     </w:p>
     <w:p>
       <w:pPr>
-        <w:spacing w:before="0" w:beforeAutospacing="1" w:after="40" w:afterAutospacing="1" w:line="288" w:lineRule="auto"/>
+        <w:spacing w:before="0" w:beforeAutospacing="1" w:after="30" w:afterAutospacing="1" w:line="276" w:lineRule="auto"/>
         <w:ind w:firstLine="720"/>
         <w:jc w:val="both"/>
         <w:rPr>
@@ -9462,7 +9608,7 @@
     </w:p>
     <w:p>
       <w:pPr>
-        <w:spacing w:before="0" w:beforeAutospacing="1" w:after="40" w:afterAutospacing="1" w:line="288" w:lineRule="auto"/>
+        <w:spacing w:before="0" w:beforeAutospacing="1" w:after="30" w:afterAutospacing="1" w:line="276" w:lineRule="auto"/>
         <w:ind w:firstLine="720"/>
         <w:jc w:val="both"/>
         <w:rPr>
@@ -9536,7 +9682,7 @@
     <w:p>
       <w:pPr>
         <w:pStyle w:val="p1"/>
-        <w:spacing w:before="0" w:after="40" w:line="288" w:lineRule="auto"/>
+        <w:spacing w:before="0" w:after="30" w:line="276" w:lineRule="auto"/>
         <w:ind w:firstLine="720"/>
         <w:jc w:val="both"/>
         <w:rPr>
@@ -9682,7 +9828,7 @@
     </w:p>
     <w:p>
       <w:pPr>
-        <w:spacing w:before="0" w:beforeAutospacing="1" w:after="40" w:afterAutospacing="1" w:line="288" w:lineRule="auto"/>
+        <w:spacing w:before="0" w:beforeAutospacing="1" w:after="30" w:afterAutospacing="1" w:line="276" w:lineRule="auto"/>
         <w:ind w:firstLine="720"/>
         <w:jc w:val="both"/>
         <w:rPr>
@@ -9705,7 +9851,7 @@
     </w:p>
     <w:p>
       <w:pPr>
-        <w:spacing w:before="0" w:beforeAutospacing="1" w:after="40" w:afterAutospacing="1" w:line="288" w:lineRule="auto"/>
+        <w:spacing w:before="0" w:beforeAutospacing="1" w:after="30" w:afterAutospacing="1" w:line="276" w:lineRule="auto"/>
         <w:ind w:firstLine="720"/>
         <w:jc w:val="both"/>
         <w:rPr>
@@ -9728,7 +9874,7 @@
     </w:p>
     <w:p>
       <w:pPr>
-        <w:spacing w:before="0" w:beforeAutospacing="1" w:after="40" w:afterAutospacing="1" w:line="288" w:lineRule="auto"/>
+        <w:spacing w:before="0" w:beforeAutospacing="1" w:after="30" w:afterAutospacing="1" w:line="276" w:lineRule="auto"/>
         <w:ind w:firstLine="720"/>
         <w:jc w:val="both"/>
         <w:rPr>
@@ -9751,7 +9897,7 @@
     </w:p>
     <w:p>
       <w:pPr>
-        <w:spacing w:before="0" w:beforeAutospacing="1" w:after="40" w:afterAutospacing="1" w:line="288" w:lineRule="auto"/>
+        <w:spacing w:before="0" w:beforeAutospacing="1" w:after="30" w:afterAutospacing="1" w:line="276" w:lineRule="auto"/>
         <w:ind w:firstLine="720"/>
         <w:jc w:val="both"/>
         <w:rPr>
@@ -9774,7 +9920,7 @@
     </w:p>
     <w:p>
       <w:pPr>
-        <w:spacing w:before="0" w:beforeAutospacing="1" w:after="40" w:afterAutospacing="1" w:line="288" w:lineRule="auto"/>
+        <w:spacing w:before="0" w:beforeAutospacing="1" w:after="30" w:afterAutospacing="1" w:line="276" w:lineRule="auto"/>
         <w:ind w:firstLine="720"/>
         <w:jc w:val="both"/>
         <w:rPr>
@@ -9797,7 +9943,7 @@
     </w:p>
     <w:p>
       <w:pPr>
-        <w:spacing w:before="0" w:beforeAutospacing="1" w:after="40" w:afterAutospacing="1" w:line="288" w:lineRule="auto"/>
+        <w:spacing w:before="0" w:beforeAutospacing="1" w:after="30" w:afterAutospacing="1" w:line="276" w:lineRule="auto"/>
         <w:ind w:firstLine="720"/>
         <w:jc w:val="both"/>
         <w:rPr>
@@ -9849,7 +9995,7 @@
     </w:p>
     <w:p>
       <w:pPr>
-        <w:spacing w:before="0" w:beforeAutospacing="1" w:after="40" w:afterAutospacing="1" w:line="288" w:lineRule="auto"/>
+        <w:spacing w:before="0" w:beforeAutospacing="1" w:after="30" w:afterAutospacing="1" w:line="276" w:lineRule="auto"/>
         <w:ind w:firstLine="720"/>
         <w:jc w:val="both"/>
         <w:rPr>
@@ -9906,7 +10052,7 @@
     </w:p>
     <w:p>
       <w:pPr>
-        <w:spacing w:before="0" w:beforeAutospacing="1" w:after="40" w:afterAutospacing="1" w:line="288" w:lineRule="auto"/>
+        <w:spacing w:before="0" w:beforeAutospacing="1" w:after="30" w:afterAutospacing="1" w:line="276" w:lineRule="auto"/>
         <w:ind w:firstLine="720"/>
         <w:jc w:val="both"/>
         <w:rPr>
@@ -9939,7 +10085,7 @@
     </w:p>
     <w:p>
       <w:pPr>
-        <w:spacing w:before="0" w:beforeAutospacing="1" w:after="40" w:afterAutospacing="1" w:line="288" w:lineRule="auto"/>
+        <w:spacing w:before="0" w:beforeAutospacing="1" w:after="30" w:afterAutospacing="1" w:line="276" w:lineRule="auto"/>
         <w:ind w:firstLine="720"/>
         <w:jc w:val="both"/>
         <w:rPr>
@@ -9972,7 +10118,7 @@
     </w:p>
     <w:p>
       <w:pPr>
-        <w:spacing w:before="0" w:beforeAutospacing="1" w:after="40" w:afterAutospacing="1" w:line="288" w:lineRule="auto"/>
+        <w:spacing w:before="0" w:beforeAutospacing="1" w:after="30" w:afterAutospacing="1" w:line="276" w:lineRule="auto"/>
         <w:ind w:firstLine="720"/>
         <w:jc w:val="both"/>
         <w:rPr>
@@ -9996,7 +10142,7 @@
     <w:p>
       <w:pPr>
         <w:keepNext/>
-        <w:spacing w:before="120" w:after="60" w:line="288" w:lineRule="auto"/>
+        <w:spacing w:before="80" w:after="40" w:line="276" w:lineRule="auto"/>
         <w:ind w:firstLine="0"/>
         <w:jc w:val="left"/>
         <w:rPr>
@@ -10048,7 +10194,7 @@
     <w:p>
       <w:pPr>
         <w:keepNext/>
-        <w:spacing w:before="120" w:beforeAutospacing="1" w:after="60" w:afterAutospacing="1" w:line="288" w:lineRule="auto"/>
+        <w:spacing w:before="80" w:beforeAutospacing="1" w:after="40" w:afterAutospacing="1" w:line="276" w:lineRule="auto"/>
         <w:ind w:firstLine="0"/>
         <w:jc w:val="left"/>
         <w:outlineLvl w:val="2"/>
@@ -10075,7 +10221,7 @@
     </w:p>
     <w:p>
       <w:pPr>
-        <w:spacing w:before="0" w:beforeAutospacing="1" w:after="40" w:afterAutospacing="1" w:line="288" w:lineRule="auto"/>
+        <w:spacing w:before="0" w:beforeAutospacing="1" w:after="30" w:afterAutospacing="1" w:line="276" w:lineRule="auto"/>
         <w:ind w:firstLine="720"/>
         <w:jc w:val="both"/>
         <w:rPr>
@@ -10149,7 +10295,7 @@
     </w:p>
     <w:p>
       <w:pPr>
-        <w:spacing w:before="0" w:beforeAutospacing="1" w:after="40" w:afterAutospacing="1" w:line="288" w:lineRule="auto"/>
+        <w:spacing w:before="0" w:beforeAutospacing="1" w:after="30" w:afterAutospacing="1" w:line="276" w:lineRule="auto"/>
         <w:ind w:firstLine="720"/>
         <w:jc w:val="both"/>
         <w:rPr>
@@ -10211,7 +10357,7 @@
     </w:p>
     <w:p>
       <w:pPr>
-        <w:spacing w:before="0" w:beforeAutospacing="1" w:after="40" w:afterAutospacing="1" w:line="288" w:lineRule="auto"/>
+        <w:spacing w:before="0" w:beforeAutospacing="1" w:after="30" w:afterAutospacing="1" w:line="276" w:lineRule="auto"/>
         <w:ind w:firstLine="720"/>
         <w:jc w:val="both"/>
         <w:rPr>
@@ -10238,7 +10384,7 @@
     <w:p>
       <w:pPr>
         <w:keepNext/>
-        <w:spacing w:before="120" w:beforeAutospacing="1" w:after="60" w:afterAutospacing="1" w:line="288" w:lineRule="auto"/>
+        <w:spacing w:before="80" w:beforeAutospacing="1" w:after="40" w:afterAutospacing="1" w:line="276" w:lineRule="auto"/>
         <w:ind w:firstLine="0"/>
         <w:jc w:val="left"/>
         <w:outlineLvl w:val="2"/>
@@ -10265,7 +10411,7 @@
     </w:p>
     <w:p>
       <w:pPr>
-        <w:spacing w:before="0" w:beforeAutospacing="1" w:after="40" w:afterAutospacing="1" w:line="288" w:lineRule="auto"/>
+        <w:spacing w:before="0" w:beforeAutospacing="1" w:after="30" w:afterAutospacing="1" w:line="276" w:lineRule="auto"/>
         <w:ind w:firstLine="720"/>
         <w:jc w:val="both"/>
         <w:rPr>
@@ -10304,7 +10450,7 @@
     </w:p>
     <w:p>
       <w:pPr>
-        <w:spacing w:before="0" w:beforeAutospacing="1" w:after="40" w:afterAutospacing="1" w:line="288" w:lineRule="auto"/>
+        <w:spacing w:before="0" w:beforeAutospacing="1" w:after="30" w:afterAutospacing="1" w:line="276" w:lineRule="auto"/>
         <w:ind w:firstLine="720"/>
         <w:jc w:val="both"/>
         <w:rPr>
@@ -10330,7 +10476,7 @@
     </w:p>
     <w:p>
       <w:pPr>
-        <w:spacing w:before="0" w:beforeAutospacing="1" w:after="40" w:afterAutospacing="1" w:line="288" w:lineRule="auto"/>
+        <w:spacing w:before="0" w:beforeAutospacing="1" w:after="30" w:afterAutospacing="1" w:line="276" w:lineRule="auto"/>
         <w:ind w:firstLine="720"/>
         <w:jc w:val="both"/>
         <w:rPr>
@@ -10375,7 +10521,7 @@
     </w:p>
     <w:p>
       <w:pPr>
-        <w:spacing w:before="0" w:beforeAutospacing="1" w:after="40" w:afterAutospacing="1" w:line="288" w:lineRule="auto"/>
+        <w:spacing w:before="0" w:beforeAutospacing="1" w:after="30" w:afterAutospacing="1" w:line="276" w:lineRule="auto"/>
         <w:ind w:firstLine="720"/>
         <w:jc w:val="both"/>
         <w:rPr>
@@ -10399,7 +10545,7 @@
     <w:p>
       <w:pPr>
         <w:keepNext/>
-        <w:spacing w:before="120" w:after="60" w:line="288" w:lineRule="auto"/>
+        <w:spacing w:before="80" w:after="40" w:line="276" w:lineRule="auto"/>
         <w:ind w:firstLine="0"/>
         <w:jc w:val="left"/>
         <w:rPr>
@@ -10434,7 +10580,7 @@
     </w:p>
     <w:p>
       <w:pPr>
-        <w:spacing w:before="0" w:beforeAutospacing="1" w:after="40" w:afterAutospacing="1" w:line="288" w:lineRule="auto"/>
+        <w:spacing w:before="0" w:beforeAutospacing="1" w:after="30" w:afterAutospacing="1" w:line="276" w:lineRule="auto"/>
         <w:ind w:firstLine="720"/>
         <w:jc w:val="both"/>
         <w:rPr>
@@ -10501,7 +10647,7 @@
     </w:p>
     <w:p>
       <w:pPr>
-        <w:spacing w:before="0" w:beforeAutospacing="1" w:after="40" w:afterAutospacing="1" w:line="288" w:lineRule="auto"/>
+        <w:spacing w:before="0" w:beforeAutospacing="1" w:after="30" w:afterAutospacing="1" w:line="276" w:lineRule="auto"/>
         <w:ind w:firstLine="720"/>
         <w:jc w:val="both"/>
         <w:rPr>
@@ -10524,7 +10670,7 @@
     </w:p>
     <w:p>
       <w:pPr>
-        <w:spacing w:before="0" w:beforeAutospacing="1" w:after="40" w:afterAutospacing="1" w:line="288" w:lineRule="auto"/>
+        <w:spacing w:before="0" w:beforeAutospacing="1" w:after="30" w:afterAutospacing="1" w:line="276" w:lineRule="auto"/>
         <w:ind w:firstLine="720"/>
         <w:jc w:val="both"/>
         <w:rPr>
@@ -10568,7 +10714,7 @@
     </w:p>
     <w:p>
       <w:pPr>
-        <w:spacing w:before="0" w:beforeAutospacing="1" w:after="40" w:afterAutospacing="1" w:line="288" w:lineRule="auto"/>
+        <w:spacing w:before="0" w:beforeAutospacing="1" w:after="30" w:afterAutospacing="1" w:line="276" w:lineRule="auto"/>
         <w:ind w:firstLine="720"/>
         <w:jc w:val="both"/>
         <w:rPr>
@@ -10592,7 +10738,7 @@
     <w:p>
       <w:pPr>
         <w:widowControl w:val="0"/>
-        <w:spacing w:after="80" w:before="240" w:line="288" w:lineRule="auto"/>
+        <w:spacing w:after="80" w:before="240" w:line="276" w:lineRule="auto"/>
         <w:ind w:left="4320" w:firstLine="0"/>
         <w:jc w:val="right"/>
         <w:rPr>

</xml_diff>